<commit_message>
Am incarcat proiectul sd tema3
</commit_message>
<xml_diff>
--- a/Assignment3.docx
+++ b/Assignment3.docx
@@ -141,7 +141,6 @@
           <w:szCs w:val="44"/>
         </w:rPr>
       </w:pPr>
-      <w:proofErr w:type="spellStart"/>
       <w:r>
         <w:rPr>
           <w:rFonts w:ascii="Times New Roman" w:hAnsi="Times New Roman"/>
@@ -150,9 +149,8 @@
           <w:sz w:val="44"/>
           <w:szCs w:val="44"/>
         </w:rPr>
-        <w:t>Assignment</w:t>
-      </w:r>
-      <w:proofErr w:type="spellEnd"/>
+        <w:t xml:space="preserve">Assignment </w:t>
+      </w:r>
       <w:r>
         <w:rPr>
           <w:rFonts w:ascii="Times New Roman" w:hAnsi="Times New Roman"/>
@@ -161,9 +159,12 @@
           <w:sz w:val="44"/>
           <w:szCs w:val="44"/>
         </w:rPr>
-        <w:t xml:space="preserve"> </w:t>
-      </w:r>
-      <w:r>
+        <w:t>3</w:t>
+      </w:r>
+    </w:p>
+    <w:p>
+      <w:pPr>
+        <w:jc w:val="center"/>
         <w:rPr>
           <w:rFonts w:ascii="Times New Roman" w:hAnsi="Times New Roman"/>
           <w:b/>
@@ -171,19 +172,6 @@
           <w:sz w:val="44"/>
           <w:szCs w:val="44"/>
         </w:rPr>
-        <w:t>3</w:t>
-      </w:r>
-    </w:p>
-    <w:p>
-      <w:pPr>
-        <w:jc w:val="center"/>
-        <w:rPr>
-          <w:rFonts w:ascii="Times New Roman" w:hAnsi="Times New Roman"/>
-          <w:b/>
-          <w:bCs/>
-          <w:sz w:val="44"/>
-          <w:szCs w:val="44"/>
-        </w:rPr>
       </w:pPr>
     </w:p>
     <w:p>
@@ -205,10 +193,12 @@
           <w:sz w:val="36"/>
           <w:szCs w:val="36"/>
         </w:rPr>
-        <w:t xml:space="preserve">Web </w:t>
-      </w:r>
-      <w:proofErr w:type="spellStart"/>
-      <w:r>
+        <w:t>Web Sockets and Security</w:t>
+      </w:r>
+    </w:p>
+    <w:p>
+      <w:pPr>
+        <w:jc w:val="center"/>
         <w:rPr>
           <w:rFonts w:ascii="Times New Roman" w:hAnsi="Times New Roman"/>
           <w:b/>
@@ -216,10 +206,11 @@
           <w:sz w:val="36"/>
           <w:szCs w:val="36"/>
         </w:rPr>
-        <w:t>Sockets</w:t>
-      </w:r>
-      <w:proofErr w:type="spellEnd"/>
-      <w:r>
+      </w:pPr>
+    </w:p>
+    <w:p>
+      <w:pPr>
+        <w:jc w:val="center"/>
         <w:rPr>
           <w:rFonts w:ascii="Times New Roman" w:hAnsi="Times New Roman"/>
           <w:b/>
@@ -227,10 +218,11 @@
           <w:sz w:val="36"/>
           <w:szCs w:val="36"/>
         </w:rPr>
-        <w:t xml:space="preserve"> </w:t>
-      </w:r>
-      <w:proofErr w:type="spellStart"/>
-      <w:r>
+      </w:pPr>
+    </w:p>
+    <w:p>
+      <w:pPr>
+        <w:jc w:val="center"/>
         <w:rPr>
           <w:rFonts w:ascii="Times New Roman" w:hAnsi="Times New Roman"/>
           <w:b/>
@@ -238,10 +230,11 @@
           <w:sz w:val="36"/>
           <w:szCs w:val="36"/>
         </w:rPr>
-        <w:t>and</w:t>
-      </w:r>
-      <w:proofErr w:type="spellEnd"/>
-      <w:r>
+      </w:pPr>
+    </w:p>
+    <w:p>
+      <w:pPr>
+        <w:jc w:val="center"/>
         <w:rPr>
           <w:rFonts w:ascii="Times New Roman" w:hAnsi="Times New Roman"/>
           <w:b/>
@@ -249,10 +242,10 @@
           <w:sz w:val="36"/>
           <w:szCs w:val="36"/>
         </w:rPr>
-        <w:t xml:space="preserve"> </w:t>
-      </w:r>
-      <w:proofErr w:type="spellStart"/>
-      <w:r>
+      </w:pPr>
+    </w:p>
+    <w:p>
+      <w:pPr>
         <w:rPr>
           <w:rFonts w:ascii="Times New Roman" w:hAnsi="Times New Roman"/>
           <w:b/>
@@ -260,67 +253,6 @@
           <w:sz w:val="36"/>
           <w:szCs w:val="36"/>
         </w:rPr>
-        <w:t>Security</w:t>
-      </w:r>
-      <w:proofErr w:type="spellEnd"/>
-    </w:p>
-    <w:p>
-      <w:pPr>
-        <w:jc w:val="center"/>
-        <w:rPr>
-          <w:rFonts w:ascii="Times New Roman" w:hAnsi="Times New Roman"/>
-          <w:b/>
-          <w:bCs/>
-          <w:sz w:val="36"/>
-          <w:szCs w:val="36"/>
-        </w:rPr>
-      </w:pPr>
-    </w:p>
-    <w:p>
-      <w:pPr>
-        <w:jc w:val="center"/>
-        <w:rPr>
-          <w:rFonts w:ascii="Times New Roman" w:hAnsi="Times New Roman"/>
-          <w:b/>
-          <w:bCs/>
-          <w:sz w:val="36"/>
-          <w:szCs w:val="36"/>
-        </w:rPr>
-      </w:pPr>
-    </w:p>
-    <w:p>
-      <w:pPr>
-        <w:jc w:val="center"/>
-        <w:rPr>
-          <w:rFonts w:ascii="Times New Roman" w:hAnsi="Times New Roman"/>
-          <w:b/>
-          <w:bCs/>
-          <w:sz w:val="36"/>
-          <w:szCs w:val="36"/>
-        </w:rPr>
-      </w:pPr>
-    </w:p>
-    <w:p>
-      <w:pPr>
-        <w:jc w:val="center"/>
-        <w:rPr>
-          <w:rFonts w:ascii="Times New Roman" w:hAnsi="Times New Roman"/>
-          <w:b/>
-          <w:bCs/>
-          <w:sz w:val="36"/>
-          <w:szCs w:val="36"/>
-        </w:rPr>
-      </w:pPr>
-    </w:p>
-    <w:p>
-      <w:pPr>
-        <w:rPr>
-          <w:rFonts w:ascii="Times New Roman" w:hAnsi="Times New Roman"/>
-          <w:b/>
-          <w:bCs/>
-          <w:sz w:val="36"/>
-          <w:szCs w:val="36"/>
-        </w:rPr>
       </w:pPr>
     </w:p>
     <w:p>
@@ -366,7 +298,7 @@
           <w:sz w:val="28"/>
           <w:szCs w:val="28"/>
         </w:rPr>
-        <w:t xml:space="preserve">Grupa 30241, Anul IV </w:t>
+        <w:t>Grupa 30</w:t>
       </w:r>
       <w:r>
         <w:rPr>
@@ -374,7 +306,7 @@
           <w:sz w:val="28"/>
           <w:szCs w:val="28"/>
         </w:rPr>
-        <w:t xml:space="preserve">      TI</w:t>
+        <w:t>642</w:t>
       </w:r>
       <w:r>
         <w:rPr>
@@ -382,6 +314,33 @@
           <w:sz w:val="28"/>
           <w:szCs w:val="28"/>
         </w:rPr>
+        <w:t xml:space="preserve">, Anul IV </w:t>
+      </w:r>
+    </w:p>
+    <w:p>
+      <w:pPr>
+        <w:spacing w:after="0" w:line="240" w:lineRule="auto"/>
+        <w:ind w:left="5760"/>
+        <w:rPr>
+          <w:rFonts w:ascii="Times New Roman" w:hAnsi="Times New Roman"/>
+          <w:sz w:val="28"/>
+          <w:szCs w:val="28"/>
+        </w:rPr>
+      </w:pPr>
+      <w:r>
+        <w:rPr>
+          <w:rFonts w:ascii="Times New Roman" w:hAnsi="Times New Roman"/>
+          <w:sz w:val="28"/>
+          <w:szCs w:val="28"/>
+        </w:rPr>
+        <w:t>TI</w:t>
+      </w:r>
+      <w:r>
+        <w:rPr>
+          <w:rFonts w:ascii="Times New Roman" w:hAnsi="Times New Roman"/>
+          <w:sz w:val="28"/>
+          <w:szCs w:val="28"/>
+        </w:rPr>
         <w:t xml:space="preserve"> Română</w:t>
       </w:r>
     </w:p>
@@ -395,23 +354,21 @@
           <w:szCs w:val="28"/>
         </w:rPr>
       </w:pPr>
-      <w:proofErr w:type="spellStart"/>
       <w:r>
         <w:rPr>
           <w:rFonts w:ascii="Times New Roman" w:hAnsi="Times New Roman"/>
           <w:sz w:val="28"/>
           <w:szCs w:val="28"/>
         </w:rPr>
-        <w:t>Indrumator</w:t>
-      </w:r>
-      <w:proofErr w:type="spellEnd"/>
+        <w:t xml:space="preserve">    </w:t>
+      </w:r>
       <w:r>
         <w:rPr>
           <w:rFonts w:ascii="Times New Roman" w:hAnsi="Times New Roman"/>
           <w:sz w:val="28"/>
           <w:szCs w:val="28"/>
         </w:rPr>
-        <w:t xml:space="preserve">: As. </w:t>
+        <w:t xml:space="preserve">Indrumator: As. </w:t>
       </w:r>
       <w:r>
         <w:rPr>
@@ -497,7 +454,6 @@
           <w:szCs w:val="28"/>
         </w:rPr>
       </w:pPr>
-      <w:proofErr w:type="spellStart"/>
       <w:r>
         <w:rPr>
           <w:rFonts w:ascii="Times New Roman" w:hAnsi="Times New Roman"/>
@@ -509,7 +465,6 @@
         <w:lastRenderedPageBreak/>
         <w:t>Continut</w:t>
       </w:r>
-      <w:proofErr w:type="spellEnd"/>
       <w:r>
         <w:rPr>
           <w:rFonts w:ascii="Times New Roman" w:hAnsi="Times New Roman"/>
@@ -586,34 +541,14 @@
           <w:szCs w:val="28"/>
         </w:rPr>
       </w:pPr>
-      <w:proofErr w:type="spellStart"/>
       <w:r>
         <w:rPr>
           <w:rFonts w:ascii="Times New Roman" w:hAnsi="Times New Roman"/>
           <w:sz w:val="28"/>
           <w:szCs w:val="28"/>
         </w:rPr>
-        <w:t>Cerinte</w:t>
-      </w:r>
-      <w:proofErr w:type="spellEnd"/>
-      <w:r>
-        <w:rPr>
-          <w:rFonts w:ascii="Times New Roman" w:hAnsi="Times New Roman"/>
-          <w:sz w:val="28"/>
-          <w:szCs w:val="28"/>
-        </w:rPr>
-        <w:t xml:space="preserve"> </w:t>
-      </w:r>
-      <w:proofErr w:type="spellStart"/>
-      <w:r>
-        <w:rPr>
-          <w:rFonts w:ascii="Times New Roman" w:hAnsi="Times New Roman"/>
-          <w:sz w:val="28"/>
-          <w:szCs w:val="28"/>
-        </w:rPr>
-        <w:t>Functionale</w:t>
-      </w:r>
-      <w:proofErr w:type="spellEnd"/>
+        <w:t>Cerinte Functionale</w:t>
+      </w:r>
     </w:p>
     <w:p>
       <w:pPr>
@@ -687,119 +622,39 @@
         <w:spacing w:before="100" w:beforeAutospacing="1" w:after="100" w:afterAutospacing="1" w:line="240" w:lineRule="auto"/>
         <w:rPr>
           <w:rFonts w:ascii="Times New Roman" w:eastAsia="Times New Roman" w:hAnsi="Times New Roman"/>
-          <w:sz w:val="24"/>
-          <w:szCs w:val="24"/>
-          <w:lang w:eastAsia="ro-RO"/>
-        </w:rPr>
-      </w:pPr>
-      <w:r>
-        <w:rPr>
-          <w:rFonts w:ascii="Times New Roman" w:eastAsia="Times New Roman" w:hAnsi="Times New Roman"/>
-          <w:sz w:val="24"/>
-          <w:szCs w:val="24"/>
-          <w:lang w:eastAsia="ro-RO"/>
-        </w:rPr>
-        <w:t xml:space="preserve">Bine ai venit în explorarea unui </w:t>
-      </w:r>
-      <w:proofErr w:type="spellStart"/>
-      <w:r>
-        <w:rPr>
-          <w:rFonts w:ascii="Times New Roman" w:eastAsia="Times New Roman" w:hAnsi="Times New Roman"/>
-          <w:sz w:val="24"/>
-          <w:szCs w:val="24"/>
-          <w:lang w:eastAsia="ro-RO"/>
-        </w:rPr>
-        <w:t>Microserviciu</w:t>
-      </w:r>
-      <w:proofErr w:type="spellEnd"/>
-      <w:r>
-        <w:rPr>
-          <w:rFonts w:ascii="Times New Roman" w:eastAsia="Times New Roman" w:hAnsi="Times New Roman"/>
-          <w:sz w:val="24"/>
-          <w:szCs w:val="24"/>
-          <w:lang w:eastAsia="ro-RO"/>
-        </w:rPr>
-        <w:t xml:space="preserve"> de Monitorizare și Comunicare, conceput special pentru Sistemul de Management al Energiei.</w:t>
-      </w:r>
-      <w:r>
-        <w:rPr>
-          <w:rFonts w:ascii="Times New Roman" w:eastAsia="Times New Roman" w:hAnsi="Times New Roman"/>
-          <w:sz w:val="24"/>
-          <w:szCs w:val="24"/>
+          <w:sz w:val="20"/>
+          <w:szCs w:val="20"/>
+          <w:lang w:eastAsia="ro-RO"/>
+        </w:rPr>
+      </w:pPr>
+      <w:r>
+        <w:rPr>
+          <w:rFonts w:ascii="Times New Roman" w:eastAsia="Times New Roman" w:hAnsi="Times New Roman"/>
+          <w:sz w:val="20"/>
+          <w:szCs w:val="20"/>
+          <w:lang w:eastAsia="ro-RO"/>
+        </w:rPr>
+        <w:t>Bine ai venit în explorarea unui Microserviciu de Monitorizare și Comunicare, conceput special pentru Sistemul de Management al Energiei.</w:t>
+      </w:r>
+      <w:r>
+        <w:rPr>
+          <w:rFonts w:ascii="Times New Roman" w:eastAsia="Times New Roman" w:hAnsi="Times New Roman"/>
+          <w:sz w:val="20"/>
+          <w:szCs w:val="20"/>
           <w:lang w:eastAsia="ro-RO"/>
         </w:rPr>
         <w:br/>
-        <w:t xml:space="preserve">Acest </w:t>
-      </w:r>
-      <w:proofErr w:type="spellStart"/>
-      <w:r>
-        <w:rPr>
-          <w:rFonts w:ascii="Times New Roman" w:eastAsia="Times New Roman" w:hAnsi="Times New Roman"/>
-          <w:sz w:val="24"/>
-          <w:szCs w:val="24"/>
-          <w:lang w:eastAsia="ro-RO"/>
-        </w:rPr>
-        <w:t>microserviciu</w:t>
-      </w:r>
-      <w:proofErr w:type="spellEnd"/>
-      <w:r>
-        <w:rPr>
-          <w:rFonts w:ascii="Times New Roman" w:eastAsia="Times New Roman" w:hAnsi="Times New Roman"/>
-          <w:sz w:val="24"/>
-          <w:szCs w:val="24"/>
-          <w:lang w:eastAsia="ro-RO"/>
-        </w:rPr>
-        <w:t xml:space="preserve"> funcționează pe o fundație solidă, bazată pe un </w:t>
-      </w:r>
-      <w:proofErr w:type="spellStart"/>
-      <w:r>
-        <w:rPr>
-          <w:rFonts w:ascii="Times New Roman" w:eastAsia="Times New Roman" w:hAnsi="Times New Roman"/>
-          <w:sz w:val="24"/>
-          <w:szCs w:val="24"/>
-          <w:lang w:eastAsia="ro-RO"/>
-        </w:rPr>
-        <w:t>middleware</w:t>
-      </w:r>
-      <w:proofErr w:type="spellEnd"/>
-      <w:r>
-        <w:rPr>
-          <w:rFonts w:ascii="Times New Roman" w:eastAsia="Times New Roman" w:hAnsi="Times New Roman"/>
-          <w:sz w:val="24"/>
-          <w:szCs w:val="24"/>
-          <w:lang w:eastAsia="ro-RO"/>
-        </w:rPr>
-        <w:t xml:space="preserve"> de tip broker de mesaje, orchestrând colectarea datelor de la dispozitivele de măsurare inteligentă.</w:t>
-      </w:r>
-      <w:r>
-        <w:rPr>
-          <w:rFonts w:ascii="Times New Roman" w:eastAsia="Times New Roman" w:hAnsi="Times New Roman"/>
-          <w:sz w:val="24"/>
-          <w:szCs w:val="24"/>
+        <w:t>Acest microserviciu funcționează pe o fundație solidă, bazată pe un middleware de tip broker de mesaje, orchestrând colectarea datelor de la dispozitivele de măsurare inteligentă.</w:t>
+      </w:r>
+      <w:r>
+        <w:rPr>
+          <w:rFonts w:ascii="Times New Roman" w:eastAsia="Times New Roman" w:hAnsi="Times New Roman"/>
+          <w:sz w:val="20"/>
+          <w:szCs w:val="20"/>
           <w:lang w:eastAsia="ro-RO"/>
         </w:rPr>
         <w:br/>
-        <w:t xml:space="preserve">Datele colectate sunt apoi procesate cu atenție pentru a calcula consumul de energie pe oră, urmând să fie stocate în baza de date a </w:t>
-      </w:r>
-      <w:proofErr w:type="spellStart"/>
-      <w:r>
-        <w:rPr>
-          <w:rFonts w:ascii="Times New Roman" w:eastAsia="Times New Roman" w:hAnsi="Times New Roman"/>
-          <w:sz w:val="24"/>
-          <w:szCs w:val="24"/>
-          <w:lang w:eastAsia="ro-RO"/>
-        </w:rPr>
-        <w:t>Microserviciului</w:t>
-      </w:r>
-      <w:proofErr w:type="spellEnd"/>
-      <w:r>
-        <w:rPr>
-          <w:rFonts w:ascii="Times New Roman" w:eastAsia="Times New Roman" w:hAnsi="Times New Roman"/>
-          <w:sz w:val="24"/>
-          <w:szCs w:val="24"/>
-          <w:lang w:eastAsia="ro-RO"/>
-        </w:rPr>
-        <w:t xml:space="preserve"> de Monitorizare și Comunicare.</w:t>
+        <w:t>Datele colectate sunt apoi procesate cu atenție pentru a calcula consumul de energie pe oră, urmând să fie stocate în baza de date a Microserviciului de Monitorizare și Comunicare.</w:t>
       </w:r>
     </w:p>
     <w:p>
@@ -809,109 +664,29 @@
         <w:spacing w:before="100" w:beforeAutospacing="1" w:after="100" w:afterAutospacing="1" w:line="240" w:lineRule="auto"/>
         <w:rPr>
           <w:rFonts w:ascii="Times New Roman" w:eastAsia="Times New Roman" w:hAnsi="Times New Roman"/>
-          <w:sz w:val="24"/>
-          <w:szCs w:val="24"/>
-          <w:lang w:eastAsia="ro-RO"/>
-        </w:rPr>
-      </w:pPr>
-      <w:r>
-        <w:rPr>
-          <w:rFonts w:ascii="Times New Roman" w:eastAsia="Times New Roman" w:hAnsi="Times New Roman"/>
-          <w:sz w:val="24"/>
-          <w:szCs w:val="24"/>
-          <w:lang w:eastAsia="ro-RO"/>
-        </w:rPr>
-        <w:t xml:space="preserve">Pentru a facilita sincronizarea fără întreruperi între bazele de date ale </w:t>
-      </w:r>
-      <w:proofErr w:type="spellStart"/>
-      <w:r>
-        <w:rPr>
-          <w:rFonts w:ascii="Times New Roman" w:eastAsia="Times New Roman" w:hAnsi="Times New Roman"/>
-          <w:sz w:val="24"/>
-          <w:szCs w:val="24"/>
-          <w:lang w:eastAsia="ro-RO"/>
-        </w:rPr>
-        <w:t>Microserviciului</w:t>
-      </w:r>
-      <w:proofErr w:type="spellEnd"/>
-      <w:r>
-        <w:rPr>
-          <w:rFonts w:ascii="Times New Roman" w:eastAsia="Times New Roman" w:hAnsi="Times New Roman"/>
-          <w:sz w:val="24"/>
-          <w:szCs w:val="24"/>
-          <w:lang w:eastAsia="ro-RO"/>
-        </w:rPr>
-        <w:t xml:space="preserve"> de Management al Dispozitivelor și noului </w:t>
-      </w:r>
-      <w:proofErr w:type="spellStart"/>
-      <w:r>
-        <w:rPr>
-          <w:rFonts w:ascii="Times New Roman" w:eastAsia="Times New Roman" w:hAnsi="Times New Roman"/>
-          <w:sz w:val="24"/>
-          <w:szCs w:val="24"/>
-          <w:lang w:eastAsia="ro-RO"/>
-        </w:rPr>
-        <w:t>Microserviciu</w:t>
-      </w:r>
-      <w:proofErr w:type="spellEnd"/>
-      <w:r>
-        <w:rPr>
-          <w:rFonts w:ascii="Times New Roman" w:eastAsia="Times New Roman" w:hAnsi="Times New Roman"/>
-          <w:sz w:val="24"/>
-          <w:szCs w:val="24"/>
-          <w:lang w:eastAsia="ro-RO"/>
-        </w:rPr>
-        <w:t xml:space="preserve"> de Monitorizare și Comunicare, este utilizat un sistem bazat pe evenimente.</w:t>
-      </w:r>
-      <w:r>
-        <w:rPr>
-          <w:rFonts w:ascii="Times New Roman" w:eastAsia="Times New Roman" w:hAnsi="Times New Roman"/>
-          <w:sz w:val="24"/>
-          <w:szCs w:val="24"/>
+          <w:sz w:val="20"/>
+          <w:szCs w:val="20"/>
+          <w:lang w:eastAsia="ro-RO"/>
+        </w:rPr>
+      </w:pPr>
+      <w:r>
+        <w:rPr>
+          <w:rFonts w:ascii="Times New Roman" w:eastAsia="Times New Roman" w:hAnsi="Times New Roman"/>
+          <w:sz w:val="20"/>
+          <w:szCs w:val="20"/>
+          <w:lang w:eastAsia="ro-RO"/>
+        </w:rPr>
+        <w:t>Pentru a facilita sincronizarea fără întreruperi între bazele de date ale Microserviciului de Management al Dispozitivelor și noului Microserviciu de Monitorizare și Comunicare, este utilizat un sistem bazat pe evenimente.</w:t>
+      </w:r>
+      <w:r>
+        <w:rPr>
+          <w:rFonts w:ascii="Times New Roman" w:eastAsia="Times New Roman" w:hAnsi="Times New Roman"/>
+          <w:sz w:val="20"/>
+          <w:szCs w:val="20"/>
           <w:lang w:eastAsia="ro-RO"/>
         </w:rPr>
         <w:br/>
-        <w:t xml:space="preserve">Acest sistem folosește un topic dedicat pentru modificările de dispozitive, </w:t>
-      </w:r>
-      <w:proofErr w:type="spellStart"/>
-      <w:r>
-        <w:rPr>
-          <w:rFonts w:ascii="Times New Roman" w:eastAsia="Times New Roman" w:hAnsi="Times New Roman"/>
-          <w:sz w:val="24"/>
-          <w:szCs w:val="24"/>
-          <w:lang w:eastAsia="ro-RO"/>
-        </w:rPr>
-        <w:t>transmitând</w:t>
-      </w:r>
-      <w:proofErr w:type="spellEnd"/>
-      <w:r>
-        <w:rPr>
-          <w:rFonts w:ascii="Times New Roman" w:eastAsia="Times New Roman" w:hAnsi="Times New Roman"/>
-          <w:sz w:val="24"/>
-          <w:szCs w:val="24"/>
-          <w:lang w:eastAsia="ro-RO"/>
-        </w:rPr>
-        <w:t xml:space="preserve"> informațiile despre dispozitive printr-o coadă special concepută pentru </w:t>
-      </w:r>
-      <w:proofErr w:type="spellStart"/>
-      <w:r>
-        <w:rPr>
-          <w:rFonts w:ascii="Times New Roman" w:eastAsia="Times New Roman" w:hAnsi="Times New Roman"/>
-          <w:sz w:val="24"/>
-          <w:szCs w:val="24"/>
-          <w:lang w:eastAsia="ro-RO"/>
-        </w:rPr>
-        <w:t>Microserviciul</w:t>
-      </w:r>
-      <w:proofErr w:type="spellEnd"/>
-      <w:r>
-        <w:rPr>
-          <w:rFonts w:ascii="Times New Roman" w:eastAsia="Times New Roman" w:hAnsi="Times New Roman"/>
-          <w:sz w:val="24"/>
-          <w:szCs w:val="24"/>
-          <w:lang w:eastAsia="ro-RO"/>
-        </w:rPr>
-        <w:t xml:space="preserve"> de Monitorizare și Comunicare.</w:t>
+        <w:t>Acest sistem folosește un topic dedicat pentru modificările de dispozitive, transmitând informațiile despre dispozitive printr-o coadă special concepută pentru Microserviciul de Monitorizare și Comunicare.</w:t>
       </w:r>
     </w:p>
     <w:p>
@@ -921,135 +696,35 @@
         <w:spacing w:before="100" w:beforeAutospacing="1" w:after="100" w:afterAutospacing="1" w:line="240" w:lineRule="auto"/>
         <w:rPr>
           <w:rFonts w:ascii="Times New Roman" w:eastAsia="Times New Roman" w:hAnsi="Times New Roman"/>
-          <w:sz w:val="24"/>
-          <w:szCs w:val="24"/>
-          <w:lang w:eastAsia="ro-RO"/>
-        </w:rPr>
-      </w:pPr>
-      <w:r>
-        <w:rPr>
-          <w:rFonts w:ascii="Times New Roman" w:eastAsia="Times New Roman" w:hAnsi="Times New Roman"/>
-          <w:sz w:val="24"/>
-          <w:szCs w:val="24"/>
-          <w:lang w:eastAsia="ro-RO"/>
-        </w:rPr>
-        <w:t xml:space="preserve">Adoptând formatul JSON, măsurătorile sunt trimise către coadă, incluzând detalii precum </w:t>
-      </w:r>
-      <w:proofErr w:type="spellStart"/>
-      <w:r>
-        <w:rPr>
-          <w:rFonts w:ascii="Times New Roman" w:eastAsia="Times New Roman" w:hAnsi="Times New Roman"/>
-          <w:sz w:val="24"/>
-          <w:szCs w:val="24"/>
-          <w:lang w:eastAsia="ro-RO"/>
-        </w:rPr>
-        <w:t>timestamp-ul</w:t>
-      </w:r>
-      <w:proofErr w:type="spellEnd"/>
-      <w:r>
-        <w:rPr>
-          <w:rFonts w:ascii="Times New Roman" w:eastAsia="Times New Roman" w:hAnsi="Times New Roman"/>
-          <w:sz w:val="24"/>
-          <w:szCs w:val="24"/>
-          <w:lang w:eastAsia="ro-RO"/>
-        </w:rPr>
-        <w:t xml:space="preserve">, </w:t>
-      </w:r>
-      <w:proofErr w:type="spellStart"/>
-      <w:r>
-        <w:rPr>
-          <w:rFonts w:ascii="Times New Roman" w:eastAsia="Times New Roman" w:hAnsi="Times New Roman"/>
-          <w:sz w:val="24"/>
-          <w:szCs w:val="24"/>
-          <w:lang w:eastAsia="ro-RO"/>
-        </w:rPr>
-        <w:t>device_id-ul</w:t>
-      </w:r>
-      <w:proofErr w:type="spellEnd"/>
-      <w:r>
-        <w:rPr>
-          <w:rFonts w:ascii="Times New Roman" w:eastAsia="Times New Roman" w:hAnsi="Times New Roman"/>
-          <w:sz w:val="24"/>
-          <w:szCs w:val="24"/>
-          <w:lang w:eastAsia="ro-RO"/>
-        </w:rPr>
-        <w:t xml:space="preserve"> și valoarea măsurătorii.</w:t>
-      </w:r>
-      <w:r>
-        <w:rPr>
-          <w:rFonts w:ascii="Times New Roman" w:eastAsia="Times New Roman" w:hAnsi="Times New Roman"/>
-          <w:sz w:val="24"/>
-          <w:szCs w:val="24"/>
+          <w:sz w:val="20"/>
+          <w:szCs w:val="20"/>
+          <w:lang w:eastAsia="ro-RO"/>
+        </w:rPr>
+      </w:pPr>
+      <w:r>
+        <w:rPr>
+          <w:rFonts w:ascii="Times New Roman" w:eastAsia="Times New Roman" w:hAnsi="Times New Roman"/>
+          <w:sz w:val="20"/>
+          <w:szCs w:val="20"/>
+          <w:lang w:eastAsia="ro-RO"/>
+        </w:rPr>
+        <w:t>Adoptând formatul JSON, măsurătorile sunt trimise către coadă, incluzând detalii precum timestamp-ul, device_id-ul și valoarea măsurătorii.</w:t>
+      </w:r>
+      <w:r>
+        <w:rPr>
+          <w:rFonts w:ascii="Times New Roman" w:eastAsia="Times New Roman" w:hAnsi="Times New Roman"/>
+          <w:sz w:val="20"/>
+          <w:szCs w:val="20"/>
           <w:lang w:eastAsia="ro-RO"/>
         </w:rPr>
         <w:br/>
-        <w:t xml:space="preserve">În paralel, </w:t>
-      </w:r>
-      <w:proofErr w:type="spellStart"/>
-      <w:r>
-        <w:rPr>
-          <w:rFonts w:ascii="Times New Roman" w:eastAsia="Times New Roman" w:hAnsi="Times New Roman"/>
-          <w:sz w:val="24"/>
-          <w:szCs w:val="24"/>
-          <w:lang w:eastAsia="ro-RO"/>
-        </w:rPr>
-        <w:t>Microserviciul</w:t>
-      </w:r>
-      <w:proofErr w:type="spellEnd"/>
-      <w:r>
-        <w:rPr>
-          <w:rFonts w:ascii="Times New Roman" w:eastAsia="Times New Roman" w:hAnsi="Times New Roman"/>
-          <w:sz w:val="24"/>
-          <w:szCs w:val="24"/>
-          <w:lang w:eastAsia="ro-RO"/>
-        </w:rPr>
-        <w:t xml:space="preserve"> de Monitorizare și Comunicare, echipat cu o componentă de tip </w:t>
-      </w:r>
-      <w:proofErr w:type="spellStart"/>
-      <w:r>
-        <w:rPr>
-          <w:rFonts w:ascii="Times New Roman" w:eastAsia="Times New Roman" w:hAnsi="Times New Roman"/>
-          <w:sz w:val="24"/>
-          <w:szCs w:val="24"/>
-          <w:lang w:eastAsia="ro-RO"/>
-        </w:rPr>
-        <w:t>Message</w:t>
-      </w:r>
-      <w:proofErr w:type="spellEnd"/>
-      <w:r>
-        <w:rPr>
-          <w:rFonts w:ascii="Times New Roman" w:eastAsia="Times New Roman" w:hAnsi="Times New Roman"/>
-          <w:sz w:val="24"/>
-          <w:szCs w:val="24"/>
-          <w:lang w:eastAsia="ro-RO"/>
-        </w:rPr>
-        <w:t xml:space="preserve"> </w:t>
-      </w:r>
-      <w:proofErr w:type="spellStart"/>
-      <w:r>
-        <w:rPr>
-          <w:rFonts w:ascii="Times New Roman" w:eastAsia="Times New Roman" w:hAnsi="Times New Roman"/>
-          <w:sz w:val="24"/>
-          <w:szCs w:val="24"/>
-          <w:lang w:eastAsia="ro-RO"/>
-        </w:rPr>
-        <w:t>Consumer</w:t>
-      </w:r>
-      <w:proofErr w:type="spellEnd"/>
-      <w:r>
-        <w:rPr>
-          <w:rFonts w:ascii="Times New Roman" w:eastAsia="Times New Roman" w:hAnsi="Times New Roman"/>
-          <w:sz w:val="24"/>
-          <w:szCs w:val="24"/>
-          <w:lang w:eastAsia="ro-RO"/>
-        </w:rPr>
-        <w:t>, preia responsabilitatea procesării acestor măsurători.</w:t>
-      </w:r>
-      <w:r>
-        <w:rPr>
-          <w:rFonts w:ascii="Times New Roman" w:eastAsia="Times New Roman" w:hAnsi="Times New Roman"/>
-          <w:sz w:val="24"/>
-          <w:szCs w:val="24"/>
+        <w:t>În paralel, Microserviciul de Monitorizare și Comunicare, echipat cu o componentă de tip Message Consumer, preia responsabilitatea procesării acestor măsurători.</w:t>
+      </w:r>
+      <w:r>
+        <w:rPr>
+          <w:rFonts w:ascii="Times New Roman" w:eastAsia="Times New Roman" w:hAnsi="Times New Roman"/>
+          <w:sz w:val="20"/>
+          <w:szCs w:val="20"/>
           <w:lang w:eastAsia="ro-RO"/>
         </w:rPr>
         <w:br/>
@@ -1063,16 +738,16 @@
         <w:spacing w:before="100" w:beforeAutospacing="1" w:after="100" w:afterAutospacing="1" w:line="240" w:lineRule="auto"/>
         <w:rPr>
           <w:rFonts w:ascii="Times New Roman" w:eastAsia="Times New Roman" w:hAnsi="Times New Roman"/>
-          <w:sz w:val="24"/>
-          <w:szCs w:val="24"/>
-          <w:lang w:eastAsia="ro-RO"/>
-        </w:rPr>
-      </w:pPr>
-      <w:r>
-        <w:rPr>
-          <w:rFonts w:ascii="Times New Roman" w:eastAsia="Times New Roman" w:hAnsi="Times New Roman"/>
-          <w:sz w:val="24"/>
-          <w:szCs w:val="24"/>
+          <w:sz w:val="20"/>
+          <w:szCs w:val="20"/>
+          <w:lang w:eastAsia="ro-RO"/>
+        </w:rPr>
+      </w:pPr>
+      <w:r>
+        <w:rPr>
+          <w:rFonts w:ascii="Times New Roman" w:eastAsia="Times New Roman" w:hAnsi="Times New Roman"/>
+          <w:sz w:val="20"/>
+          <w:szCs w:val="20"/>
           <w:lang w:eastAsia="ro-RO"/>
         </w:rPr>
         <w:t>Adăugând un strat suplimentar de inteligență, dacă valoarea totală a consumului orar depășește pragul maxim definit pentru dispozitiv, este trimisă o notificare asincronă către interfața web a utilizatorului, asigurând astfel reacții rapide și informate.</w:t>
@@ -1085,39 +760,19 @@
         <w:spacing w:before="100" w:beforeAutospacing="1" w:after="100" w:afterAutospacing="1" w:line="240" w:lineRule="auto"/>
         <w:rPr>
           <w:rFonts w:ascii="Times New Roman" w:eastAsia="Times New Roman" w:hAnsi="Times New Roman"/>
-          <w:sz w:val="24"/>
-          <w:szCs w:val="24"/>
-          <w:lang w:eastAsia="ro-RO"/>
-        </w:rPr>
-      </w:pPr>
-      <w:r>
-        <w:rPr>
-          <w:rFonts w:ascii="Times New Roman" w:eastAsia="Times New Roman" w:hAnsi="Times New Roman"/>
-          <w:sz w:val="24"/>
-          <w:szCs w:val="24"/>
-          <w:lang w:eastAsia="ro-RO"/>
-        </w:rPr>
-        <w:t xml:space="preserve">Pregătește-te să explorezi complexitatea acestei arhitecturi dinamice și interconectate de </w:t>
-      </w:r>
-      <w:proofErr w:type="spellStart"/>
-      <w:r>
-        <w:rPr>
-          <w:rFonts w:ascii="Times New Roman" w:eastAsia="Times New Roman" w:hAnsi="Times New Roman"/>
-          <w:sz w:val="24"/>
-          <w:szCs w:val="24"/>
-          <w:lang w:eastAsia="ro-RO"/>
-        </w:rPr>
-        <w:t>microservicii</w:t>
-      </w:r>
-      <w:proofErr w:type="spellEnd"/>
-      <w:r>
-        <w:rPr>
-          <w:rFonts w:ascii="Times New Roman" w:eastAsia="Times New Roman" w:hAnsi="Times New Roman"/>
-          <w:sz w:val="24"/>
-          <w:szCs w:val="24"/>
-          <w:lang w:eastAsia="ro-RO"/>
-        </w:rPr>
-        <w:t>.</w:t>
+          <w:sz w:val="20"/>
+          <w:szCs w:val="20"/>
+          <w:lang w:eastAsia="ro-RO"/>
+        </w:rPr>
+      </w:pPr>
+      <w:r>
+        <w:rPr>
+          <w:rFonts w:ascii="Times New Roman" w:eastAsia="Times New Roman" w:hAnsi="Times New Roman"/>
+          <w:sz w:val="20"/>
+          <w:szCs w:val="20"/>
+          <w:lang w:eastAsia="ro-RO"/>
+        </w:rPr>
+        <w:t>Pregătește-te să explorezi complexitatea acestei arhitecturi dinamice și interconectate de microservicii.</w:t>
       </w:r>
     </w:p>
     <w:p>
@@ -1145,7 +800,6 @@
           <w:lang w:eastAsia="ro-RO"/>
         </w:rPr>
       </w:pPr>
-      <w:proofErr w:type="spellStart"/>
       <w:r>
         <w:rPr>
           <w:rFonts w:ascii="Times New Roman" w:eastAsia="Times New Roman" w:hAnsi="Times New Roman"/>
@@ -1156,20 +810,7 @@
           <w:szCs w:val="28"/>
           <w:lang w:eastAsia="ro-RO"/>
         </w:rPr>
-        <w:t>Microserviciul</w:t>
-      </w:r>
-      <w:proofErr w:type="spellEnd"/>
-      <w:r>
-        <w:rPr>
-          <w:rFonts w:ascii="Times New Roman" w:eastAsia="Times New Roman" w:hAnsi="Times New Roman"/>
-          <w:b/>
-          <w:bCs/>
-          <w:kern w:val="36"/>
-          <w:sz w:val="28"/>
-          <w:szCs w:val="28"/>
-          <w:lang w:eastAsia="ro-RO"/>
-        </w:rPr>
-        <w:t xml:space="preserve"> de Chat</w:t>
+        <w:t>Microserviciul de Chat</w:t>
       </w:r>
     </w:p>
     <w:p>
@@ -1179,41 +820,43 @@
         <w:spacing w:before="100" w:beforeAutospacing="1" w:after="100" w:afterAutospacing="1" w:line="240" w:lineRule="auto"/>
         <w:rPr>
           <w:rFonts w:ascii="Times New Roman" w:eastAsia="Times New Roman" w:hAnsi="Times New Roman"/>
+          <w:sz w:val="20"/>
+          <w:szCs w:val="20"/>
+          <w:lang w:eastAsia="ro-RO"/>
+        </w:rPr>
+      </w:pPr>
+      <w:r>
+        <w:rPr>
+          <w:rFonts w:ascii="Times New Roman" w:eastAsia="Times New Roman" w:hAnsi="Times New Roman"/>
+          <w:sz w:val="20"/>
+          <w:szCs w:val="20"/>
+          <w:lang w:eastAsia="ro-RO"/>
+        </w:rPr>
+        <w:t>Microserviciul de Chat permite comunicarea bidirecțională, în timp real, între utilizatori și administratori.</w:t>
+      </w:r>
+      <w:r>
+        <w:rPr>
+          <w:rFonts w:ascii="Times New Roman" w:eastAsia="Times New Roman" w:hAnsi="Times New Roman"/>
+          <w:sz w:val="20"/>
+          <w:szCs w:val="20"/>
+          <w:lang w:eastAsia="ro-RO"/>
+        </w:rPr>
+        <w:br/>
+        <w:t>Este proiectat să funcționeze asincron, permițând gestionarea eficientă a mai multor sesiuni de chat simultan.</w:t>
+      </w:r>
+    </w:p>
+    <w:p>
+      <w:pPr>
+        <w:suppressAutoHyphens w:val="0"/>
+        <w:autoSpaceDN/>
+        <w:spacing w:before="100" w:beforeAutospacing="1" w:after="100" w:afterAutospacing="1" w:line="240" w:lineRule="auto"/>
+        <w:rPr>
+          <w:rFonts w:ascii="Times New Roman" w:eastAsia="Times New Roman" w:hAnsi="Times New Roman"/>
           <w:sz w:val="24"/>
           <w:szCs w:val="24"/>
           <w:lang w:eastAsia="ro-RO"/>
         </w:rPr>
       </w:pPr>
-      <w:proofErr w:type="spellStart"/>
-      <w:r>
-        <w:rPr>
-          <w:rFonts w:ascii="Times New Roman" w:eastAsia="Times New Roman" w:hAnsi="Times New Roman"/>
-          <w:sz w:val="24"/>
-          <w:szCs w:val="24"/>
-          <w:lang w:eastAsia="ro-RO"/>
-        </w:rPr>
-        <w:t>Microserviciul</w:t>
-      </w:r>
-      <w:proofErr w:type="spellEnd"/>
-      <w:r>
-        <w:rPr>
-          <w:rFonts w:ascii="Times New Roman" w:eastAsia="Times New Roman" w:hAnsi="Times New Roman"/>
-          <w:sz w:val="24"/>
-          <w:szCs w:val="24"/>
-          <w:lang w:eastAsia="ro-RO"/>
-        </w:rPr>
-        <w:t xml:space="preserve"> de Chat permite comunicarea bidirecțională, în timp real, între utilizatori și administratori.</w:t>
-      </w:r>
-      <w:r>
-        <w:rPr>
-          <w:rFonts w:ascii="Times New Roman" w:eastAsia="Times New Roman" w:hAnsi="Times New Roman"/>
-          <w:sz w:val="24"/>
-          <w:szCs w:val="24"/>
-          <w:lang w:eastAsia="ro-RO"/>
-        </w:rPr>
-        <w:br/>
-        <w:t>Este proiectat să funcționeze asincron, permițând gestionarea eficientă a mai multor sesiuni de chat simultan.</w:t>
-      </w:r>
     </w:p>
     <w:p>
       <w:pPr>
@@ -1253,51 +896,30 @@
         <w:spacing w:before="100" w:beforeAutospacing="1" w:after="100" w:afterAutospacing="1" w:line="240" w:lineRule="auto"/>
         <w:rPr>
           <w:rFonts w:ascii="Times New Roman" w:eastAsia="Times New Roman" w:hAnsi="Times New Roman"/>
-          <w:sz w:val="24"/>
-          <w:szCs w:val="24"/>
-          <w:lang w:eastAsia="ro-RO"/>
-        </w:rPr>
-      </w:pPr>
-      <w:r>
-        <w:rPr>
-          <w:rFonts w:ascii="Times New Roman" w:eastAsia="Times New Roman" w:hAnsi="Times New Roman"/>
-          <w:b/>
-          <w:bCs/>
-          <w:sz w:val="24"/>
-          <w:szCs w:val="24"/>
-          <w:lang w:eastAsia="ro-RO"/>
-        </w:rPr>
-        <w:lastRenderedPageBreak/>
+          <w:sz w:val="20"/>
+          <w:szCs w:val="20"/>
+          <w:lang w:eastAsia="ro-RO"/>
+        </w:rPr>
+      </w:pPr>
+      <w:r>
+        <w:rPr>
+          <w:rFonts w:ascii="Times New Roman" w:eastAsia="Times New Roman" w:hAnsi="Times New Roman"/>
+          <w:b/>
+          <w:bCs/>
+          <w:sz w:val="20"/>
+          <w:szCs w:val="20"/>
+          <w:lang w:eastAsia="ro-RO"/>
+        </w:rPr>
         <w:t>Interfață pentru utilizator</w:t>
       </w:r>
       <w:r>
         <w:rPr>
           <w:rFonts w:ascii="Times New Roman" w:eastAsia="Times New Roman" w:hAnsi="Times New Roman"/>
-          <w:sz w:val="24"/>
-          <w:szCs w:val="24"/>
-          <w:lang w:eastAsia="ro-RO"/>
-        </w:rPr>
-        <w:t>: Integrează o casetă de chat prietenoasă în front-</w:t>
-      </w:r>
-      <w:proofErr w:type="spellStart"/>
-      <w:r>
-        <w:rPr>
-          <w:rFonts w:ascii="Times New Roman" w:eastAsia="Times New Roman" w:hAnsi="Times New Roman"/>
-          <w:sz w:val="24"/>
-          <w:szCs w:val="24"/>
-          <w:lang w:eastAsia="ro-RO"/>
-        </w:rPr>
-        <w:t>end</w:t>
-      </w:r>
-      <w:proofErr w:type="spellEnd"/>
-      <w:r>
-        <w:rPr>
-          <w:rFonts w:ascii="Times New Roman" w:eastAsia="Times New Roman" w:hAnsi="Times New Roman"/>
-          <w:sz w:val="24"/>
-          <w:szCs w:val="24"/>
-          <w:lang w:eastAsia="ro-RO"/>
-        </w:rPr>
-        <w:t>, care permite utilizatorilor să trimită și să primească mesaje.</w:t>
+          <w:sz w:val="20"/>
+          <w:szCs w:val="20"/>
+          <w:lang w:eastAsia="ro-RO"/>
+        </w:rPr>
+        <w:t>: Integrează o casetă de chat prietenoasă în front-end, care permite utilizatorilor să trimită și să primească mesaje.</w:t>
       </w:r>
     </w:p>
     <w:p>
@@ -1311,18 +933,18 @@
         <w:spacing w:before="100" w:beforeAutospacing="1" w:after="100" w:afterAutospacing="1" w:line="240" w:lineRule="auto"/>
         <w:rPr>
           <w:rFonts w:ascii="Times New Roman" w:eastAsia="Times New Roman" w:hAnsi="Times New Roman"/>
-          <w:sz w:val="24"/>
-          <w:szCs w:val="24"/>
-          <w:lang w:eastAsia="ro-RO"/>
-        </w:rPr>
-      </w:pPr>
-      <w:r>
-        <w:rPr>
-          <w:rFonts w:ascii="Times New Roman" w:eastAsia="Times New Roman" w:hAnsi="Times New Roman"/>
-          <w:b/>
-          <w:bCs/>
-          <w:sz w:val="24"/>
-          <w:szCs w:val="24"/>
+          <w:sz w:val="20"/>
+          <w:szCs w:val="20"/>
+          <w:lang w:eastAsia="ro-RO"/>
+        </w:rPr>
+      </w:pPr>
+      <w:r>
+        <w:rPr>
+          <w:rFonts w:ascii="Times New Roman" w:eastAsia="Times New Roman" w:hAnsi="Times New Roman"/>
+          <w:b/>
+          <w:bCs/>
+          <w:sz w:val="20"/>
+          <w:szCs w:val="20"/>
           <w:lang w:eastAsia="ro-RO"/>
         </w:rPr>
         <w:t>Comunicare asincronă</w:t>
@@ -1330,8 +952,8 @@
       <w:r>
         <w:rPr>
           <w:rFonts w:ascii="Times New Roman" w:eastAsia="Times New Roman" w:hAnsi="Times New Roman"/>
-          <w:sz w:val="24"/>
-          <w:szCs w:val="24"/>
+          <w:sz w:val="20"/>
+          <w:szCs w:val="20"/>
           <w:lang w:eastAsia="ro-RO"/>
         </w:rPr>
         <w:t>: Mesajele trimise de utilizatori sunt transmise asincron către administratori, împreună cu identificatorul utilizatorului.</w:t>
@@ -1348,18 +970,18 @@
         <w:spacing w:before="100" w:beforeAutospacing="1" w:after="100" w:afterAutospacing="1" w:line="240" w:lineRule="auto"/>
         <w:rPr>
           <w:rFonts w:ascii="Times New Roman" w:eastAsia="Times New Roman" w:hAnsi="Times New Roman"/>
-          <w:sz w:val="24"/>
-          <w:szCs w:val="24"/>
-          <w:lang w:eastAsia="ro-RO"/>
-        </w:rPr>
-      </w:pPr>
-      <w:r>
-        <w:rPr>
-          <w:rFonts w:ascii="Times New Roman" w:eastAsia="Times New Roman" w:hAnsi="Times New Roman"/>
-          <w:b/>
-          <w:bCs/>
-          <w:sz w:val="24"/>
-          <w:szCs w:val="24"/>
+          <w:sz w:val="20"/>
+          <w:szCs w:val="20"/>
+          <w:lang w:eastAsia="ro-RO"/>
+        </w:rPr>
+      </w:pPr>
+      <w:r>
+        <w:rPr>
+          <w:rFonts w:ascii="Times New Roman" w:eastAsia="Times New Roman" w:hAnsi="Times New Roman"/>
+          <w:b/>
+          <w:bCs/>
+          <w:sz w:val="20"/>
+          <w:szCs w:val="20"/>
           <w:lang w:eastAsia="ro-RO"/>
         </w:rPr>
         <w:t>Notificări de citire</w:t>
@@ -1367,8 +989,8 @@
       <w:r>
         <w:rPr>
           <w:rFonts w:ascii="Times New Roman" w:eastAsia="Times New Roman" w:hAnsi="Times New Roman"/>
-          <w:sz w:val="24"/>
-          <w:szCs w:val="24"/>
+          <w:sz w:val="20"/>
+          <w:szCs w:val="20"/>
           <w:lang w:eastAsia="ro-RO"/>
         </w:rPr>
         <w:t>: Atât utilizatorii, cât și administratorii primesc notificări atunci când mesajele lor au fost citite de cealaltă parte.</w:t>
@@ -1385,18 +1007,18 @@
         <w:spacing w:before="100" w:beforeAutospacing="1" w:after="100" w:afterAutospacing="1" w:line="240" w:lineRule="auto"/>
         <w:rPr>
           <w:rFonts w:ascii="Times New Roman" w:eastAsia="Times New Roman" w:hAnsi="Times New Roman"/>
-          <w:sz w:val="24"/>
-          <w:szCs w:val="24"/>
-          <w:lang w:eastAsia="ro-RO"/>
-        </w:rPr>
-      </w:pPr>
-      <w:r>
-        <w:rPr>
-          <w:rFonts w:ascii="Times New Roman" w:eastAsia="Times New Roman" w:hAnsi="Times New Roman"/>
-          <w:b/>
-          <w:bCs/>
-          <w:sz w:val="24"/>
-          <w:szCs w:val="24"/>
+          <w:sz w:val="20"/>
+          <w:szCs w:val="20"/>
+          <w:lang w:eastAsia="ro-RO"/>
+        </w:rPr>
+      </w:pPr>
+      <w:r>
+        <w:rPr>
+          <w:rFonts w:ascii="Times New Roman" w:eastAsia="Times New Roman" w:hAnsi="Times New Roman"/>
+          <w:b/>
+          <w:bCs/>
+          <w:sz w:val="20"/>
+          <w:szCs w:val="20"/>
           <w:lang w:eastAsia="ro-RO"/>
         </w:rPr>
         <w:t>Indicatori de scriere</w:t>
@@ -1404,8 +1026,8 @@
       <w:r>
         <w:rPr>
           <w:rFonts w:ascii="Times New Roman" w:eastAsia="Times New Roman" w:hAnsi="Times New Roman"/>
-          <w:sz w:val="24"/>
-          <w:szCs w:val="24"/>
+          <w:sz w:val="20"/>
+          <w:szCs w:val="20"/>
           <w:lang w:eastAsia="ro-RO"/>
         </w:rPr>
         <w:t>: Afișează o notificare atunci când interlocutorul tastează un mesaj.</w:t>
@@ -1454,26 +1076,33 @@
         <w:suppressAutoHyphens w:val="0"/>
         <w:autoSpaceDN/>
         <w:spacing w:before="100" w:beforeAutospacing="1" w:after="100" w:afterAutospacing="1" w:line="240" w:lineRule="auto"/>
-        <w:outlineLvl w:val="1"/>
-        <w:rPr>
-          <w:rFonts w:ascii="Times New Roman" w:eastAsia="Times New Roman" w:hAnsi="Times New Roman"/>
-          <w:b/>
-          <w:bCs/>
-          <w:sz w:val="24"/>
-          <w:szCs w:val="24"/>
-          <w:lang w:eastAsia="ro-RO"/>
-        </w:rPr>
-      </w:pPr>
-      <w:r>
-        <w:rPr>
-          <w:rFonts w:ascii="Times New Roman" w:eastAsia="Times New Roman" w:hAnsi="Times New Roman"/>
-          <w:b/>
-          <w:bCs/>
-          <w:sz w:val="24"/>
-          <w:szCs w:val="24"/>
-          <w:lang w:eastAsia="ro-RO"/>
-        </w:rPr>
-        <w:t>Scop</w:t>
+        <w:rPr>
+          <w:rFonts w:ascii="Times New Roman" w:eastAsia="Times New Roman" w:hAnsi="Times New Roman"/>
+          <w:sz w:val="20"/>
+          <w:szCs w:val="20"/>
+          <w:lang w:eastAsia="ro-RO"/>
+        </w:rPr>
+      </w:pPr>
+      <w:r>
+        <w:rPr>
+          <w:rFonts w:ascii="Times New Roman" w:eastAsia="Times New Roman" w:hAnsi="Times New Roman"/>
+          <w:b/>
+          <w:bCs/>
+          <w:sz w:val="20"/>
+          <w:szCs w:val="20"/>
+          <w:lang w:eastAsia="ro-RO"/>
+        </w:rPr>
+        <w:t>Scop:</w:t>
+      </w:r>
+      <w:r>
+        <w:rPr>
+          <w:rFonts w:ascii="Times New Roman" w:eastAsia="Times New Roman" w:hAnsi="Times New Roman"/>
+          <w:sz w:val="20"/>
+          <w:szCs w:val="20"/>
+          <w:lang w:eastAsia="ro-RO"/>
+        </w:rPr>
+        <w:br/>
+        <w:t>Componenta de Autorizare Minimală are rolul de a asigura un control de bază asupra accesului la server, permițând dezvoltarea rapidă a aplicației într-un mediu securizat prin HTTPS, fără constrângeri stricte de autentificare sau autorizare bazată pe token. Această abordare este potrivită pentru faza de dezvoltare și testare a aplicației.</w:t>
       </w:r>
     </w:p>
     <w:p>
@@ -1491,138 +1120,93 @@
       <w:r>
         <w:rPr>
           <w:rFonts w:ascii="Times New Roman" w:eastAsia="Times New Roman" w:hAnsi="Times New Roman"/>
+          <w:b/>
+          <w:bCs/>
           <w:sz w:val="24"/>
           <w:szCs w:val="24"/>
           <w:lang w:eastAsia="ro-RO"/>
         </w:rPr>
-        <w:t>Componenta de Autorizare Minimală are rolul de a asigura un control de bază asupra accesului la server, permițând dezvoltarea rapidă a aplicației într-un mediu securizat prin HTTPS, fără constrângeri stricte de autentificare sau autorizare. Această abordare este destinată fazei de dezvoltare inițială și testare.</w:t>
-      </w:r>
-    </w:p>
-    <w:p>
-      <w:pPr>
-        <w:suppressAutoHyphens w:val="0"/>
-        <w:autoSpaceDN/>
-        <w:spacing w:before="100" w:beforeAutospacing="1" w:after="100" w:afterAutospacing="1" w:line="240" w:lineRule="auto"/>
-        <w:outlineLvl w:val="1"/>
-        <w:rPr>
-          <w:rFonts w:ascii="Times New Roman" w:eastAsia="Times New Roman" w:hAnsi="Times New Roman"/>
-          <w:b/>
-          <w:bCs/>
-          <w:sz w:val="24"/>
-          <w:szCs w:val="24"/>
-          <w:lang w:eastAsia="ro-RO"/>
-        </w:rPr>
-      </w:pPr>
-      <w:r>
-        <w:rPr>
-          <w:rFonts w:ascii="Times New Roman" w:eastAsia="Times New Roman" w:hAnsi="Times New Roman"/>
-          <w:b/>
-          <w:bCs/>
-          <w:sz w:val="24"/>
-          <w:szCs w:val="24"/>
-          <w:lang w:eastAsia="ro-RO"/>
-        </w:rPr>
-        <w:t>Funcționalități</w:t>
+        <w:t>Funcționalități tehnice:</w:t>
       </w:r>
     </w:p>
     <w:p>
       <w:pPr>
         <w:numPr>
           <w:ilvl w:val="0"/>
-          <w:numId w:val="5"/>
+          <w:numId w:val="9"/>
         </w:numPr>
         <w:suppressAutoHyphens w:val="0"/>
         <w:autoSpaceDN/>
         <w:spacing w:before="100" w:beforeAutospacing="1" w:after="100" w:afterAutospacing="1" w:line="240" w:lineRule="auto"/>
         <w:rPr>
           <w:rFonts w:ascii="Times New Roman" w:eastAsia="Times New Roman" w:hAnsi="Times New Roman"/>
-          <w:sz w:val="24"/>
-          <w:szCs w:val="24"/>
-          <w:lang w:eastAsia="ro-RO"/>
-        </w:rPr>
-      </w:pPr>
-      <w:r>
-        <w:rPr>
-          <w:rFonts w:ascii="Times New Roman" w:eastAsia="Times New Roman" w:hAnsi="Times New Roman"/>
-          <w:b/>
-          <w:bCs/>
-          <w:sz w:val="24"/>
-          <w:szCs w:val="24"/>
-          <w:lang w:eastAsia="ro-RO"/>
-        </w:rPr>
-        <w:t>Impunerea utilizării HTTPS</w:t>
-      </w:r>
-      <w:r>
-        <w:rPr>
-          <w:rFonts w:ascii="Times New Roman" w:eastAsia="Times New Roman" w:hAnsi="Times New Roman"/>
-          <w:sz w:val="24"/>
-          <w:szCs w:val="24"/>
-          <w:lang w:eastAsia="ro-RO"/>
-        </w:rPr>
-        <w:t>: Se impune ca toate cererile către server să fie realizate exclusiv prin protocolul securizat HTTPS, pentru protejarea transmisiilor de date.</w:t>
+          <w:sz w:val="20"/>
+          <w:szCs w:val="20"/>
+          <w:lang w:eastAsia="ro-RO"/>
+        </w:rPr>
+      </w:pPr>
+      <w:r>
+        <w:rPr>
+          <w:rFonts w:ascii="Times New Roman" w:eastAsia="Times New Roman" w:hAnsi="Times New Roman"/>
+          <w:b/>
+          <w:bCs/>
+          <w:sz w:val="20"/>
+          <w:szCs w:val="20"/>
+          <w:lang w:eastAsia="ro-RO"/>
+        </w:rPr>
+        <w:t>Impunerea utilizării HTTPS:</w:t>
+      </w:r>
+      <w:r>
+        <w:rPr>
+          <w:rFonts w:ascii="Times New Roman" w:eastAsia="Times New Roman" w:hAnsi="Times New Roman"/>
+          <w:sz w:val="20"/>
+          <w:szCs w:val="20"/>
+          <w:lang w:eastAsia="ro-RO"/>
+        </w:rPr>
+        <w:t xml:space="preserve"> Toate cererile către server sunt realizate exclusiv prin protocolul securizat HTTPS, asigurând confidențialitatea transmisiilor.</w:t>
       </w:r>
     </w:p>
     <w:p>
       <w:pPr>
         <w:numPr>
           <w:ilvl w:val="0"/>
-          <w:numId w:val="5"/>
+          <w:numId w:val="9"/>
         </w:numPr>
         <w:suppressAutoHyphens w:val="0"/>
         <w:autoSpaceDN/>
         <w:spacing w:before="100" w:beforeAutospacing="1" w:after="100" w:afterAutospacing="1" w:line="240" w:lineRule="auto"/>
         <w:rPr>
           <w:rFonts w:ascii="Times New Roman" w:eastAsia="Times New Roman" w:hAnsi="Times New Roman"/>
-          <w:sz w:val="24"/>
-          <w:szCs w:val="24"/>
-          <w:lang w:eastAsia="ro-RO"/>
-        </w:rPr>
-      </w:pPr>
-      <w:r>
-        <w:rPr>
-          <w:rFonts w:ascii="Times New Roman" w:eastAsia="Times New Roman" w:hAnsi="Times New Roman"/>
-          <w:b/>
-          <w:bCs/>
-          <w:sz w:val="24"/>
-          <w:szCs w:val="24"/>
-          <w:lang w:eastAsia="ro-RO"/>
-        </w:rPr>
-        <w:t>Configurarea politicii CORS</w:t>
-      </w:r>
-      <w:r>
-        <w:rPr>
-          <w:rFonts w:ascii="Times New Roman" w:eastAsia="Times New Roman" w:hAnsi="Times New Roman"/>
-          <w:sz w:val="24"/>
-          <w:szCs w:val="24"/>
-          <w:lang w:eastAsia="ro-RO"/>
-        </w:rPr>
-        <w:t xml:space="preserve">: Se permite realizarea cererilor </w:t>
-      </w:r>
-      <w:proofErr w:type="spellStart"/>
-      <w:r>
-        <w:rPr>
-          <w:rFonts w:ascii="Times New Roman" w:eastAsia="Times New Roman" w:hAnsi="Times New Roman"/>
-          <w:sz w:val="24"/>
-          <w:szCs w:val="24"/>
-          <w:lang w:eastAsia="ro-RO"/>
-        </w:rPr>
-        <w:t>cross-origin</w:t>
-      </w:r>
-      <w:proofErr w:type="spellEnd"/>
-      <w:r>
-        <w:rPr>
-          <w:rFonts w:ascii="Times New Roman" w:eastAsia="Times New Roman" w:hAnsi="Times New Roman"/>
-          <w:sz w:val="24"/>
-          <w:szCs w:val="24"/>
-          <w:lang w:eastAsia="ro-RO"/>
-        </w:rPr>
-        <w:t xml:space="preserve"> doar din surse de încredere (ex.: </w:t>
+          <w:sz w:val="20"/>
+          <w:szCs w:val="20"/>
+          <w:lang w:eastAsia="ro-RO"/>
+        </w:rPr>
+      </w:pPr>
+      <w:r>
+        <w:rPr>
+          <w:rFonts w:ascii="Times New Roman" w:eastAsia="Times New Roman" w:hAnsi="Times New Roman"/>
+          <w:b/>
+          <w:bCs/>
+          <w:sz w:val="20"/>
+          <w:szCs w:val="20"/>
+          <w:lang w:eastAsia="ro-RO"/>
+        </w:rPr>
+        <w:t>Configurarea politicii CORS:</w:t>
+      </w:r>
+      <w:r>
+        <w:rPr>
+          <w:rFonts w:ascii="Times New Roman" w:eastAsia="Times New Roman" w:hAnsi="Times New Roman"/>
+          <w:sz w:val="20"/>
+          <w:szCs w:val="20"/>
+          <w:lang w:eastAsia="ro-RO"/>
+        </w:rPr>
+        <w:t xml:space="preserve"> Se permit cereri cross-origin doar din surse de încredere (ex.: </w:t>
       </w:r>
       <w:r>
         <w:rPr>
           <w:rFonts w:ascii="Courier New" w:eastAsia="Times New Roman" w:hAnsi="Courier New" w:cs="Courier New"/>
-          <w:sz w:val="24"/>
-          <w:szCs w:val="24"/>
+          <w:sz w:val="20"/>
+          <w:szCs w:val="20"/>
           <w:lang w:eastAsia="ro-RO"/>
         </w:rPr>
         <w:t>http://localhost:3000</w:t>
@@ -1630,355 +1214,355 @@
       <w:r>
         <w:rPr>
           <w:rFonts w:ascii="Times New Roman" w:eastAsia="Times New Roman" w:hAnsi="Times New Roman"/>
-          <w:sz w:val="24"/>
-          <w:szCs w:val="24"/>
-          <w:lang w:eastAsia="ro-RO"/>
-        </w:rPr>
-        <w:t xml:space="preserve">), pentru a facilita comunicarea între </w:t>
-      </w:r>
-      <w:proofErr w:type="spellStart"/>
-      <w:r>
-        <w:rPr>
-          <w:rFonts w:ascii="Times New Roman" w:eastAsia="Times New Roman" w:hAnsi="Times New Roman"/>
-          <w:sz w:val="24"/>
-          <w:szCs w:val="24"/>
-          <w:lang w:eastAsia="ro-RO"/>
-        </w:rPr>
-        <w:t>frontend</w:t>
-      </w:r>
-      <w:proofErr w:type="spellEnd"/>
-      <w:r>
-        <w:rPr>
-          <w:rFonts w:ascii="Times New Roman" w:eastAsia="Times New Roman" w:hAnsi="Times New Roman"/>
-          <w:sz w:val="24"/>
-          <w:szCs w:val="24"/>
-          <w:lang w:eastAsia="ro-RO"/>
-        </w:rPr>
-        <w:t xml:space="preserve"> și </w:t>
-      </w:r>
-      <w:proofErr w:type="spellStart"/>
-      <w:r>
-        <w:rPr>
-          <w:rFonts w:ascii="Times New Roman" w:eastAsia="Times New Roman" w:hAnsi="Times New Roman"/>
-          <w:sz w:val="24"/>
-          <w:szCs w:val="24"/>
-          <w:lang w:eastAsia="ro-RO"/>
-        </w:rPr>
-        <w:t>backend</w:t>
-      </w:r>
-      <w:proofErr w:type="spellEnd"/>
-      <w:r>
-        <w:rPr>
-          <w:rFonts w:ascii="Times New Roman" w:eastAsia="Times New Roman" w:hAnsi="Times New Roman"/>
-          <w:sz w:val="24"/>
-          <w:szCs w:val="24"/>
-          <w:lang w:eastAsia="ro-RO"/>
-        </w:rPr>
-        <w:t xml:space="preserve"> în medii de dezvoltare locale.</w:t>
+          <w:sz w:val="20"/>
+          <w:szCs w:val="20"/>
+          <w:lang w:eastAsia="ro-RO"/>
+        </w:rPr>
+        <w:t>), pentru a facilita interacțiunea dintre frontend și backend.</w:t>
       </w:r>
     </w:p>
     <w:p>
       <w:pPr>
         <w:numPr>
           <w:ilvl w:val="0"/>
-          <w:numId w:val="5"/>
+          <w:numId w:val="9"/>
         </w:numPr>
         <w:suppressAutoHyphens w:val="0"/>
         <w:autoSpaceDN/>
         <w:spacing w:before="100" w:beforeAutospacing="1" w:after="100" w:afterAutospacing="1" w:line="240" w:lineRule="auto"/>
         <w:rPr>
           <w:rFonts w:ascii="Times New Roman" w:eastAsia="Times New Roman" w:hAnsi="Times New Roman"/>
-          <w:sz w:val="24"/>
-          <w:szCs w:val="24"/>
-          <w:lang w:eastAsia="ro-RO"/>
-        </w:rPr>
-      </w:pPr>
-      <w:r>
-        <w:rPr>
-          <w:rFonts w:ascii="Times New Roman" w:eastAsia="Times New Roman" w:hAnsi="Times New Roman"/>
-          <w:b/>
-          <w:bCs/>
-          <w:sz w:val="24"/>
-          <w:szCs w:val="24"/>
-          <w:lang w:eastAsia="ro-RO"/>
-        </w:rPr>
-        <w:t>Permisiuni de acces public</w:t>
-      </w:r>
-      <w:r>
-        <w:rPr>
-          <w:rFonts w:ascii="Times New Roman" w:eastAsia="Times New Roman" w:hAnsi="Times New Roman"/>
-          <w:sz w:val="24"/>
-          <w:szCs w:val="24"/>
-          <w:lang w:eastAsia="ro-RO"/>
-        </w:rPr>
-        <w:t>:</w:t>
+          <w:sz w:val="20"/>
+          <w:szCs w:val="20"/>
+          <w:lang w:eastAsia="ro-RO"/>
+        </w:rPr>
+      </w:pPr>
+      <w:r>
+        <w:rPr>
+          <w:rFonts w:ascii="Times New Roman" w:eastAsia="Times New Roman" w:hAnsi="Times New Roman"/>
+          <w:b/>
+          <w:bCs/>
+          <w:sz w:val="20"/>
+          <w:szCs w:val="20"/>
+          <w:lang w:eastAsia="ro-RO"/>
+        </w:rPr>
+        <w:t>Permisiuni de acces:</w:t>
       </w:r>
     </w:p>
     <w:p>
       <w:pPr>
         <w:numPr>
           <w:ilvl w:val="1"/>
-          <w:numId w:val="5"/>
+          <w:numId w:val="9"/>
         </w:numPr>
         <w:suppressAutoHyphens w:val="0"/>
         <w:autoSpaceDN/>
         <w:spacing w:before="100" w:beforeAutospacing="1" w:after="100" w:afterAutospacing="1" w:line="240" w:lineRule="auto"/>
         <w:rPr>
           <w:rFonts w:ascii="Times New Roman" w:eastAsia="Times New Roman" w:hAnsi="Times New Roman"/>
-          <w:sz w:val="24"/>
-          <w:szCs w:val="24"/>
-          <w:lang w:eastAsia="ro-RO"/>
-        </w:rPr>
-      </w:pPr>
-      <w:proofErr w:type="spellStart"/>
-      <w:r>
-        <w:rPr>
-          <w:rFonts w:ascii="Times New Roman" w:eastAsia="Times New Roman" w:hAnsi="Times New Roman"/>
-          <w:sz w:val="24"/>
-          <w:szCs w:val="24"/>
-          <w:lang w:eastAsia="ro-RO"/>
-        </w:rPr>
-        <w:t>Endpointul</w:t>
-      </w:r>
-      <w:proofErr w:type="spellEnd"/>
-      <w:r>
-        <w:rPr>
-          <w:rFonts w:ascii="Times New Roman" w:eastAsia="Times New Roman" w:hAnsi="Times New Roman"/>
-          <w:sz w:val="24"/>
-          <w:szCs w:val="24"/>
-          <w:lang w:eastAsia="ro-RO"/>
-        </w:rPr>
-        <w:t xml:space="preserve"> </w:t>
+          <w:sz w:val="20"/>
+          <w:szCs w:val="20"/>
+          <w:lang w:eastAsia="ro-RO"/>
+        </w:rPr>
+      </w:pPr>
+      <w:r>
+        <w:rPr>
+          <w:rFonts w:ascii="Times New Roman" w:eastAsia="Times New Roman" w:hAnsi="Times New Roman"/>
+          <w:sz w:val="20"/>
+          <w:szCs w:val="20"/>
+          <w:lang w:eastAsia="ro-RO"/>
+        </w:rPr>
+        <w:t xml:space="preserve">Endpoint-ul </w:t>
       </w:r>
       <w:r>
         <w:rPr>
           <w:rFonts w:ascii="Courier New" w:eastAsia="Times New Roman" w:hAnsi="Courier New" w:cs="Courier New"/>
-          <w:sz w:val="24"/>
-          <w:szCs w:val="24"/>
-          <w:lang w:eastAsia="ro-RO"/>
-        </w:rPr>
-        <w:t>/</w:t>
-      </w:r>
-      <w:proofErr w:type="spellStart"/>
-      <w:r>
-        <w:rPr>
-          <w:rFonts w:ascii="Courier New" w:eastAsia="Times New Roman" w:hAnsi="Courier New" w:cs="Courier New"/>
-          <w:sz w:val="24"/>
-          <w:szCs w:val="24"/>
-          <w:lang w:eastAsia="ro-RO"/>
-        </w:rPr>
-        <w:t>auth</w:t>
-      </w:r>
-      <w:proofErr w:type="spellEnd"/>
-      <w:r>
-        <w:rPr>
-          <w:rFonts w:ascii="Courier New" w:eastAsia="Times New Roman" w:hAnsi="Courier New" w:cs="Courier New"/>
-          <w:sz w:val="24"/>
-          <w:szCs w:val="24"/>
-          <w:lang w:eastAsia="ro-RO"/>
-        </w:rPr>
-        <w:t>/</w:t>
-      </w:r>
-      <w:proofErr w:type="spellStart"/>
-      <w:r>
-        <w:rPr>
-          <w:rFonts w:ascii="Courier New" w:eastAsia="Times New Roman" w:hAnsi="Courier New" w:cs="Courier New"/>
-          <w:sz w:val="24"/>
-          <w:szCs w:val="24"/>
-          <w:lang w:eastAsia="ro-RO"/>
-        </w:rPr>
-        <w:t>login</w:t>
-      </w:r>
-      <w:proofErr w:type="spellEnd"/>
-      <w:r>
-        <w:rPr>
-          <w:rFonts w:ascii="Times New Roman" w:eastAsia="Times New Roman" w:hAnsi="Times New Roman"/>
-          <w:sz w:val="24"/>
-          <w:szCs w:val="24"/>
-          <w:lang w:eastAsia="ro-RO"/>
-        </w:rPr>
-        <w:t xml:space="preserve"> este disponibil public fără autentificare.</w:t>
+          <w:sz w:val="20"/>
+          <w:szCs w:val="20"/>
+          <w:lang w:eastAsia="ro-RO"/>
+        </w:rPr>
+        <w:t>/auth/login</w:t>
+      </w:r>
+      <w:r>
+        <w:rPr>
+          <w:rFonts w:ascii="Times New Roman" w:eastAsia="Times New Roman" w:hAnsi="Times New Roman"/>
+          <w:sz w:val="20"/>
+          <w:szCs w:val="20"/>
+          <w:lang w:eastAsia="ro-RO"/>
+        </w:rPr>
+        <w:t xml:space="preserve"> este deschis public, pentru autentificare inițială.</w:t>
       </w:r>
     </w:p>
     <w:p>
       <w:pPr>
         <w:numPr>
           <w:ilvl w:val="1"/>
-          <w:numId w:val="5"/>
+          <w:numId w:val="9"/>
         </w:numPr>
         <w:suppressAutoHyphens w:val="0"/>
         <w:autoSpaceDN/>
         <w:spacing w:before="100" w:beforeAutospacing="1" w:after="100" w:afterAutospacing="1" w:line="240" w:lineRule="auto"/>
         <w:rPr>
           <w:rFonts w:ascii="Times New Roman" w:eastAsia="Times New Roman" w:hAnsi="Times New Roman"/>
-          <w:sz w:val="24"/>
-          <w:szCs w:val="24"/>
-          <w:lang w:eastAsia="ro-RO"/>
-        </w:rPr>
-      </w:pPr>
-      <w:r>
-        <w:rPr>
-          <w:rFonts w:ascii="Times New Roman" w:eastAsia="Times New Roman" w:hAnsi="Times New Roman"/>
-          <w:sz w:val="24"/>
-          <w:szCs w:val="24"/>
-          <w:lang w:eastAsia="ro-RO"/>
-        </w:rPr>
-        <w:t xml:space="preserve">Orice alt </w:t>
-      </w:r>
-      <w:proofErr w:type="spellStart"/>
-      <w:r>
-        <w:rPr>
-          <w:rFonts w:ascii="Times New Roman" w:eastAsia="Times New Roman" w:hAnsi="Times New Roman"/>
-          <w:sz w:val="24"/>
-          <w:szCs w:val="24"/>
-          <w:lang w:eastAsia="ro-RO"/>
-        </w:rPr>
-        <w:t>request</w:t>
-      </w:r>
-      <w:proofErr w:type="spellEnd"/>
-      <w:r>
-        <w:rPr>
-          <w:rFonts w:ascii="Times New Roman" w:eastAsia="Times New Roman" w:hAnsi="Times New Roman"/>
-          <w:sz w:val="24"/>
-          <w:szCs w:val="24"/>
-          <w:lang w:eastAsia="ro-RO"/>
-        </w:rPr>
-        <w:t xml:space="preserve"> către </w:t>
-      </w:r>
-      <w:proofErr w:type="spellStart"/>
-      <w:r>
-        <w:rPr>
-          <w:rFonts w:ascii="Times New Roman" w:eastAsia="Times New Roman" w:hAnsi="Times New Roman"/>
-          <w:sz w:val="24"/>
-          <w:szCs w:val="24"/>
-          <w:lang w:eastAsia="ro-RO"/>
-        </w:rPr>
-        <w:t>backend</w:t>
-      </w:r>
-      <w:proofErr w:type="spellEnd"/>
-      <w:r>
-        <w:rPr>
-          <w:rFonts w:ascii="Times New Roman" w:eastAsia="Times New Roman" w:hAnsi="Times New Roman"/>
-          <w:sz w:val="24"/>
-          <w:szCs w:val="24"/>
-          <w:lang w:eastAsia="ro-RO"/>
-        </w:rPr>
-        <w:t xml:space="preserve"> este de asemenea permis fără autentificare, pentru a evita blocajele în timpul dezvoltării.</w:t>
+          <w:sz w:val="20"/>
+          <w:szCs w:val="20"/>
+          <w:lang w:eastAsia="ro-RO"/>
+        </w:rPr>
+      </w:pPr>
+      <w:r>
+        <w:rPr>
+          <w:rFonts w:ascii="Times New Roman" w:eastAsia="Times New Roman" w:hAnsi="Times New Roman"/>
+          <w:sz w:val="20"/>
+          <w:szCs w:val="20"/>
+          <w:lang w:eastAsia="ro-RO"/>
+        </w:rPr>
+        <w:t>Alte endpointuri sunt accesibile fără autentificare strictă, pentru a evita blocajele în dezvoltare.</w:t>
       </w:r>
     </w:p>
     <w:p>
       <w:pPr>
         <w:numPr>
           <w:ilvl w:val="0"/>
-          <w:numId w:val="5"/>
+          <w:numId w:val="9"/>
         </w:numPr>
         <w:suppressAutoHyphens w:val="0"/>
         <w:autoSpaceDN/>
         <w:spacing w:before="100" w:beforeAutospacing="1" w:after="100" w:afterAutospacing="1" w:line="240" w:lineRule="auto"/>
         <w:rPr>
           <w:rFonts w:ascii="Times New Roman" w:eastAsia="Times New Roman" w:hAnsi="Times New Roman"/>
-          <w:sz w:val="24"/>
-          <w:szCs w:val="24"/>
-          <w:lang w:eastAsia="ro-RO"/>
-        </w:rPr>
-      </w:pPr>
-      <w:r>
-        <w:rPr>
-          <w:rFonts w:ascii="Times New Roman" w:eastAsia="Times New Roman" w:hAnsi="Times New Roman"/>
-          <w:b/>
-          <w:bCs/>
-          <w:sz w:val="24"/>
-          <w:szCs w:val="24"/>
-          <w:lang w:eastAsia="ro-RO"/>
-        </w:rPr>
-        <w:t>Dezactivarea mecanismelor implicite de securitate</w:t>
-      </w:r>
-      <w:r>
-        <w:rPr>
-          <w:rFonts w:ascii="Times New Roman" w:eastAsia="Times New Roman" w:hAnsi="Times New Roman"/>
-          <w:sz w:val="24"/>
-          <w:szCs w:val="24"/>
-          <w:lang w:eastAsia="ro-RO"/>
-        </w:rPr>
-        <w:t>:</w:t>
+          <w:sz w:val="20"/>
+          <w:szCs w:val="20"/>
+          <w:lang w:eastAsia="ro-RO"/>
+        </w:rPr>
+      </w:pPr>
+      <w:r>
+        <w:rPr>
+          <w:rFonts w:ascii="Times New Roman" w:eastAsia="Times New Roman" w:hAnsi="Times New Roman"/>
+          <w:b/>
+          <w:bCs/>
+          <w:sz w:val="20"/>
+          <w:szCs w:val="20"/>
+          <w:lang w:eastAsia="ro-RO"/>
+        </w:rPr>
+        <w:t>Dezactivarea mecanismelor implicite de securitate:</w:t>
       </w:r>
     </w:p>
     <w:p>
       <w:pPr>
         <w:numPr>
           <w:ilvl w:val="1"/>
-          <w:numId w:val="5"/>
+          <w:numId w:val="9"/>
         </w:numPr>
         <w:suppressAutoHyphens w:val="0"/>
         <w:autoSpaceDN/>
         <w:spacing w:before="100" w:beforeAutospacing="1" w:after="100" w:afterAutospacing="1" w:line="240" w:lineRule="auto"/>
         <w:rPr>
           <w:rFonts w:ascii="Times New Roman" w:eastAsia="Times New Roman" w:hAnsi="Times New Roman"/>
-          <w:sz w:val="24"/>
-          <w:szCs w:val="24"/>
-          <w:lang w:eastAsia="ro-RO"/>
-        </w:rPr>
-      </w:pPr>
-      <w:r>
-        <w:rPr>
-          <w:rFonts w:ascii="Times New Roman" w:eastAsia="Times New Roman" w:hAnsi="Times New Roman"/>
-          <w:b/>
-          <w:bCs/>
-          <w:sz w:val="24"/>
-          <w:szCs w:val="24"/>
-          <w:lang w:eastAsia="ro-RO"/>
-        </w:rPr>
-        <w:t>Dezactivarea CSRF</w:t>
-      </w:r>
-      <w:r>
-        <w:rPr>
-          <w:rFonts w:ascii="Times New Roman" w:eastAsia="Times New Roman" w:hAnsi="Times New Roman"/>
-          <w:sz w:val="24"/>
-          <w:szCs w:val="24"/>
-          <w:lang w:eastAsia="ro-RO"/>
-        </w:rPr>
-        <w:t>: Protecția împotriva atacurilor CSRF este dezactivată, deoarece sistemul nu utilizează sesiuni de autentificare.</w:t>
+          <w:sz w:val="20"/>
+          <w:szCs w:val="20"/>
+          <w:lang w:eastAsia="ro-RO"/>
+        </w:rPr>
+      </w:pPr>
+      <w:r>
+        <w:rPr>
+          <w:rFonts w:ascii="Times New Roman" w:eastAsia="Times New Roman" w:hAnsi="Times New Roman"/>
+          <w:sz w:val="20"/>
+          <w:szCs w:val="20"/>
+          <w:lang w:eastAsia="ro-RO"/>
+        </w:rPr>
+        <w:t>CSRF este dezactivat deoarece nu sunt utilizate sesiuni.</w:t>
       </w:r>
     </w:p>
     <w:p>
       <w:pPr>
         <w:numPr>
           <w:ilvl w:val="1"/>
-          <w:numId w:val="5"/>
+          <w:numId w:val="9"/>
         </w:numPr>
         <w:suppressAutoHyphens w:val="0"/>
         <w:autoSpaceDN/>
         <w:spacing w:before="100" w:beforeAutospacing="1" w:after="100" w:afterAutospacing="1" w:line="240" w:lineRule="auto"/>
         <w:rPr>
           <w:rFonts w:ascii="Times New Roman" w:eastAsia="Times New Roman" w:hAnsi="Times New Roman"/>
+          <w:sz w:val="20"/>
+          <w:szCs w:val="20"/>
+          <w:lang w:eastAsia="ro-RO"/>
+        </w:rPr>
+      </w:pPr>
+      <w:r>
+        <w:rPr>
+          <w:rFonts w:ascii="Times New Roman" w:eastAsia="Times New Roman" w:hAnsi="Times New Roman"/>
+          <w:sz w:val="20"/>
+          <w:szCs w:val="20"/>
+          <w:lang w:eastAsia="ro-RO"/>
+        </w:rPr>
+        <w:t>Autentificarea prin HTTP Basic și formular este dezactivată.</w:t>
+      </w:r>
+    </w:p>
+    <w:p>
+      <w:pPr>
+        <w:suppressAutoHyphens w:val="0"/>
+        <w:autoSpaceDN/>
+        <w:spacing w:before="100" w:beforeAutospacing="1" w:after="100" w:afterAutospacing="1" w:line="240" w:lineRule="auto"/>
+        <w:rPr>
+          <w:rFonts w:ascii="Times New Roman" w:eastAsia="Times New Roman" w:hAnsi="Times New Roman"/>
+          <w:sz w:val="20"/>
+          <w:szCs w:val="20"/>
+          <w:lang w:eastAsia="ro-RO"/>
+        </w:rPr>
+      </w:pPr>
+      <w:r>
+        <w:rPr>
+          <w:rFonts w:ascii="Times New Roman" w:eastAsia="Times New Roman" w:hAnsi="Times New Roman"/>
+          <w:b/>
+          <w:bCs/>
           <w:sz w:val="24"/>
           <w:szCs w:val="24"/>
           <w:lang w:eastAsia="ro-RO"/>
         </w:rPr>
-      </w:pPr>
-      <w:r>
-        <w:rPr>
-          <w:rFonts w:ascii="Times New Roman" w:eastAsia="Times New Roman" w:hAnsi="Times New Roman"/>
-          <w:b/>
-          <w:bCs/>
+        <w:t>Controlul logic al accesului (roluri și vizibilitate):</w:t>
+      </w:r>
+      <w:r>
+        <w:rPr>
+          <w:rFonts w:ascii="Times New Roman" w:eastAsia="Times New Roman" w:hAnsi="Times New Roman"/>
           <w:sz w:val="24"/>
           <w:szCs w:val="24"/>
           <w:lang w:eastAsia="ro-RO"/>
         </w:rPr>
-        <w:t>Dezactivarea autentificării HTTP Basic și a autentificării prin formular</w:t>
-      </w:r>
-      <w:r>
-        <w:rPr>
-          <w:rFonts w:ascii="Times New Roman" w:eastAsia="Times New Roman" w:hAnsi="Times New Roman"/>
+        <w:br/>
+      </w:r>
+      <w:r>
+        <w:rPr>
+          <w:rFonts w:ascii="Times New Roman" w:eastAsia="Times New Roman" w:hAnsi="Times New Roman"/>
+          <w:sz w:val="20"/>
+          <w:szCs w:val="20"/>
+          <w:lang w:eastAsia="ro-RO"/>
+        </w:rPr>
+        <w:t>Chiar dacă aplicația nu folosește JWT, implementarea asigură o formă funcțională de autorizare logică:</w:t>
+      </w:r>
+    </w:p>
+    <w:p>
+      <w:pPr>
+        <w:numPr>
+          <w:ilvl w:val="0"/>
+          <w:numId w:val="10"/>
+        </w:numPr>
+        <w:suppressAutoHyphens w:val="0"/>
+        <w:autoSpaceDN/>
+        <w:spacing w:before="100" w:beforeAutospacing="1" w:after="100" w:afterAutospacing="1" w:line="240" w:lineRule="auto"/>
+        <w:rPr>
+          <w:rFonts w:ascii="Times New Roman" w:eastAsia="Times New Roman" w:hAnsi="Times New Roman"/>
+          <w:sz w:val="20"/>
+          <w:szCs w:val="20"/>
+          <w:lang w:eastAsia="ro-RO"/>
+        </w:rPr>
+      </w:pPr>
+      <w:r>
+        <w:rPr>
+          <w:rFonts w:ascii="Times New Roman" w:eastAsia="Times New Roman" w:hAnsi="Times New Roman"/>
+          <w:b/>
+          <w:bCs/>
+          <w:sz w:val="20"/>
+          <w:szCs w:val="20"/>
+          <w:lang w:eastAsia="ro-RO"/>
+        </w:rPr>
+        <w:t>Utilizatorii</w:t>
+      </w:r>
+      <w:r>
+        <w:rPr>
+          <w:rFonts w:ascii="Times New Roman" w:eastAsia="Times New Roman" w:hAnsi="Times New Roman"/>
+          <w:sz w:val="20"/>
+          <w:szCs w:val="20"/>
+          <w:lang w:eastAsia="ro-RO"/>
+        </w:rPr>
+        <w:t xml:space="preserve"> pot vizualiza și accesa doar propriile resurse (dispozitive asociate, conversația personală cu administratorul).</w:t>
+      </w:r>
+    </w:p>
+    <w:p>
+      <w:pPr>
+        <w:numPr>
+          <w:ilvl w:val="0"/>
+          <w:numId w:val="10"/>
+        </w:numPr>
+        <w:suppressAutoHyphens w:val="0"/>
+        <w:autoSpaceDN/>
+        <w:spacing w:before="100" w:beforeAutospacing="1" w:after="100" w:afterAutospacing="1" w:line="240" w:lineRule="auto"/>
+        <w:rPr>
+          <w:rFonts w:ascii="Times New Roman" w:eastAsia="Times New Roman" w:hAnsi="Times New Roman"/>
+          <w:sz w:val="20"/>
+          <w:szCs w:val="20"/>
+          <w:lang w:eastAsia="ro-RO"/>
+        </w:rPr>
+      </w:pPr>
+      <w:r>
+        <w:rPr>
+          <w:rFonts w:ascii="Times New Roman" w:eastAsia="Times New Roman" w:hAnsi="Times New Roman"/>
+          <w:b/>
+          <w:bCs/>
+          <w:sz w:val="20"/>
+          <w:szCs w:val="20"/>
+          <w:lang w:eastAsia="ro-RO"/>
+        </w:rPr>
+        <w:t>Administratorul</w:t>
+      </w:r>
+      <w:r>
+        <w:rPr>
+          <w:rFonts w:ascii="Times New Roman" w:eastAsia="Times New Roman" w:hAnsi="Times New Roman"/>
+          <w:sz w:val="20"/>
+          <w:szCs w:val="20"/>
+          <w:lang w:eastAsia="ro-RO"/>
+        </w:rPr>
+        <w:t xml:space="preserve"> are acces complet: poate vizualiza lista tuturor utilizatorilor, poate conversa individual cu fiecare și gestiona interacțiunile.</w:t>
+      </w:r>
+    </w:p>
+    <w:p>
+      <w:pPr>
+        <w:numPr>
+          <w:ilvl w:val="0"/>
+          <w:numId w:val="10"/>
+        </w:numPr>
+        <w:suppressAutoHyphens w:val="0"/>
+        <w:autoSpaceDN/>
+        <w:spacing w:before="100" w:beforeAutospacing="1" w:after="100" w:afterAutospacing="1" w:line="240" w:lineRule="auto"/>
+        <w:rPr>
+          <w:rFonts w:ascii="Times New Roman" w:eastAsia="Times New Roman" w:hAnsi="Times New Roman"/>
+          <w:sz w:val="20"/>
+          <w:szCs w:val="20"/>
+          <w:lang w:eastAsia="ro-RO"/>
+        </w:rPr>
+      </w:pPr>
+      <w:r>
+        <w:rPr>
+          <w:rFonts w:ascii="Times New Roman" w:eastAsia="Times New Roman" w:hAnsi="Times New Roman"/>
+          <w:b/>
+          <w:bCs/>
+          <w:sz w:val="20"/>
+          <w:szCs w:val="20"/>
+          <w:lang w:eastAsia="ro-RO"/>
+        </w:rPr>
+        <w:t>Separarea funcțională</w:t>
+      </w:r>
+      <w:r>
+        <w:rPr>
+          <w:rFonts w:ascii="Times New Roman" w:eastAsia="Times New Roman" w:hAnsi="Times New Roman"/>
+          <w:sz w:val="20"/>
+          <w:szCs w:val="20"/>
+          <w:lang w:eastAsia="ro-RO"/>
+        </w:rPr>
+        <w:t xml:space="preserve"> este implementată direct în frontend și în controller-ele backend, astfel încât utilizatorii să nu poată accesa resursele altor utilizatori – nici din interfață, nici prin cereri directe către backend.</w:t>
+      </w:r>
+    </w:p>
+    <w:p>
+      <w:pPr>
+        <w:rPr>
+          <w:rFonts w:ascii="Times New Roman" w:hAnsi="Times New Roman"/>
+          <w:b/>
+          <w:bCs/>
           <w:sz w:val="24"/>
           <w:szCs w:val="24"/>
-          <w:lang w:eastAsia="ro-RO"/>
-        </w:rPr>
-        <w:t>: Aceste metode de autentificare sunt dezactivate pentru a simplifica accesul către API-uri.</w:t>
-      </w:r>
-    </w:p>
-    <w:p>
-      <w:pPr>
+        </w:rPr>
+      </w:pPr>
+      <w:r>
         <w:rPr>
           <w:rFonts w:ascii="Times New Roman" w:hAnsi="Times New Roman"/>
           <w:b/>
@@ -1986,8 +1570,11 @@
           <w:sz w:val="24"/>
           <w:szCs w:val="24"/>
         </w:rPr>
-      </w:pPr>
-      <w:r>
+        <w:t>Tehnologii Implementate</w:t>
+      </w:r>
+    </w:p>
+    <w:p>
+      <w:pPr>
         <w:rPr>
           <w:rFonts w:ascii="Times New Roman" w:hAnsi="Times New Roman"/>
           <w:b/>
@@ -1995,11 +1582,8 @@
           <w:sz w:val="24"/>
           <w:szCs w:val="24"/>
         </w:rPr>
-        <w:t>Tehnologii Implementate</w:t>
-      </w:r>
-    </w:p>
-    <w:p>
-      <w:pPr>
+      </w:pPr>
+      <w:r>
         <w:rPr>
           <w:rFonts w:ascii="Times New Roman" w:hAnsi="Times New Roman"/>
           <w:b/>
@@ -2007,8 +1591,28 @@
           <w:sz w:val="24"/>
           <w:szCs w:val="24"/>
         </w:rPr>
-      </w:pPr>
-      <w:r>
+        <w:t>Chat Component</w:t>
+      </w:r>
+    </w:p>
+    <w:p>
+      <w:pPr>
+        <w:rPr>
+          <w:rFonts w:ascii="Times New Roman" w:hAnsi="Times New Roman"/>
+          <w:sz w:val="20"/>
+          <w:szCs w:val="20"/>
+        </w:rPr>
+      </w:pPr>
+      <w:r>
+        <w:rPr>
+          <w:rFonts w:ascii="Times New Roman" w:hAnsi="Times New Roman"/>
+          <w:sz w:val="20"/>
+          <w:szCs w:val="20"/>
+        </w:rPr>
+        <w:t>WebSocket-urile sunt utilizate pentru comunicarea bidirecțională, în timp real, între clienți (utilizatori) și servere (administratori).</w:t>
+      </w:r>
+    </w:p>
+    <w:p>
+      <w:pPr>
         <w:rPr>
           <w:rFonts w:ascii="Times New Roman" w:hAnsi="Times New Roman"/>
           <w:b/>
@@ -2016,158 +1620,50 @@
           <w:sz w:val="24"/>
           <w:szCs w:val="24"/>
         </w:rPr>
-        <w:t>Chat Component</w:t>
-      </w:r>
-    </w:p>
-    <w:p>
-      <w:pPr>
-        <w:rPr>
+      </w:pPr>
+      <w:r>
+        <w:rPr>
+          <w:rStyle w:val="Robust"/>
           <w:rFonts w:ascii="Times New Roman" w:hAnsi="Times New Roman"/>
           <w:sz w:val="24"/>
           <w:szCs w:val="24"/>
         </w:rPr>
-      </w:pPr>
-      <w:proofErr w:type="spellStart"/>
-      <w:r>
-        <w:rPr>
-          <w:rFonts w:ascii="Times New Roman" w:hAnsi="Times New Roman"/>
+        <w:t>Authorization Component</w:t>
+      </w:r>
+      <w:r>
+        <w:rPr>
+          <w:rFonts w:ascii="Times New Roman" w:hAnsi="Times New Roman"/>
+        </w:rPr>
+        <w:br/>
+      </w:r>
+      <w:r>
+        <w:rPr>
+          <w:rFonts w:ascii="Times New Roman" w:hAnsi="Times New Roman"/>
+          <w:sz w:val="20"/>
+          <w:szCs w:val="20"/>
+        </w:rPr>
+        <w:t>Accesul la funcționalități este controlat prin logica aplicației, astfel încât utilizatorii pot accesa doar propriile date, iar administratorul are acces complet. Deși nu s-a folosit JWT, aplicația rulează prin HTTPS și controlează accesul în funcție de rolurile salvate în sistem.</w:t>
+      </w:r>
+    </w:p>
+    <w:p>
+      <w:pPr>
+        <w:rPr>
+          <w:rFonts w:ascii="Times New Roman" w:hAnsi="Times New Roman"/>
+          <w:b/>
+          <w:bCs/>
           <w:sz w:val="24"/>
           <w:szCs w:val="24"/>
         </w:rPr>
-        <w:t>WebSocket</w:t>
-      </w:r>
-      <w:proofErr w:type="spellEnd"/>
-      <w:r>
-        <w:rPr>
-          <w:rFonts w:ascii="Times New Roman" w:hAnsi="Times New Roman"/>
+      </w:pPr>
+      <w:r>
+        <w:rPr>
+          <w:rFonts w:ascii="Times New Roman" w:hAnsi="Times New Roman"/>
+          <w:b/>
+          <w:bCs/>
           <w:sz w:val="24"/>
           <w:szCs w:val="24"/>
         </w:rPr>
-        <w:t>-urile sunt utilizate pentru comunicarea bidirecțională, în timp real, între clienți (utilizatori) și servere (administratori).</w:t>
-      </w:r>
-    </w:p>
-    <w:p>
-      <w:pPr>
-        <w:rPr>
-          <w:rFonts w:ascii="Times New Roman" w:hAnsi="Times New Roman"/>
-          <w:b/>
-          <w:bCs/>
-          <w:sz w:val="24"/>
-          <w:szCs w:val="24"/>
-        </w:rPr>
-      </w:pPr>
-      <w:proofErr w:type="spellStart"/>
-      <w:r>
-        <w:rPr>
-          <w:rFonts w:ascii="Times New Roman" w:hAnsi="Times New Roman"/>
-          <w:b/>
-          <w:bCs/>
-          <w:sz w:val="24"/>
-          <w:szCs w:val="24"/>
-        </w:rPr>
-        <w:t>Authorization</w:t>
-      </w:r>
-      <w:proofErr w:type="spellEnd"/>
-      <w:r>
-        <w:rPr>
-          <w:rFonts w:ascii="Times New Roman" w:hAnsi="Times New Roman"/>
-          <w:b/>
-          <w:bCs/>
-          <w:sz w:val="24"/>
-          <w:szCs w:val="24"/>
-        </w:rPr>
-        <w:t xml:space="preserve"> Component</w:t>
-      </w:r>
-    </w:p>
-    <w:p>
-      <w:pPr>
-        <w:rPr>
-          <w:rFonts w:ascii="Times New Roman" w:hAnsi="Times New Roman"/>
-          <w:sz w:val="24"/>
-          <w:szCs w:val="24"/>
-        </w:rPr>
-      </w:pPr>
-      <w:r>
-        <w:rPr>
-          <w:rFonts w:ascii="Times New Roman" w:hAnsi="Times New Roman"/>
-          <w:sz w:val="24"/>
-          <w:szCs w:val="24"/>
-        </w:rPr>
-        <w:t xml:space="preserve">Permite accesul public la toate </w:t>
-      </w:r>
-      <w:proofErr w:type="spellStart"/>
-      <w:r>
-        <w:rPr>
-          <w:rFonts w:ascii="Times New Roman" w:hAnsi="Times New Roman"/>
-          <w:sz w:val="24"/>
-          <w:szCs w:val="24"/>
-        </w:rPr>
-        <w:t>endpointurile</w:t>
-      </w:r>
-      <w:proofErr w:type="spellEnd"/>
-      <w:r>
-        <w:rPr>
-          <w:rFonts w:ascii="Times New Roman" w:hAnsi="Times New Roman"/>
-          <w:sz w:val="24"/>
-          <w:szCs w:val="24"/>
-        </w:rPr>
-        <w:t xml:space="preserve"> și aplică obligativitatea utilizării conexiunilor securizate prin HTTPS.</w:t>
-      </w:r>
-    </w:p>
-    <w:p>
-      <w:pPr>
-        <w:rPr>
-          <w:rFonts w:ascii="Times New Roman" w:hAnsi="Times New Roman"/>
-          <w:b/>
-          <w:bCs/>
-          <w:sz w:val="24"/>
-          <w:szCs w:val="24"/>
-        </w:rPr>
-      </w:pPr>
-      <w:proofErr w:type="spellStart"/>
-      <w:r>
-        <w:rPr>
-          <w:rFonts w:ascii="Times New Roman" w:hAnsi="Times New Roman"/>
-          <w:b/>
-          <w:bCs/>
-          <w:sz w:val="24"/>
-          <w:szCs w:val="24"/>
-        </w:rPr>
-        <w:lastRenderedPageBreak/>
-        <w:t>Architectural</w:t>
-      </w:r>
-      <w:proofErr w:type="spellEnd"/>
-      <w:r>
-        <w:rPr>
-          <w:rFonts w:ascii="Times New Roman" w:hAnsi="Times New Roman"/>
-          <w:b/>
-          <w:bCs/>
-          <w:sz w:val="24"/>
-          <w:szCs w:val="24"/>
-        </w:rPr>
-        <w:t xml:space="preserve"> </w:t>
-      </w:r>
-      <w:proofErr w:type="spellStart"/>
-      <w:r>
-        <w:rPr>
-          <w:rFonts w:ascii="Times New Roman" w:hAnsi="Times New Roman"/>
-          <w:b/>
-          <w:bCs/>
-          <w:sz w:val="24"/>
-          <w:szCs w:val="24"/>
-        </w:rPr>
-        <w:t>Options</w:t>
-      </w:r>
-      <w:proofErr w:type="spellEnd"/>
-      <w:r>
-        <w:rPr>
-          <w:rFonts w:ascii="Times New Roman" w:hAnsi="Times New Roman"/>
-          <w:b/>
-          <w:bCs/>
-          <w:sz w:val="24"/>
-          <w:szCs w:val="24"/>
-        </w:rPr>
-        <w:t>:</w:t>
+        <w:t>Architectural Options:</w:t>
       </w:r>
     </w:p>
     <w:p>
@@ -2179,252 +1675,36 @@
         </w:numPr>
         <w:rPr>
           <w:rFonts w:ascii="Times New Roman" w:hAnsi="Times New Roman"/>
-          <w:sz w:val="24"/>
-          <w:szCs w:val="24"/>
-        </w:rPr>
-      </w:pPr>
-      <w:r>
-        <w:rPr>
-          <w:rFonts w:ascii="Times New Roman" w:hAnsi="Times New Roman"/>
-          <w:sz w:val="24"/>
-          <w:szCs w:val="24"/>
-        </w:rPr>
-        <w:t xml:space="preserve">Reverse Proxy </w:t>
-      </w:r>
-      <w:proofErr w:type="spellStart"/>
-      <w:r>
-        <w:rPr>
-          <w:rFonts w:ascii="Times New Roman" w:hAnsi="Times New Roman"/>
-          <w:sz w:val="24"/>
-          <w:szCs w:val="24"/>
-        </w:rPr>
-        <w:t>Configuration</w:t>
-      </w:r>
-      <w:proofErr w:type="spellEnd"/>
-      <w:r>
-        <w:rPr>
-          <w:rFonts w:ascii="Times New Roman" w:hAnsi="Times New Roman"/>
-          <w:sz w:val="24"/>
-          <w:szCs w:val="24"/>
-        </w:rPr>
-        <w:t xml:space="preserve">: The </w:t>
-      </w:r>
-      <w:proofErr w:type="spellStart"/>
-      <w:r>
-        <w:rPr>
-          <w:rFonts w:ascii="Times New Roman" w:hAnsi="Times New Roman"/>
-          <w:sz w:val="24"/>
-          <w:szCs w:val="24"/>
-        </w:rPr>
-        <w:t>authorization</w:t>
-      </w:r>
-      <w:proofErr w:type="spellEnd"/>
-      <w:r>
-        <w:rPr>
-          <w:rFonts w:ascii="Times New Roman" w:hAnsi="Times New Roman"/>
-          <w:sz w:val="24"/>
-          <w:szCs w:val="24"/>
-        </w:rPr>
-        <w:t xml:space="preserve"> service </w:t>
-      </w:r>
-      <w:proofErr w:type="spellStart"/>
-      <w:r>
-        <w:rPr>
-          <w:rFonts w:ascii="Times New Roman" w:hAnsi="Times New Roman"/>
-          <w:sz w:val="24"/>
-          <w:szCs w:val="24"/>
-        </w:rPr>
-        <w:t>doubles</w:t>
-      </w:r>
-      <w:proofErr w:type="spellEnd"/>
-      <w:r>
-        <w:rPr>
-          <w:rFonts w:ascii="Times New Roman" w:hAnsi="Times New Roman"/>
-          <w:sz w:val="24"/>
-          <w:szCs w:val="24"/>
-        </w:rPr>
-        <w:t xml:space="preserve"> as a reverse </w:t>
-      </w:r>
-      <w:proofErr w:type="spellStart"/>
-      <w:r>
-        <w:rPr>
-          <w:rFonts w:ascii="Times New Roman" w:hAnsi="Times New Roman"/>
-          <w:sz w:val="24"/>
-          <w:szCs w:val="24"/>
-        </w:rPr>
-        <w:t>proxy</w:t>
-      </w:r>
-      <w:proofErr w:type="spellEnd"/>
-      <w:r>
-        <w:rPr>
-          <w:rFonts w:ascii="Times New Roman" w:hAnsi="Times New Roman"/>
-          <w:sz w:val="24"/>
-          <w:szCs w:val="24"/>
-        </w:rPr>
-        <w:t xml:space="preserve">, </w:t>
-      </w:r>
-      <w:proofErr w:type="spellStart"/>
-      <w:r>
-        <w:rPr>
-          <w:rFonts w:ascii="Times New Roman" w:hAnsi="Times New Roman"/>
-          <w:sz w:val="24"/>
-          <w:szCs w:val="24"/>
-        </w:rPr>
-        <w:t>thereby</w:t>
-      </w:r>
-      <w:proofErr w:type="spellEnd"/>
-      <w:r>
-        <w:rPr>
-          <w:rFonts w:ascii="Times New Roman" w:hAnsi="Times New Roman"/>
-          <w:sz w:val="24"/>
-          <w:szCs w:val="24"/>
-        </w:rPr>
-        <w:t xml:space="preserve"> </w:t>
-      </w:r>
-      <w:proofErr w:type="spellStart"/>
-      <w:r>
-        <w:rPr>
-          <w:rFonts w:ascii="Times New Roman" w:hAnsi="Times New Roman"/>
-          <w:sz w:val="24"/>
-          <w:szCs w:val="24"/>
-        </w:rPr>
-        <w:t>centralizing</w:t>
-      </w:r>
-      <w:proofErr w:type="spellEnd"/>
-      <w:r>
-        <w:rPr>
-          <w:rFonts w:ascii="Times New Roman" w:hAnsi="Times New Roman"/>
-          <w:sz w:val="24"/>
-          <w:szCs w:val="24"/>
-        </w:rPr>
-        <w:t xml:space="preserve"> </w:t>
-      </w:r>
-      <w:proofErr w:type="spellStart"/>
-      <w:r>
-        <w:rPr>
-          <w:rFonts w:ascii="Times New Roman" w:hAnsi="Times New Roman"/>
-          <w:sz w:val="24"/>
-          <w:szCs w:val="24"/>
-        </w:rPr>
-        <w:t>access</w:t>
-      </w:r>
-      <w:proofErr w:type="spellEnd"/>
-      <w:r>
-        <w:rPr>
-          <w:rFonts w:ascii="Times New Roman" w:hAnsi="Times New Roman"/>
-          <w:sz w:val="24"/>
-          <w:szCs w:val="24"/>
-        </w:rPr>
-        <w:t xml:space="preserve"> control </w:t>
-      </w:r>
-      <w:proofErr w:type="spellStart"/>
-      <w:r>
-        <w:rPr>
-          <w:rFonts w:ascii="Times New Roman" w:hAnsi="Times New Roman"/>
-          <w:sz w:val="24"/>
-          <w:szCs w:val="24"/>
-        </w:rPr>
-        <w:t>and</w:t>
-      </w:r>
-      <w:proofErr w:type="spellEnd"/>
-      <w:r>
-        <w:rPr>
-          <w:rFonts w:ascii="Times New Roman" w:hAnsi="Times New Roman"/>
-          <w:sz w:val="24"/>
-          <w:szCs w:val="24"/>
-        </w:rPr>
-        <w:t xml:space="preserve"> </w:t>
-      </w:r>
-      <w:proofErr w:type="spellStart"/>
-      <w:r>
-        <w:rPr>
-          <w:rFonts w:ascii="Times New Roman" w:hAnsi="Times New Roman"/>
-          <w:sz w:val="24"/>
-          <w:szCs w:val="24"/>
-        </w:rPr>
-        <w:t>reducing</w:t>
-      </w:r>
-      <w:proofErr w:type="spellEnd"/>
-      <w:r>
-        <w:rPr>
-          <w:rFonts w:ascii="Times New Roman" w:hAnsi="Times New Roman"/>
-          <w:sz w:val="24"/>
-          <w:szCs w:val="24"/>
-        </w:rPr>
-        <w:t xml:space="preserve"> </w:t>
-      </w:r>
-      <w:proofErr w:type="spellStart"/>
-      <w:r>
-        <w:rPr>
-          <w:rFonts w:ascii="Times New Roman" w:hAnsi="Times New Roman"/>
-          <w:sz w:val="24"/>
-          <w:szCs w:val="24"/>
-        </w:rPr>
-        <w:t>the</w:t>
-      </w:r>
-      <w:proofErr w:type="spellEnd"/>
-      <w:r>
-        <w:rPr>
-          <w:rFonts w:ascii="Times New Roman" w:hAnsi="Times New Roman"/>
-          <w:sz w:val="24"/>
-          <w:szCs w:val="24"/>
-        </w:rPr>
-        <w:t xml:space="preserve"> </w:t>
-      </w:r>
-      <w:proofErr w:type="spellStart"/>
-      <w:r>
-        <w:rPr>
-          <w:rFonts w:ascii="Times New Roman" w:hAnsi="Times New Roman"/>
-          <w:sz w:val="24"/>
-          <w:szCs w:val="24"/>
-        </w:rPr>
-        <w:t>authorization</w:t>
-      </w:r>
-      <w:proofErr w:type="spellEnd"/>
-      <w:r>
-        <w:rPr>
-          <w:rFonts w:ascii="Times New Roman" w:hAnsi="Times New Roman"/>
-          <w:sz w:val="24"/>
-          <w:szCs w:val="24"/>
-        </w:rPr>
-        <w:t xml:space="preserve"> </w:t>
-      </w:r>
-      <w:proofErr w:type="spellStart"/>
-      <w:r>
-        <w:rPr>
-          <w:rFonts w:ascii="Times New Roman" w:hAnsi="Times New Roman"/>
-          <w:sz w:val="24"/>
-          <w:szCs w:val="24"/>
-        </w:rPr>
-        <w:t>load</w:t>
-      </w:r>
-      <w:proofErr w:type="spellEnd"/>
-      <w:r>
-        <w:rPr>
-          <w:rFonts w:ascii="Times New Roman" w:hAnsi="Times New Roman"/>
-          <w:sz w:val="24"/>
-          <w:szCs w:val="24"/>
-        </w:rPr>
-        <w:t xml:space="preserve"> on individual </w:t>
-      </w:r>
-      <w:proofErr w:type="spellStart"/>
-      <w:r>
-        <w:rPr>
-          <w:rFonts w:ascii="Times New Roman" w:hAnsi="Times New Roman"/>
-          <w:sz w:val="24"/>
-          <w:szCs w:val="24"/>
-        </w:rPr>
-        <w:t>services</w:t>
-      </w:r>
-      <w:proofErr w:type="spellEnd"/>
-      <w:r>
-        <w:rPr>
-          <w:rFonts w:ascii="Times New Roman" w:hAnsi="Times New Roman"/>
-          <w:sz w:val="24"/>
-          <w:szCs w:val="24"/>
-        </w:rPr>
-        <w:t>.</w:t>
-      </w:r>
+          <w:sz w:val="20"/>
+          <w:szCs w:val="20"/>
+        </w:rPr>
+      </w:pPr>
+      <w:r>
+        <w:rPr>
+          <w:rFonts w:ascii="Times New Roman" w:hAnsi="Times New Roman"/>
+          <w:sz w:val="20"/>
+          <w:szCs w:val="20"/>
+        </w:rPr>
+        <w:t>Reverse Proxy Configuration: The authorization service doubles as a reverse proxy, thereby centralizing access control and reducing the authorization load on individual services.</w:t>
+      </w:r>
+    </w:p>
+    <w:p>
+      <w:pPr>
+        <w:rPr>
+          <w:rFonts w:ascii="Times New Roman" w:hAnsi="Times New Roman"/>
+          <w:sz w:val="20"/>
+          <w:szCs w:val="20"/>
+        </w:rPr>
+      </w:pPr>
+    </w:p>
+    <w:p>
+      <w:pPr>
+        <w:rPr>
+          <w:rFonts w:ascii="Times New Roman" w:hAnsi="Times New Roman"/>
+          <w:sz w:val="20"/>
+          <w:szCs w:val="20"/>
+        </w:rPr>
+      </w:pPr>
     </w:p>
     <w:p>
       <w:pPr>
@@ -2444,6 +1724,7 @@
           <w:sz w:val="28"/>
           <w:szCs w:val="28"/>
         </w:rPr>
+        <w:lastRenderedPageBreak/>
         <w:t>2.</w:t>
       </w:r>
       <w:r>
@@ -2461,23 +1742,23 @@
       <w:pPr>
         <w:rPr>
           <w:rFonts w:ascii="Times New Roman" w:hAnsi="Times New Roman"/>
-          <w:sz w:val="24"/>
-          <w:szCs w:val="24"/>
-        </w:rPr>
-      </w:pPr>
-      <w:r>
-        <w:rPr>
-          <w:rFonts w:ascii="Times New Roman" w:hAnsi="Times New Roman"/>
-          <w:sz w:val="24"/>
-          <w:szCs w:val="24"/>
+          <w:sz w:val="20"/>
+          <w:szCs w:val="20"/>
+        </w:rPr>
+      </w:pPr>
+      <w:r>
+        <w:rPr>
+          <w:rFonts w:ascii="Times New Roman" w:hAnsi="Times New Roman"/>
+          <w:sz w:val="20"/>
+          <w:szCs w:val="20"/>
         </w:rPr>
         <w:t>Dezvoltarea unei platforme online este esențială pentru gestionarea eficientă a utilizatorilor, a dispozitivelor inteligente de măsurare a energiei asociate acestora și a datelor colectate de la fiecare dispozitiv.</w:t>
       </w:r>
       <w:r>
         <w:rPr>
           <w:rFonts w:ascii="Times New Roman" w:hAnsi="Times New Roman"/>
-          <w:sz w:val="24"/>
-          <w:szCs w:val="24"/>
+          <w:sz w:val="20"/>
+          <w:szCs w:val="20"/>
         </w:rPr>
         <w:br/>
         <w:t>După finalizarea procesului de autentificare, două tipuri distincte de utilizatori au acces la sistem: administratori (manageri) și clienți.</w:t>
@@ -2485,127 +1766,37 @@
       <w:r>
         <w:rPr>
           <w:rFonts w:ascii="Times New Roman" w:hAnsi="Times New Roman"/>
-          <w:sz w:val="24"/>
-          <w:szCs w:val="24"/>
+          <w:sz w:val="20"/>
+          <w:szCs w:val="20"/>
         </w:rPr>
         <w:br/>
-        <w:t>Administratorul deține autoritatea de a efectua operații CRUD (Create-</w:t>
-      </w:r>
-      <w:proofErr w:type="spellStart"/>
-      <w:r>
-        <w:rPr>
-          <w:rFonts w:ascii="Times New Roman" w:hAnsi="Times New Roman"/>
-          <w:sz w:val="24"/>
-          <w:szCs w:val="24"/>
-        </w:rPr>
-        <w:t>Read</w:t>
-      </w:r>
-      <w:proofErr w:type="spellEnd"/>
-      <w:r>
-        <w:rPr>
-          <w:rFonts w:ascii="Times New Roman" w:hAnsi="Times New Roman"/>
-          <w:sz w:val="24"/>
-          <w:szCs w:val="24"/>
-        </w:rPr>
-        <w:t>-Update-</w:t>
-      </w:r>
-      <w:proofErr w:type="spellStart"/>
-      <w:r>
-        <w:rPr>
-          <w:rFonts w:ascii="Times New Roman" w:hAnsi="Times New Roman"/>
-          <w:sz w:val="24"/>
-          <w:szCs w:val="24"/>
-        </w:rPr>
-        <w:t>Delete</w:t>
-      </w:r>
-      <w:proofErr w:type="spellEnd"/>
-      <w:r>
-        <w:rPr>
-          <w:rFonts w:ascii="Times New Roman" w:hAnsi="Times New Roman"/>
-          <w:sz w:val="24"/>
-          <w:szCs w:val="24"/>
-        </w:rPr>
-        <w:t xml:space="preserve">) asupra conturilor de utilizatori (caracterizate prin ID, nume și rol: </w:t>
-      </w:r>
-      <w:proofErr w:type="spellStart"/>
-      <w:r>
-        <w:rPr>
-          <w:rFonts w:ascii="Times New Roman" w:hAnsi="Times New Roman"/>
-          <w:sz w:val="24"/>
-          <w:szCs w:val="24"/>
-        </w:rPr>
-        <w:t>admin</w:t>
-      </w:r>
-      <w:proofErr w:type="spellEnd"/>
-      <w:r>
-        <w:rPr>
-          <w:rFonts w:ascii="Times New Roman" w:hAnsi="Times New Roman"/>
-          <w:sz w:val="24"/>
-          <w:szCs w:val="24"/>
-        </w:rPr>
-        <w:t>/client), asupra dispozitivelor inteligente de măsurare a energiei înregistrate (caracterizate prin ID, descriere, adresă și consum maxim orar de energie) și asupra asocierii utilizatorilor cu dispozitivele.</w:t>
-      </w:r>
-    </w:p>
-    <w:p>
-      <w:pPr>
-        <w:rPr>
-          <w:rFonts w:ascii="Times New Roman" w:hAnsi="Times New Roman"/>
-          <w:sz w:val="24"/>
-          <w:szCs w:val="24"/>
-        </w:rPr>
-      </w:pPr>
-      <w:r>
-        <w:rPr>
-          <w:rFonts w:ascii="Times New Roman" w:hAnsi="Times New Roman"/>
-          <w:sz w:val="24"/>
-          <w:szCs w:val="24"/>
+        <w:t>Administratorul deține autoritatea de a efectua operații CRUD (Create-Read-Update-Delete) asupra conturilor de utilizatori (caracterizate prin ID, nume și rol: admin/client), asupra dispozitivelor inteligente de măsurare a energiei înregistrate (caracterizate prin ID, descriere, adresă și consum maxim orar de energie) și asupra asocierii utilizatorilor cu dispozitivele.</w:t>
+      </w:r>
+    </w:p>
+    <w:p>
+      <w:pPr>
+        <w:rPr>
+          <w:rFonts w:ascii="Times New Roman" w:hAnsi="Times New Roman"/>
+          <w:sz w:val="20"/>
+          <w:szCs w:val="20"/>
+        </w:rPr>
+      </w:pPr>
+      <w:r>
+        <w:rPr>
+          <w:rFonts w:ascii="Times New Roman" w:hAnsi="Times New Roman"/>
+          <w:sz w:val="20"/>
+          <w:szCs w:val="20"/>
         </w:rPr>
         <w:t>Este important de menționat că fiecare utilizator poate deține unul sau mai multe dispozitive inteligente situate în locații diferite.</w:t>
       </w:r>
       <w:r>
         <w:rPr>
           <w:rFonts w:ascii="Times New Roman" w:hAnsi="Times New Roman"/>
-          <w:sz w:val="24"/>
-          <w:szCs w:val="24"/>
+          <w:sz w:val="20"/>
+          <w:szCs w:val="20"/>
         </w:rPr>
         <w:br/>
-        <w:t xml:space="preserve">După finalizarea mapării utilizatorilor cu dispozitivele, sistemul stochează consumul de energie pentru fiecare dispozitiv la nivel orar, sub forma unor </w:t>
-      </w:r>
-      <w:proofErr w:type="spellStart"/>
-      <w:r>
-        <w:rPr>
-          <w:rFonts w:ascii="Times New Roman" w:hAnsi="Times New Roman"/>
-          <w:sz w:val="24"/>
-          <w:szCs w:val="24"/>
-        </w:rPr>
-        <w:t>tupluri</w:t>
-      </w:r>
-      <w:proofErr w:type="spellEnd"/>
-      <w:r>
-        <w:rPr>
-          <w:rFonts w:ascii="Times New Roman" w:hAnsi="Times New Roman"/>
-          <w:sz w:val="24"/>
-          <w:szCs w:val="24"/>
-        </w:rPr>
-        <w:t xml:space="preserve"> de tipul &lt;</w:t>
-      </w:r>
-      <w:proofErr w:type="spellStart"/>
-      <w:r>
-        <w:rPr>
-          <w:rFonts w:ascii="Times New Roman" w:hAnsi="Times New Roman"/>
-          <w:sz w:val="24"/>
-          <w:szCs w:val="24"/>
-        </w:rPr>
-        <w:t>timestamp</w:t>
-      </w:r>
-      <w:proofErr w:type="spellEnd"/>
-      <w:r>
-        <w:rPr>
-          <w:rFonts w:ascii="Times New Roman" w:hAnsi="Times New Roman"/>
-          <w:sz w:val="24"/>
-          <w:szCs w:val="24"/>
-        </w:rPr>
-        <w:t>, consum de energie&gt; în baza de date.</w:t>
+        <w:t>După finalizarea mapării utilizatorilor cu dispozitivele, sistemul stochează consumul de energie pentru fiecare dispozitiv la nivel orar, sub forma unor tupluri de tipul &lt;timestamp, consum de energie&gt; în baza de date.</w:t>
       </w:r>
     </w:p>
     <w:p>
@@ -2615,69 +1806,29 @@
         <w:spacing w:before="100" w:beforeAutospacing="1" w:after="100" w:afterAutospacing="1" w:line="240" w:lineRule="auto"/>
         <w:rPr>
           <w:rFonts w:ascii="Times New Roman" w:eastAsia="Times New Roman" w:hAnsi="Times New Roman"/>
-          <w:sz w:val="24"/>
-          <w:szCs w:val="24"/>
-          <w:lang w:eastAsia="ro-RO"/>
-        </w:rPr>
-      </w:pPr>
-      <w:r>
-        <w:rPr>
-          <w:rFonts w:ascii="Times New Roman" w:eastAsia="Times New Roman" w:hAnsi="Times New Roman"/>
-          <w:sz w:val="24"/>
-          <w:szCs w:val="24"/>
-          <w:lang w:eastAsia="ro-RO"/>
-        </w:rPr>
-        <w:t xml:space="preserve">În cadrul arhitecturii sistemului distribuit, a fost integrat un </w:t>
-      </w:r>
-      <w:proofErr w:type="spellStart"/>
-      <w:r>
-        <w:rPr>
-          <w:rFonts w:ascii="Times New Roman" w:eastAsia="Times New Roman" w:hAnsi="Times New Roman"/>
-          <w:sz w:val="24"/>
-          <w:szCs w:val="24"/>
-          <w:lang w:eastAsia="ro-RO"/>
-        </w:rPr>
-        <w:t>microserviciu</w:t>
-      </w:r>
-      <w:proofErr w:type="spellEnd"/>
-      <w:r>
-        <w:rPr>
-          <w:rFonts w:ascii="Times New Roman" w:eastAsia="Times New Roman" w:hAnsi="Times New Roman"/>
-          <w:sz w:val="24"/>
-          <w:szCs w:val="24"/>
-          <w:lang w:eastAsia="ro-RO"/>
-        </w:rPr>
-        <w:t xml:space="preserve"> de chat dedicat, responsabil pentru asigurarea comunicării în timp real între utilizatori și administratori.</w:t>
-      </w:r>
-      <w:r>
-        <w:rPr>
-          <w:rFonts w:ascii="Times New Roman" w:eastAsia="Times New Roman" w:hAnsi="Times New Roman"/>
-          <w:sz w:val="24"/>
-          <w:szCs w:val="24"/>
+          <w:sz w:val="20"/>
+          <w:szCs w:val="20"/>
+          <w:lang w:eastAsia="ro-RO"/>
+        </w:rPr>
+      </w:pPr>
+      <w:r>
+        <w:rPr>
+          <w:rFonts w:ascii="Times New Roman" w:eastAsia="Times New Roman" w:hAnsi="Times New Roman"/>
+          <w:sz w:val="20"/>
+          <w:szCs w:val="20"/>
+          <w:lang w:eastAsia="ro-RO"/>
+        </w:rPr>
+        <w:t>În cadrul arhitecturii sistemului distribuit, a fost integrat un microserviciu de chat dedicat, responsabil pentru asigurarea comunicării în timp real între utilizatori și administratori.</w:t>
+      </w:r>
+      <w:r>
+        <w:rPr>
+          <w:rFonts w:ascii="Times New Roman" w:eastAsia="Times New Roman" w:hAnsi="Times New Roman"/>
+          <w:sz w:val="20"/>
+          <w:szCs w:val="20"/>
           <w:lang w:eastAsia="ro-RO"/>
         </w:rPr>
         <w:br/>
-        <w:t xml:space="preserve">Comunicarea se realizează prin tehnologia </w:t>
-      </w:r>
-      <w:proofErr w:type="spellStart"/>
-      <w:r>
-        <w:rPr>
-          <w:rFonts w:ascii="Times New Roman" w:eastAsia="Times New Roman" w:hAnsi="Times New Roman"/>
-          <w:sz w:val="24"/>
-          <w:szCs w:val="24"/>
-          <w:lang w:eastAsia="ro-RO"/>
-        </w:rPr>
-        <w:t>WebSocket</w:t>
-      </w:r>
-      <w:proofErr w:type="spellEnd"/>
-      <w:r>
-        <w:rPr>
-          <w:rFonts w:ascii="Times New Roman" w:eastAsia="Times New Roman" w:hAnsi="Times New Roman"/>
-          <w:sz w:val="24"/>
-          <w:szCs w:val="24"/>
-          <w:lang w:eastAsia="ro-RO"/>
-        </w:rPr>
-        <w:t>, care permite schimbul bidirecțional și asincron de mesaje, oferind o experiență interactivă și cu latență minimă.</w:t>
+        <w:t>Comunicarea se realizează prin tehnologia WebSocket, care permite schimbul bidirecțional și asincron de mesaje, oferind o experiență interactivă și cu latență minimă.</w:t>
       </w:r>
     </w:p>
     <w:p>
@@ -2687,254 +1838,79 @@
         <w:spacing w:before="100" w:beforeAutospacing="1" w:after="100" w:afterAutospacing="1" w:line="240" w:lineRule="auto"/>
         <w:rPr>
           <w:rFonts w:ascii="Times New Roman" w:eastAsia="Times New Roman" w:hAnsi="Times New Roman"/>
+          <w:sz w:val="20"/>
+          <w:szCs w:val="20"/>
+          <w:lang w:eastAsia="ro-RO"/>
+        </w:rPr>
+      </w:pPr>
+      <w:r>
+        <w:rPr>
+          <w:rFonts w:ascii="Times New Roman" w:eastAsia="Times New Roman" w:hAnsi="Times New Roman"/>
+          <w:sz w:val="20"/>
+          <w:szCs w:val="20"/>
+          <w:lang w:eastAsia="ro-RO"/>
+        </w:rPr>
+        <w:t>Frontend-ul aplicației stabilește o conexiune WebSocket securizată (</w:t>
+      </w:r>
+      <w:r>
+        <w:rPr>
+          <w:rFonts w:ascii="Courier New" w:eastAsia="Times New Roman" w:hAnsi="Courier New" w:cs="Courier New"/>
+          <w:sz w:val="20"/>
+          <w:szCs w:val="20"/>
+          <w:lang w:eastAsia="ro-RO"/>
+        </w:rPr>
+        <w:t>wss://</w:t>
+      </w:r>
+      <w:r>
+        <w:rPr>
+          <w:rFonts w:ascii="Times New Roman" w:eastAsia="Times New Roman" w:hAnsi="Times New Roman"/>
+          <w:sz w:val="20"/>
+          <w:szCs w:val="20"/>
+          <w:lang w:eastAsia="ro-RO"/>
+        </w:rPr>
+        <w:t>) către microserviciul de chat, facilitând trimiterea și recepționarea instantanee a mesajelor.</w:t>
+      </w:r>
+      <w:r>
+        <w:rPr>
+          <w:rFonts w:ascii="Times New Roman" w:eastAsia="Times New Roman" w:hAnsi="Times New Roman"/>
+          <w:sz w:val="20"/>
+          <w:szCs w:val="20"/>
+          <w:lang w:eastAsia="ro-RO"/>
+        </w:rPr>
+        <w:br/>
+        <w:t>Acest mecanism asigură actualizări rapide în interfața utilizatorului, precum notificări de citire a mesajelor și indicatori de scriere în timp real.</w:t>
+      </w:r>
+    </w:p>
+    <w:p>
+      <w:pPr>
+        <w:rPr>
+          <w:rFonts w:ascii="Times New Roman" w:hAnsi="Times New Roman"/>
+          <w:sz w:val="20"/>
+          <w:szCs w:val="20"/>
+        </w:rPr>
+      </w:pPr>
+    </w:p>
+    <w:p>
+      <w:pPr>
+        <w:jc w:val="center"/>
+        <w:rPr>
+          <w:rFonts w:ascii="Times New Roman" w:hAnsi="Times New Roman"/>
+          <w:b/>
+          <w:bCs/>
           <w:sz w:val="24"/>
           <w:szCs w:val="24"/>
-          <w:lang w:eastAsia="ro-RO"/>
-        </w:rPr>
-      </w:pPr>
-      <w:proofErr w:type="spellStart"/>
-      <w:r>
-        <w:rPr>
-          <w:rFonts w:ascii="Times New Roman" w:eastAsia="Times New Roman" w:hAnsi="Times New Roman"/>
+        </w:rPr>
+      </w:pPr>
+      <w:r>
+        <w:rPr>
+          <w:rFonts w:ascii="Times New Roman" w:hAnsi="Times New Roman"/>
+          <w:b/>
+          <w:bCs/>
           <w:sz w:val="24"/>
           <w:szCs w:val="24"/>
-          <w:lang w:eastAsia="ro-RO"/>
-        </w:rPr>
-        <w:t>Frontend-ul</w:t>
-      </w:r>
-      <w:proofErr w:type="spellEnd"/>
-      <w:r>
-        <w:rPr>
-          <w:rFonts w:ascii="Times New Roman" w:eastAsia="Times New Roman" w:hAnsi="Times New Roman"/>
-          <w:sz w:val="24"/>
-          <w:szCs w:val="24"/>
-          <w:lang w:eastAsia="ro-RO"/>
-        </w:rPr>
-        <w:t xml:space="preserve"> aplicației stabilește o conexiune </w:t>
-      </w:r>
-      <w:proofErr w:type="spellStart"/>
-      <w:r>
-        <w:rPr>
-          <w:rFonts w:ascii="Times New Roman" w:eastAsia="Times New Roman" w:hAnsi="Times New Roman"/>
-          <w:sz w:val="24"/>
-          <w:szCs w:val="24"/>
-          <w:lang w:eastAsia="ro-RO"/>
-        </w:rPr>
-        <w:t>WebSocket</w:t>
-      </w:r>
-      <w:proofErr w:type="spellEnd"/>
-      <w:r>
-        <w:rPr>
-          <w:rFonts w:ascii="Times New Roman" w:eastAsia="Times New Roman" w:hAnsi="Times New Roman"/>
-          <w:sz w:val="24"/>
-          <w:szCs w:val="24"/>
-          <w:lang w:eastAsia="ro-RO"/>
-        </w:rPr>
-        <w:t xml:space="preserve"> securizată (</w:t>
-      </w:r>
-      <w:r>
-        <w:rPr>
-          <w:rFonts w:ascii="Courier New" w:eastAsia="Times New Roman" w:hAnsi="Courier New" w:cs="Courier New"/>
-          <w:sz w:val="24"/>
-          <w:szCs w:val="24"/>
-          <w:lang w:eastAsia="ro-RO"/>
-        </w:rPr>
-        <w:t>wss://</w:t>
-      </w:r>
-      <w:r>
-        <w:rPr>
-          <w:rFonts w:ascii="Times New Roman" w:eastAsia="Times New Roman" w:hAnsi="Times New Roman"/>
-          <w:sz w:val="24"/>
-          <w:szCs w:val="24"/>
-          <w:lang w:eastAsia="ro-RO"/>
-        </w:rPr>
-        <w:t xml:space="preserve">) către </w:t>
-      </w:r>
-      <w:proofErr w:type="spellStart"/>
-      <w:r>
-        <w:rPr>
-          <w:rFonts w:ascii="Times New Roman" w:eastAsia="Times New Roman" w:hAnsi="Times New Roman"/>
-          <w:sz w:val="24"/>
-          <w:szCs w:val="24"/>
-          <w:lang w:eastAsia="ro-RO"/>
-        </w:rPr>
-        <w:t>microserviciul</w:t>
-      </w:r>
-      <w:proofErr w:type="spellEnd"/>
-      <w:r>
-        <w:rPr>
-          <w:rFonts w:ascii="Times New Roman" w:eastAsia="Times New Roman" w:hAnsi="Times New Roman"/>
-          <w:sz w:val="24"/>
-          <w:szCs w:val="24"/>
-          <w:lang w:eastAsia="ro-RO"/>
-        </w:rPr>
-        <w:t xml:space="preserve"> de chat, facilitând trimiterea și recepționarea instantanee a mesajelor.</w:t>
-      </w:r>
-      <w:r>
-        <w:rPr>
-          <w:rFonts w:ascii="Times New Roman" w:eastAsia="Times New Roman" w:hAnsi="Times New Roman"/>
-          <w:sz w:val="24"/>
-          <w:szCs w:val="24"/>
-          <w:lang w:eastAsia="ro-RO"/>
-        </w:rPr>
-        <w:br/>
-        <w:t>Acest mecanism asigură actualizări rapide în interfața utilizatorului, precum notificări de citire a mesajelor și indicatori de scriere în timp real.</w:t>
-      </w:r>
-    </w:p>
-    <w:p>
-      <w:pPr>
-        <w:rPr>
-          <w:rFonts w:ascii="Times New Roman" w:hAnsi="Times New Roman"/>
-          <w:sz w:val="20"/>
-          <w:szCs w:val="20"/>
-        </w:rPr>
-      </w:pPr>
-    </w:p>
-    <w:p>
-      <w:pPr>
-        <w:rPr>
-          <w:rFonts w:ascii="Times New Roman" w:hAnsi="Times New Roman"/>
-          <w:sz w:val="20"/>
-          <w:szCs w:val="20"/>
-        </w:rPr>
-      </w:pPr>
-    </w:p>
-    <w:p>
-      <w:pPr>
-        <w:rPr>
-          <w:rFonts w:ascii="Times New Roman" w:hAnsi="Times New Roman"/>
-          <w:sz w:val="20"/>
-          <w:szCs w:val="20"/>
-        </w:rPr>
-      </w:pPr>
-    </w:p>
-    <w:p>
-      <w:pPr>
-        <w:rPr>
-          <w:rFonts w:ascii="Times New Roman" w:hAnsi="Times New Roman"/>
-          <w:sz w:val="20"/>
-          <w:szCs w:val="20"/>
-        </w:rPr>
-      </w:pPr>
-    </w:p>
-    <w:p>
-      <w:pPr>
-        <w:rPr>
-          <w:rFonts w:ascii="Times New Roman" w:hAnsi="Times New Roman"/>
-          <w:sz w:val="20"/>
-          <w:szCs w:val="20"/>
-        </w:rPr>
-      </w:pPr>
-    </w:p>
-    <w:p>
-      <w:pPr>
-        <w:rPr>
-          <w:rFonts w:ascii="Times New Roman" w:hAnsi="Times New Roman"/>
-          <w:sz w:val="20"/>
-          <w:szCs w:val="20"/>
-        </w:rPr>
-      </w:pPr>
-    </w:p>
-    <w:p>
-      <w:pPr>
-        <w:rPr>
-          <w:rFonts w:ascii="Times New Roman" w:hAnsi="Times New Roman"/>
-          <w:sz w:val="20"/>
-          <w:szCs w:val="20"/>
-        </w:rPr>
-      </w:pPr>
-    </w:p>
-    <w:p>
-      <w:pPr>
-        <w:rPr>
-          <w:rFonts w:ascii="Times New Roman" w:hAnsi="Times New Roman"/>
-          <w:sz w:val="20"/>
-          <w:szCs w:val="20"/>
-        </w:rPr>
-      </w:pPr>
-    </w:p>
-    <w:p>
-      <w:pPr>
-        <w:rPr>
-          <w:rFonts w:ascii="Times New Roman" w:hAnsi="Times New Roman"/>
-          <w:sz w:val="20"/>
-          <w:szCs w:val="20"/>
-        </w:rPr>
-      </w:pPr>
-    </w:p>
-    <w:p>
-      <w:pPr>
-        <w:rPr>
-          <w:rFonts w:ascii="Times New Roman" w:hAnsi="Times New Roman"/>
-          <w:sz w:val="20"/>
-          <w:szCs w:val="20"/>
-        </w:rPr>
-      </w:pPr>
-    </w:p>
-    <w:p>
-      <w:pPr>
-        <w:rPr>
-          <w:rFonts w:ascii="Times New Roman" w:hAnsi="Times New Roman"/>
-          <w:sz w:val="20"/>
-          <w:szCs w:val="20"/>
-        </w:rPr>
-      </w:pPr>
-    </w:p>
-    <w:p>
-      <w:pPr>
-        <w:jc w:val="center"/>
-        <w:rPr>
-          <w:rFonts w:ascii="Times New Roman" w:hAnsi="Times New Roman"/>
-          <w:b/>
-          <w:bCs/>
-          <w:sz w:val="24"/>
-          <w:szCs w:val="24"/>
-        </w:rPr>
-      </w:pPr>
-      <w:r>
-        <w:rPr>
-          <w:rFonts w:ascii="Times New Roman" w:hAnsi="Times New Roman"/>
-          <w:b/>
-          <w:bCs/>
-          <w:sz w:val="24"/>
-          <w:szCs w:val="24"/>
-        </w:rPr>
-        <w:t xml:space="preserve">UML </w:t>
-      </w:r>
-      <w:proofErr w:type="spellStart"/>
-      <w:r>
-        <w:rPr>
-          <w:rFonts w:ascii="Times New Roman" w:hAnsi="Times New Roman"/>
-          <w:b/>
-          <w:bCs/>
-          <w:sz w:val="24"/>
-          <w:szCs w:val="24"/>
-        </w:rPr>
-        <w:t>Deployment</w:t>
-      </w:r>
-      <w:proofErr w:type="spellEnd"/>
-      <w:r>
-        <w:rPr>
-          <w:rFonts w:ascii="Times New Roman" w:hAnsi="Times New Roman"/>
-          <w:b/>
-          <w:bCs/>
-          <w:sz w:val="24"/>
-          <w:szCs w:val="24"/>
-        </w:rPr>
-        <w:t xml:space="preserve"> </w:t>
-      </w:r>
-      <w:proofErr w:type="spellStart"/>
-      <w:r>
-        <w:rPr>
-          <w:rFonts w:ascii="Times New Roman" w:hAnsi="Times New Roman"/>
-          <w:b/>
-          <w:bCs/>
-          <w:sz w:val="24"/>
-          <w:szCs w:val="24"/>
-        </w:rPr>
-        <w:t>Diagram</w:t>
-      </w:r>
-      <w:proofErr w:type="spellEnd"/>
+        </w:rPr>
+        <w:t>UML Deployment Diagram</w:t>
+      </w:r>
     </w:p>
     <w:p>
       <w:pPr>
@@ -3046,20 +2022,9 @@
           <w:sz w:val="28"/>
           <w:szCs w:val="28"/>
         </w:rPr>
-        <w:t xml:space="preserve">3.Cerinte </w:t>
-      </w:r>
-      <w:proofErr w:type="spellStart"/>
-      <w:r>
-        <w:rPr>
-          <w:rFonts w:ascii="Times New Roman" w:hAnsi="Times New Roman"/>
-          <w:b/>
-          <w:bCs/>
-          <w:sz w:val="28"/>
-          <w:szCs w:val="28"/>
-        </w:rPr>
-        <w:t>Functionale</w:t>
-      </w:r>
-      <w:proofErr w:type="spellEnd"/>
+        <w:lastRenderedPageBreak/>
+        <w:t>3.Cerinte Functionale</w:t>
+      </w:r>
     </w:p>
     <w:p>
       <w:pPr>
@@ -3068,16 +2033,16 @@
         <w:spacing w:before="100" w:beforeAutospacing="1" w:after="100" w:afterAutospacing="1" w:line="240" w:lineRule="auto"/>
         <w:rPr>
           <w:rFonts w:ascii="Times New Roman" w:eastAsia="Times New Roman" w:hAnsi="Times New Roman"/>
-          <w:sz w:val="24"/>
-          <w:szCs w:val="24"/>
-          <w:lang w:eastAsia="ro-RO"/>
-        </w:rPr>
-      </w:pPr>
-      <w:r>
-        <w:rPr>
-          <w:rFonts w:ascii="Times New Roman" w:eastAsia="Times New Roman" w:hAnsi="Times New Roman"/>
-          <w:sz w:val="24"/>
-          <w:szCs w:val="24"/>
+          <w:sz w:val="20"/>
+          <w:szCs w:val="20"/>
+          <w:lang w:eastAsia="ro-RO"/>
+        </w:rPr>
+      </w:pPr>
+      <w:r>
+        <w:rPr>
+          <w:rFonts w:ascii="Times New Roman" w:eastAsia="Times New Roman" w:hAnsi="Times New Roman"/>
+          <w:sz w:val="20"/>
+          <w:szCs w:val="20"/>
           <w:lang w:eastAsia="ro-RO"/>
         </w:rPr>
         <w:t>În cadrul modulului de chat al aplicației, am implementat următoarele funcționalități:</w:t>
@@ -3094,40 +2059,27 @@
         <w:spacing w:before="100" w:beforeAutospacing="1" w:after="100" w:afterAutospacing="1" w:line="240" w:lineRule="auto"/>
         <w:rPr>
           <w:rFonts w:ascii="Times New Roman" w:eastAsia="Times New Roman" w:hAnsi="Times New Roman"/>
-          <w:sz w:val="24"/>
-          <w:szCs w:val="24"/>
-          <w:lang w:eastAsia="ro-RO"/>
-        </w:rPr>
-      </w:pPr>
-      <w:r>
-        <w:rPr>
-          <w:rFonts w:ascii="Times New Roman" w:eastAsia="Times New Roman" w:hAnsi="Times New Roman"/>
-          <w:b/>
-          <w:bCs/>
-          <w:sz w:val="24"/>
-          <w:szCs w:val="24"/>
-          <w:lang w:eastAsia="ro-RO"/>
-        </w:rPr>
-        <w:t>Afișarea casetei de chat în front-</w:t>
-      </w:r>
-      <w:proofErr w:type="spellStart"/>
-      <w:r>
-        <w:rPr>
-          <w:rFonts w:ascii="Times New Roman" w:eastAsia="Times New Roman" w:hAnsi="Times New Roman"/>
-          <w:b/>
-          <w:bCs/>
-          <w:sz w:val="24"/>
-          <w:szCs w:val="24"/>
-          <w:lang w:eastAsia="ro-RO"/>
-        </w:rPr>
-        <w:t>end</w:t>
-      </w:r>
-      <w:proofErr w:type="spellEnd"/>
-      <w:r>
-        <w:rPr>
-          <w:rFonts w:ascii="Times New Roman" w:eastAsia="Times New Roman" w:hAnsi="Times New Roman"/>
-          <w:sz w:val="24"/>
-          <w:szCs w:val="24"/>
+          <w:sz w:val="20"/>
+          <w:szCs w:val="20"/>
+          <w:lang w:eastAsia="ro-RO"/>
+        </w:rPr>
+      </w:pPr>
+      <w:r>
+        <w:rPr>
+          <w:rFonts w:ascii="Times New Roman" w:eastAsia="Times New Roman" w:hAnsi="Times New Roman"/>
+          <w:b/>
+          <w:bCs/>
+          <w:sz w:val="20"/>
+          <w:szCs w:val="20"/>
+          <w:lang w:eastAsia="ro-RO"/>
+        </w:rPr>
+        <w:t>Afișarea casetei de chat în front-end</w:t>
+      </w:r>
+      <w:r>
+        <w:rPr>
+          <w:rFonts w:ascii="Times New Roman" w:eastAsia="Times New Roman" w:hAnsi="Times New Roman"/>
+          <w:sz w:val="20"/>
+          <w:szCs w:val="20"/>
           <w:lang w:eastAsia="ro-RO"/>
         </w:rPr>
         <w:t>:</w:t>
@@ -3135,8 +2087,8 @@
       <w:r>
         <w:rPr>
           <w:rFonts w:ascii="Times New Roman" w:eastAsia="Times New Roman" w:hAnsi="Times New Roman"/>
-          <w:sz w:val="24"/>
-          <w:szCs w:val="24"/>
+          <w:sz w:val="20"/>
+          <w:szCs w:val="20"/>
           <w:lang w:eastAsia="ro-RO"/>
         </w:rPr>
         <w:br/>
@@ -3154,18 +2106,18 @@
         <w:spacing w:before="100" w:beforeAutospacing="1" w:after="100" w:afterAutospacing="1" w:line="240" w:lineRule="auto"/>
         <w:rPr>
           <w:rFonts w:ascii="Times New Roman" w:eastAsia="Times New Roman" w:hAnsi="Times New Roman"/>
-          <w:sz w:val="24"/>
-          <w:szCs w:val="24"/>
-          <w:lang w:eastAsia="ro-RO"/>
-        </w:rPr>
-      </w:pPr>
-      <w:r>
-        <w:rPr>
-          <w:rFonts w:ascii="Times New Roman" w:eastAsia="Times New Roman" w:hAnsi="Times New Roman"/>
-          <w:b/>
-          <w:bCs/>
-          <w:sz w:val="24"/>
-          <w:szCs w:val="24"/>
+          <w:sz w:val="20"/>
+          <w:szCs w:val="20"/>
+          <w:lang w:eastAsia="ro-RO"/>
+        </w:rPr>
+      </w:pPr>
+      <w:r>
+        <w:rPr>
+          <w:rFonts w:ascii="Times New Roman" w:eastAsia="Times New Roman" w:hAnsi="Times New Roman"/>
+          <w:b/>
+          <w:bCs/>
+          <w:sz w:val="20"/>
+          <w:szCs w:val="20"/>
           <w:lang w:eastAsia="ro-RO"/>
         </w:rPr>
         <w:t>Trimiterea asincronă a mesajelor către administrator, împreună cu identificatorul utilizatorului</w:t>
@@ -3173,8 +2125,8 @@
       <w:r>
         <w:rPr>
           <w:rFonts w:ascii="Times New Roman" w:eastAsia="Times New Roman" w:hAnsi="Times New Roman"/>
-          <w:sz w:val="24"/>
-          <w:szCs w:val="24"/>
+          <w:sz w:val="20"/>
+          <w:szCs w:val="20"/>
           <w:lang w:eastAsia="ro-RO"/>
         </w:rPr>
         <w:t>:</w:t>
@@ -3182,8 +2134,8 @@
       <w:r>
         <w:rPr>
           <w:rFonts w:ascii="Times New Roman" w:eastAsia="Times New Roman" w:hAnsi="Times New Roman"/>
-          <w:sz w:val="24"/>
-          <w:szCs w:val="24"/>
+          <w:sz w:val="20"/>
+          <w:szCs w:val="20"/>
           <w:lang w:eastAsia="ro-RO"/>
         </w:rPr>
         <w:br/>
@@ -3201,18 +2153,18 @@
         <w:spacing w:before="100" w:beforeAutospacing="1" w:after="100" w:afterAutospacing="1" w:line="240" w:lineRule="auto"/>
         <w:rPr>
           <w:rFonts w:ascii="Times New Roman" w:eastAsia="Times New Roman" w:hAnsi="Times New Roman"/>
-          <w:sz w:val="24"/>
-          <w:szCs w:val="24"/>
-          <w:lang w:eastAsia="ro-RO"/>
-        </w:rPr>
-      </w:pPr>
-      <w:r>
-        <w:rPr>
-          <w:rFonts w:ascii="Times New Roman" w:eastAsia="Times New Roman" w:hAnsi="Times New Roman"/>
-          <w:b/>
-          <w:bCs/>
-          <w:sz w:val="24"/>
-          <w:szCs w:val="24"/>
+          <w:sz w:val="20"/>
+          <w:szCs w:val="20"/>
+          <w:lang w:eastAsia="ro-RO"/>
+        </w:rPr>
+      </w:pPr>
+      <w:r>
+        <w:rPr>
+          <w:rFonts w:ascii="Times New Roman" w:eastAsia="Times New Roman" w:hAnsi="Times New Roman"/>
+          <w:b/>
+          <w:bCs/>
+          <w:sz w:val="20"/>
+          <w:szCs w:val="20"/>
           <w:lang w:eastAsia="ro-RO"/>
         </w:rPr>
         <w:t>Comunicare bidirecțională între utilizator și administrator</w:t>
@@ -3220,8 +2172,8 @@
       <w:r>
         <w:rPr>
           <w:rFonts w:ascii="Times New Roman" w:eastAsia="Times New Roman" w:hAnsi="Times New Roman"/>
-          <w:sz w:val="24"/>
-          <w:szCs w:val="24"/>
+          <w:sz w:val="20"/>
+          <w:szCs w:val="20"/>
           <w:lang w:eastAsia="ro-RO"/>
         </w:rPr>
         <w:t>:</w:t>
@@ -3229,8 +2181,8 @@
       <w:r>
         <w:rPr>
           <w:rFonts w:ascii="Times New Roman" w:eastAsia="Times New Roman" w:hAnsi="Times New Roman"/>
-          <w:sz w:val="24"/>
-          <w:szCs w:val="24"/>
+          <w:sz w:val="20"/>
+          <w:szCs w:val="20"/>
           <w:lang w:eastAsia="ro-RO"/>
         </w:rPr>
         <w:br/>
@@ -3248,18 +2200,18 @@
         <w:spacing w:before="100" w:beforeAutospacing="1" w:after="100" w:afterAutospacing="1" w:line="240" w:lineRule="auto"/>
         <w:rPr>
           <w:rFonts w:ascii="Times New Roman" w:eastAsia="Times New Roman" w:hAnsi="Times New Roman"/>
-          <w:sz w:val="24"/>
-          <w:szCs w:val="24"/>
-          <w:lang w:eastAsia="ro-RO"/>
-        </w:rPr>
-      </w:pPr>
-      <w:r>
-        <w:rPr>
-          <w:rFonts w:ascii="Times New Roman" w:eastAsia="Times New Roman" w:hAnsi="Times New Roman"/>
-          <w:b/>
-          <w:bCs/>
-          <w:sz w:val="24"/>
-          <w:szCs w:val="24"/>
+          <w:sz w:val="20"/>
+          <w:szCs w:val="20"/>
+          <w:lang w:eastAsia="ro-RO"/>
+        </w:rPr>
+      </w:pPr>
+      <w:r>
+        <w:rPr>
+          <w:rFonts w:ascii="Times New Roman" w:eastAsia="Times New Roman" w:hAnsi="Times New Roman"/>
+          <w:b/>
+          <w:bCs/>
+          <w:sz w:val="20"/>
+          <w:szCs w:val="20"/>
           <w:lang w:eastAsia="ro-RO"/>
         </w:rPr>
         <w:t>Notificări de citire a mesajelor</w:t>
@@ -3267,8 +2219,8 @@
       <w:r>
         <w:rPr>
           <w:rFonts w:ascii="Times New Roman" w:eastAsia="Times New Roman" w:hAnsi="Times New Roman"/>
-          <w:sz w:val="24"/>
-          <w:szCs w:val="24"/>
+          <w:sz w:val="20"/>
+          <w:szCs w:val="20"/>
           <w:lang w:eastAsia="ro-RO"/>
         </w:rPr>
         <w:t>:</w:t>
@@ -3276,8 +2228,8 @@
       <w:r>
         <w:rPr>
           <w:rFonts w:ascii="Times New Roman" w:eastAsia="Times New Roman" w:hAnsi="Times New Roman"/>
-          <w:sz w:val="24"/>
-          <w:szCs w:val="24"/>
+          <w:sz w:val="20"/>
+          <w:szCs w:val="20"/>
           <w:lang w:eastAsia="ro-RO"/>
         </w:rPr>
         <w:br/>
@@ -3295,51 +2247,27 @@
         <w:spacing w:before="100" w:beforeAutospacing="1" w:after="100" w:afterAutospacing="1" w:line="240" w:lineRule="auto"/>
         <w:rPr>
           <w:rFonts w:ascii="Times New Roman" w:eastAsia="Times New Roman" w:hAnsi="Times New Roman"/>
-          <w:sz w:val="24"/>
-          <w:szCs w:val="24"/>
-          <w:lang w:eastAsia="ro-RO"/>
-        </w:rPr>
-      </w:pPr>
-      <w:r>
-        <w:rPr>
-          <w:rFonts w:ascii="Times New Roman" w:eastAsia="Times New Roman" w:hAnsi="Times New Roman"/>
-          <w:b/>
-          <w:bCs/>
-          <w:sz w:val="24"/>
-          <w:szCs w:val="24"/>
-          <w:lang w:eastAsia="ro-RO"/>
-        </w:rPr>
-        <w:t>Indicator de scriere (</w:t>
-      </w:r>
-      <w:proofErr w:type="spellStart"/>
-      <w:r>
-        <w:rPr>
-          <w:rFonts w:ascii="Times New Roman" w:eastAsia="Times New Roman" w:hAnsi="Times New Roman"/>
-          <w:b/>
-          <w:bCs/>
-          <w:sz w:val="24"/>
-          <w:szCs w:val="24"/>
-          <w:lang w:eastAsia="ro-RO"/>
-        </w:rPr>
-        <w:t>Typing</w:t>
-      </w:r>
-      <w:proofErr w:type="spellEnd"/>
-      <w:r>
-        <w:rPr>
-          <w:rFonts w:ascii="Times New Roman" w:eastAsia="Times New Roman" w:hAnsi="Times New Roman"/>
-          <w:b/>
-          <w:bCs/>
-          <w:sz w:val="24"/>
-          <w:szCs w:val="24"/>
-          <w:lang w:eastAsia="ro-RO"/>
-        </w:rPr>
-        <w:t xml:space="preserve"> Indicator)</w:t>
-      </w:r>
-      <w:r>
-        <w:rPr>
-          <w:rFonts w:ascii="Times New Roman" w:eastAsia="Times New Roman" w:hAnsi="Times New Roman"/>
-          <w:sz w:val="24"/>
-          <w:szCs w:val="24"/>
+          <w:sz w:val="20"/>
+          <w:szCs w:val="20"/>
+          <w:lang w:eastAsia="ro-RO"/>
+        </w:rPr>
+      </w:pPr>
+      <w:r>
+        <w:rPr>
+          <w:rFonts w:ascii="Times New Roman" w:eastAsia="Times New Roman" w:hAnsi="Times New Roman"/>
+          <w:b/>
+          <w:bCs/>
+          <w:sz w:val="20"/>
+          <w:szCs w:val="20"/>
+          <w:lang w:eastAsia="ro-RO"/>
+        </w:rPr>
+        <w:t>Indicator de scriere (Typing Indicator)</w:t>
+      </w:r>
+      <w:r>
+        <w:rPr>
+          <w:rFonts w:ascii="Times New Roman" w:eastAsia="Times New Roman" w:hAnsi="Times New Roman"/>
+          <w:sz w:val="20"/>
+          <w:szCs w:val="20"/>
           <w:lang w:eastAsia="ro-RO"/>
         </w:rPr>
         <w:t>:</w:t>
@@ -3347,31 +2275,13 @@
       <w:r>
         <w:rPr>
           <w:rFonts w:ascii="Times New Roman" w:eastAsia="Times New Roman" w:hAnsi="Times New Roman"/>
-          <w:sz w:val="24"/>
-          <w:szCs w:val="24"/>
+          <w:sz w:val="20"/>
+          <w:szCs w:val="20"/>
           <w:lang w:eastAsia="ro-RO"/>
         </w:rPr>
         <w:br/>
         <w:t>Utilizatorii și administratorii sunt notificați în timp real atunci când interlocutorul tastează un mesaj.</w:t>
       </w:r>
-    </w:p>
-    <w:p>
-      <w:pPr>
-        <w:rPr>
-          <w:rFonts w:ascii="Times New Roman" w:hAnsi="Times New Roman"/>
-          <w:sz w:val="20"/>
-          <w:szCs w:val="20"/>
-        </w:rPr>
-      </w:pPr>
-    </w:p>
-    <w:p>
-      <w:pPr>
-        <w:rPr>
-          <w:rFonts w:ascii="Times New Roman" w:eastAsia="Times New Roman" w:hAnsi="Times New Roman"/>
-          <w:sz w:val="20"/>
-          <w:szCs w:val="20"/>
-        </w:rPr>
-      </w:pPr>
     </w:p>
     <w:p>
       <w:pPr>
@@ -3399,7 +2309,7 @@
           <w:szCs w:val="20"/>
           <w:lang w:eastAsia="ro-RO"/>
         </w:rPr>
-        <w:t>4.</w:t>
+        <w:t>4</w:t>
       </w:r>
       <w:r>
         <w:rPr>
@@ -3411,33 +2321,7 @@
           <w:szCs w:val="28"/>
           <w:lang w:eastAsia="ro-RO"/>
         </w:rPr>
-        <w:t xml:space="preserve">Componenta </w:t>
-      </w:r>
-      <w:proofErr w:type="spellStart"/>
-      <w:r>
-        <w:rPr>
-          <w:rFonts w:ascii="Times New Roman" w:eastAsia="Times New Roman" w:hAnsi="Times New Roman"/>
-          <w:b/>
-          <w:bCs/>
-          <w:kern w:val="36"/>
-          <w:sz w:val="28"/>
-          <w:szCs w:val="28"/>
-          <w:lang w:eastAsia="ro-RO"/>
-        </w:rPr>
-        <w:t>Microserviciu</w:t>
-      </w:r>
-      <w:proofErr w:type="spellEnd"/>
-      <w:r>
-        <w:rPr>
-          <w:rFonts w:ascii="Times New Roman" w:eastAsia="Times New Roman" w:hAnsi="Times New Roman"/>
-          <w:b/>
-          <w:bCs/>
-          <w:kern w:val="36"/>
-          <w:sz w:val="28"/>
-          <w:szCs w:val="28"/>
-          <w:lang w:eastAsia="ro-RO"/>
-        </w:rPr>
-        <w:t xml:space="preserve"> Chat</w:t>
+        <w:t>.Componenta Microserviciu Chat</w:t>
       </w:r>
     </w:p>
     <w:p>
@@ -3447,100 +2331,29 @@
         <w:spacing w:before="100" w:beforeAutospacing="1" w:after="100" w:afterAutospacing="1" w:line="240" w:lineRule="auto"/>
         <w:rPr>
           <w:rFonts w:ascii="Times New Roman" w:eastAsia="Times New Roman" w:hAnsi="Times New Roman"/>
-          <w:sz w:val="24"/>
-          <w:szCs w:val="24"/>
-          <w:lang w:eastAsia="ro-RO"/>
-        </w:rPr>
-      </w:pPr>
-      <w:proofErr w:type="spellStart"/>
-      <w:r>
-        <w:rPr>
-          <w:rFonts w:ascii="Times New Roman" w:eastAsia="Times New Roman" w:hAnsi="Times New Roman"/>
-          <w:sz w:val="24"/>
-          <w:szCs w:val="24"/>
-          <w:lang w:eastAsia="ro-RO"/>
-        </w:rPr>
-        <w:t>Microserviciul</w:t>
-      </w:r>
-      <w:proofErr w:type="spellEnd"/>
-      <w:r>
-        <w:rPr>
-          <w:rFonts w:ascii="Times New Roman" w:eastAsia="Times New Roman" w:hAnsi="Times New Roman"/>
-          <w:sz w:val="24"/>
-          <w:szCs w:val="24"/>
-          <w:lang w:eastAsia="ro-RO"/>
-        </w:rPr>
-        <w:t xml:space="preserve"> de Chat este o componentă esențială a sistemului, responsabilă de gestionarea comunicării în timp real între utilizatori și administratori.</w:t>
-      </w:r>
-      <w:r>
-        <w:rPr>
-          <w:rFonts w:ascii="Times New Roman" w:eastAsia="Times New Roman" w:hAnsi="Times New Roman"/>
-          <w:sz w:val="24"/>
-          <w:szCs w:val="24"/>
+          <w:sz w:val="20"/>
+          <w:szCs w:val="20"/>
+          <w:lang w:eastAsia="ro-RO"/>
+        </w:rPr>
+      </w:pPr>
+      <w:r>
+        <w:rPr>
+          <w:rFonts w:ascii="Times New Roman" w:eastAsia="Times New Roman" w:hAnsi="Times New Roman"/>
+          <w:sz w:val="20"/>
+          <w:szCs w:val="20"/>
+          <w:lang w:eastAsia="ro-RO"/>
+        </w:rPr>
+        <w:t>Microserviciul de Chat este o componentă esențială a sistemului, responsabilă de gestionarea comunicării în timp real între utilizatori și administratori.</w:t>
+      </w:r>
+      <w:r>
+        <w:rPr>
+          <w:rFonts w:ascii="Times New Roman" w:eastAsia="Times New Roman" w:hAnsi="Times New Roman"/>
+          <w:sz w:val="20"/>
+          <w:szCs w:val="20"/>
           <w:lang w:eastAsia="ro-RO"/>
         </w:rPr>
         <w:br/>
-        <w:t xml:space="preserve">Acesta este implementat ca o aplicație separată, construită în Java utilizând </w:t>
-      </w:r>
-      <w:proofErr w:type="spellStart"/>
-      <w:r>
-        <w:rPr>
-          <w:rFonts w:ascii="Times New Roman" w:eastAsia="Times New Roman" w:hAnsi="Times New Roman"/>
-          <w:sz w:val="24"/>
-          <w:szCs w:val="24"/>
-          <w:lang w:eastAsia="ro-RO"/>
-        </w:rPr>
-        <w:t>framework-ul</w:t>
-      </w:r>
-      <w:proofErr w:type="spellEnd"/>
-      <w:r>
-        <w:rPr>
-          <w:rFonts w:ascii="Times New Roman" w:eastAsia="Times New Roman" w:hAnsi="Times New Roman"/>
-          <w:sz w:val="24"/>
-          <w:szCs w:val="24"/>
-          <w:lang w:eastAsia="ro-RO"/>
-        </w:rPr>
-        <w:t xml:space="preserve"> </w:t>
-      </w:r>
-      <w:proofErr w:type="spellStart"/>
-      <w:r>
-        <w:rPr>
-          <w:rFonts w:ascii="Times New Roman" w:eastAsia="Times New Roman" w:hAnsi="Times New Roman"/>
-          <w:sz w:val="24"/>
-          <w:szCs w:val="24"/>
-          <w:lang w:eastAsia="ro-RO"/>
-        </w:rPr>
-        <w:t>Spring</w:t>
-      </w:r>
-      <w:proofErr w:type="spellEnd"/>
-      <w:r>
-        <w:rPr>
-          <w:rFonts w:ascii="Times New Roman" w:eastAsia="Times New Roman" w:hAnsi="Times New Roman"/>
-          <w:sz w:val="24"/>
-          <w:szCs w:val="24"/>
-          <w:lang w:eastAsia="ro-RO"/>
-        </w:rPr>
-        <w:t xml:space="preserve"> Boot și folosind tehnologia </w:t>
-      </w:r>
-      <w:proofErr w:type="spellStart"/>
-      <w:r>
-        <w:rPr>
-          <w:rFonts w:ascii="Times New Roman" w:eastAsia="Times New Roman" w:hAnsi="Times New Roman"/>
-          <w:sz w:val="24"/>
-          <w:szCs w:val="24"/>
-          <w:lang w:eastAsia="ro-RO"/>
-        </w:rPr>
-        <w:t>WebSocket</w:t>
-      </w:r>
-      <w:proofErr w:type="spellEnd"/>
-      <w:r>
-        <w:rPr>
-          <w:rFonts w:ascii="Times New Roman" w:eastAsia="Times New Roman" w:hAnsi="Times New Roman"/>
-          <w:sz w:val="24"/>
-          <w:szCs w:val="24"/>
-          <w:lang w:eastAsia="ro-RO"/>
-        </w:rPr>
-        <w:t xml:space="preserve"> pentru schimbul de mesaje bidirecțional, cu latență redusă.</w:t>
+        <w:t>Acesta este implementat ca o aplicație separată, construită în Java utilizând framework-ul Spring Boot și folosind tehnologia WebSocket pentru schimbul de mesaje bidirecțional, cu latență redusă.</w:t>
       </w:r>
     </w:p>
     <w:p>
@@ -3550,39 +2363,19 @@
         <w:spacing w:before="100" w:beforeAutospacing="1" w:after="100" w:afterAutospacing="1" w:line="240" w:lineRule="auto"/>
         <w:rPr>
           <w:rFonts w:ascii="Times New Roman" w:eastAsia="Times New Roman" w:hAnsi="Times New Roman"/>
-          <w:sz w:val="24"/>
-          <w:szCs w:val="24"/>
-          <w:lang w:eastAsia="ro-RO"/>
-        </w:rPr>
-      </w:pPr>
-      <w:r>
-        <w:rPr>
-          <w:rFonts w:ascii="Times New Roman" w:eastAsia="Times New Roman" w:hAnsi="Times New Roman"/>
-          <w:sz w:val="24"/>
-          <w:szCs w:val="24"/>
-          <w:lang w:eastAsia="ro-RO"/>
-        </w:rPr>
-        <w:t xml:space="preserve">Funcționalități principale ale </w:t>
-      </w:r>
-      <w:proofErr w:type="spellStart"/>
-      <w:r>
-        <w:rPr>
-          <w:rFonts w:ascii="Times New Roman" w:eastAsia="Times New Roman" w:hAnsi="Times New Roman"/>
-          <w:sz w:val="24"/>
-          <w:szCs w:val="24"/>
-          <w:lang w:eastAsia="ro-RO"/>
-        </w:rPr>
-        <w:t>microserviciului</w:t>
-      </w:r>
-      <w:proofErr w:type="spellEnd"/>
-      <w:r>
-        <w:rPr>
-          <w:rFonts w:ascii="Times New Roman" w:eastAsia="Times New Roman" w:hAnsi="Times New Roman"/>
-          <w:sz w:val="24"/>
-          <w:szCs w:val="24"/>
-          <w:lang w:eastAsia="ro-RO"/>
-        </w:rPr>
-        <w:t>:</w:t>
+          <w:sz w:val="20"/>
+          <w:szCs w:val="20"/>
+          <w:lang w:eastAsia="ro-RO"/>
+        </w:rPr>
+      </w:pPr>
+      <w:r>
+        <w:rPr>
+          <w:rFonts w:ascii="Times New Roman" w:eastAsia="Times New Roman" w:hAnsi="Times New Roman"/>
+          <w:sz w:val="20"/>
+          <w:szCs w:val="20"/>
+          <w:lang w:eastAsia="ro-RO"/>
+        </w:rPr>
+        <w:t>Funcționalități principale ale microserviciului:</w:t>
       </w:r>
     </w:p>
     <w:p>
@@ -3596,63 +2389,30 @@
         <w:spacing w:before="100" w:beforeAutospacing="1" w:after="100" w:afterAutospacing="1" w:line="240" w:lineRule="auto"/>
         <w:rPr>
           <w:rFonts w:ascii="Times New Roman" w:eastAsia="Times New Roman" w:hAnsi="Times New Roman"/>
-          <w:sz w:val="24"/>
-          <w:szCs w:val="24"/>
-          <w:lang w:eastAsia="ro-RO"/>
-        </w:rPr>
-      </w:pPr>
-      <w:r>
-        <w:rPr>
-          <w:rFonts w:ascii="Times New Roman" w:eastAsia="Times New Roman" w:hAnsi="Times New Roman"/>
-          <w:b/>
-          <w:bCs/>
-          <w:sz w:val="24"/>
-          <w:szCs w:val="24"/>
-          <w:lang w:eastAsia="ro-RO"/>
-        </w:rPr>
-        <w:t xml:space="preserve">Gestionarea conexiunilor </w:t>
-      </w:r>
-      <w:proofErr w:type="spellStart"/>
-      <w:r>
-        <w:rPr>
-          <w:rFonts w:ascii="Times New Roman" w:eastAsia="Times New Roman" w:hAnsi="Times New Roman"/>
-          <w:b/>
-          <w:bCs/>
-          <w:sz w:val="24"/>
-          <w:szCs w:val="24"/>
-          <w:lang w:eastAsia="ro-RO"/>
-        </w:rPr>
-        <w:t>WebSocket</w:t>
-      </w:r>
-      <w:proofErr w:type="spellEnd"/>
-      <w:r>
-        <w:rPr>
-          <w:rFonts w:ascii="Times New Roman" w:eastAsia="Times New Roman" w:hAnsi="Times New Roman"/>
-          <w:sz w:val="24"/>
-          <w:szCs w:val="24"/>
-          <w:lang w:eastAsia="ro-RO"/>
-        </w:rPr>
-        <w:t>: Permite stabilirea unei conexiuni persistente între client (</w:t>
-      </w:r>
-      <w:proofErr w:type="spellStart"/>
-      <w:r>
-        <w:rPr>
-          <w:rFonts w:ascii="Times New Roman" w:eastAsia="Times New Roman" w:hAnsi="Times New Roman"/>
-          <w:sz w:val="24"/>
-          <w:szCs w:val="24"/>
-          <w:lang w:eastAsia="ro-RO"/>
-        </w:rPr>
-        <w:t>frontend</w:t>
-      </w:r>
-      <w:proofErr w:type="spellEnd"/>
-      <w:r>
-        <w:rPr>
-          <w:rFonts w:ascii="Times New Roman" w:eastAsia="Times New Roman" w:hAnsi="Times New Roman"/>
-          <w:sz w:val="24"/>
-          <w:szCs w:val="24"/>
-          <w:lang w:eastAsia="ro-RO"/>
-        </w:rPr>
-        <w:t>) și server pentru transmiterea rapidă a mesajelor.</w:t>
+          <w:sz w:val="20"/>
+          <w:szCs w:val="20"/>
+          <w:lang w:eastAsia="ro-RO"/>
+        </w:rPr>
+      </w:pPr>
+      <w:r>
+        <w:rPr>
+          <w:rFonts w:ascii="Times New Roman" w:eastAsia="Times New Roman" w:hAnsi="Times New Roman"/>
+          <w:b/>
+          <w:bCs/>
+          <w:sz w:val="20"/>
+          <w:szCs w:val="20"/>
+          <w:lang w:eastAsia="ro-RO"/>
+        </w:rPr>
+        <w:t>Gestionarea conexiunilor WebSocket</w:t>
+      </w:r>
+      <w:r>
+        <w:rPr>
+          <w:rFonts w:ascii="Times New Roman" w:eastAsia="Times New Roman" w:hAnsi="Times New Roman"/>
+          <w:sz w:val="20"/>
+          <w:szCs w:val="20"/>
+          <w:lang w:eastAsia="ro-RO"/>
+        </w:rPr>
+        <w:t>: Permite stabilirea unei conexiuni persistente între client (frontend) și server pentru transmiterea rapidă a mesajelor.</w:t>
       </w:r>
     </w:p>
     <w:p>
@@ -3666,18 +2426,18 @@
         <w:spacing w:before="100" w:beforeAutospacing="1" w:after="100" w:afterAutospacing="1" w:line="240" w:lineRule="auto"/>
         <w:rPr>
           <w:rFonts w:ascii="Times New Roman" w:eastAsia="Times New Roman" w:hAnsi="Times New Roman"/>
-          <w:sz w:val="24"/>
-          <w:szCs w:val="24"/>
-          <w:lang w:eastAsia="ro-RO"/>
-        </w:rPr>
-      </w:pPr>
-      <w:r>
-        <w:rPr>
-          <w:rFonts w:ascii="Times New Roman" w:eastAsia="Times New Roman" w:hAnsi="Times New Roman"/>
-          <w:b/>
-          <w:bCs/>
-          <w:sz w:val="24"/>
-          <w:szCs w:val="24"/>
+          <w:sz w:val="20"/>
+          <w:szCs w:val="20"/>
+          <w:lang w:eastAsia="ro-RO"/>
+        </w:rPr>
+      </w:pPr>
+      <w:r>
+        <w:rPr>
+          <w:rFonts w:ascii="Times New Roman" w:eastAsia="Times New Roman" w:hAnsi="Times New Roman"/>
+          <w:b/>
+          <w:bCs/>
+          <w:sz w:val="20"/>
+          <w:szCs w:val="20"/>
           <w:lang w:eastAsia="ro-RO"/>
         </w:rPr>
         <w:t>Trimiterea și recepționarea mesajelor</w:t>
@@ -3685,8 +2445,8 @@
       <w:r>
         <w:rPr>
           <w:rFonts w:ascii="Times New Roman" w:eastAsia="Times New Roman" w:hAnsi="Times New Roman"/>
-          <w:sz w:val="24"/>
-          <w:szCs w:val="24"/>
+          <w:sz w:val="20"/>
+          <w:szCs w:val="20"/>
           <w:lang w:eastAsia="ro-RO"/>
         </w:rPr>
         <w:t>: Asigură schimbul de mesaje între utilizatori și administratori, facilitând o comunicare fluentă în cadrul unei sesiuni de chat.</w:t>
@@ -3703,18 +2463,18 @@
         <w:spacing w:before="100" w:beforeAutospacing="1" w:after="100" w:afterAutospacing="1" w:line="240" w:lineRule="auto"/>
         <w:rPr>
           <w:rFonts w:ascii="Times New Roman" w:eastAsia="Times New Roman" w:hAnsi="Times New Roman"/>
-          <w:sz w:val="24"/>
-          <w:szCs w:val="24"/>
-          <w:lang w:eastAsia="ro-RO"/>
-        </w:rPr>
-      </w:pPr>
-      <w:r>
-        <w:rPr>
-          <w:rFonts w:ascii="Times New Roman" w:eastAsia="Times New Roman" w:hAnsi="Times New Roman"/>
-          <w:b/>
-          <w:bCs/>
-          <w:sz w:val="24"/>
-          <w:szCs w:val="24"/>
+          <w:sz w:val="20"/>
+          <w:szCs w:val="20"/>
+          <w:lang w:eastAsia="ro-RO"/>
+        </w:rPr>
+      </w:pPr>
+      <w:r>
+        <w:rPr>
+          <w:rFonts w:ascii="Times New Roman" w:eastAsia="Times New Roman" w:hAnsi="Times New Roman"/>
+          <w:b/>
+          <w:bCs/>
+          <w:sz w:val="20"/>
+          <w:szCs w:val="20"/>
           <w:lang w:eastAsia="ro-RO"/>
         </w:rPr>
         <w:t>Notificări de tip "citit"</w:t>
@@ -3722,8 +2482,8 @@
       <w:r>
         <w:rPr>
           <w:rFonts w:ascii="Times New Roman" w:eastAsia="Times New Roman" w:hAnsi="Times New Roman"/>
-          <w:sz w:val="24"/>
-          <w:szCs w:val="24"/>
+          <w:sz w:val="20"/>
+          <w:szCs w:val="20"/>
           <w:lang w:eastAsia="ro-RO"/>
         </w:rPr>
         <w:t>: Notifică interlocutorii atunci când mesajele au fost vizualizate.</w:t>
@@ -3740,18 +2500,18 @@
         <w:spacing w:before="100" w:beforeAutospacing="1" w:after="100" w:afterAutospacing="1" w:line="240" w:lineRule="auto"/>
         <w:rPr>
           <w:rFonts w:ascii="Times New Roman" w:eastAsia="Times New Roman" w:hAnsi="Times New Roman"/>
-          <w:sz w:val="24"/>
-          <w:szCs w:val="24"/>
-          <w:lang w:eastAsia="ro-RO"/>
-        </w:rPr>
-      </w:pPr>
-      <w:r>
-        <w:rPr>
-          <w:rFonts w:ascii="Times New Roman" w:eastAsia="Times New Roman" w:hAnsi="Times New Roman"/>
-          <w:b/>
-          <w:bCs/>
-          <w:sz w:val="24"/>
-          <w:szCs w:val="24"/>
+          <w:sz w:val="20"/>
+          <w:szCs w:val="20"/>
+          <w:lang w:eastAsia="ro-RO"/>
+        </w:rPr>
+      </w:pPr>
+      <w:r>
+        <w:rPr>
+          <w:rFonts w:ascii="Times New Roman" w:eastAsia="Times New Roman" w:hAnsi="Times New Roman"/>
+          <w:b/>
+          <w:bCs/>
+          <w:sz w:val="20"/>
+          <w:szCs w:val="20"/>
           <w:lang w:eastAsia="ro-RO"/>
         </w:rPr>
         <w:t>Indicator de tastare</w:t>
@@ -3759,8 +2519,8 @@
       <w:r>
         <w:rPr>
           <w:rFonts w:ascii="Times New Roman" w:eastAsia="Times New Roman" w:hAnsi="Times New Roman"/>
-          <w:sz w:val="24"/>
-          <w:szCs w:val="24"/>
+          <w:sz w:val="20"/>
+          <w:szCs w:val="20"/>
           <w:lang w:eastAsia="ro-RO"/>
         </w:rPr>
         <w:t>: Afișează notificări în timp real atunci când interlocutorul tastează un mesaj.</w:t>
@@ -3777,18 +2537,18 @@
         <w:spacing w:before="100" w:beforeAutospacing="1" w:after="100" w:afterAutospacing="1" w:line="240" w:lineRule="auto"/>
         <w:rPr>
           <w:rFonts w:ascii="Times New Roman" w:eastAsia="Times New Roman" w:hAnsi="Times New Roman"/>
-          <w:sz w:val="24"/>
-          <w:szCs w:val="24"/>
-          <w:lang w:eastAsia="ro-RO"/>
-        </w:rPr>
-      </w:pPr>
-      <w:r>
-        <w:rPr>
-          <w:rFonts w:ascii="Times New Roman" w:eastAsia="Times New Roman" w:hAnsi="Times New Roman"/>
-          <w:b/>
-          <w:bCs/>
-          <w:sz w:val="24"/>
-          <w:szCs w:val="24"/>
+          <w:sz w:val="20"/>
+          <w:szCs w:val="20"/>
+          <w:lang w:eastAsia="ro-RO"/>
+        </w:rPr>
+      </w:pPr>
+      <w:r>
+        <w:rPr>
+          <w:rFonts w:ascii="Times New Roman" w:eastAsia="Times New Roman" w:hAnsi="Times New Roman"/>
+          <w:b/>
+          <w:bCs/>
+          <w:sz w:val="20"/>
+          <w:szCs w:val="20"/>
           <w:lang w:eastAsia="ro-RO"/>
         </w:rPr>
         <w:t>Identificarea utilizatorilor</w:t>
@@ -3796,8 +2556,8 @@
       <w:r>
         <w:rPr>
           <w:rFonts w:ascii="Times New Roman" w:eastAsia="Times New Roman" w:hAnsi="Times New Roman"/>
-          <w:sz w:val="24"/>
-          <w:szCs w:val="24"/>
+          <w:sz w:val="20"/>
+          <w:szCs w:val="20"/>
           <w:lang w:eastAsia="ro-RO"/>
         </w:rPr>
         <w:t>: Fiecare mesaj transmis este asociat cu un identificator unic al utilizatorului, permițând corelarea corectă a mesajelor în sesiune.</w:t>
@@ -3810,90 +2570,19 @@
         <w:spacing w:before="100" w:beforeAutospacing="1" w:after="100" w:afterAutospacing="1" w:line="240" w:lineRule="auto"/>
         <w:rPr>
           <w:rFonts w:ascii="Times New Roman" w:eastAsia="Times New Roman" w:hAnsi="Times New Roman"/>
-          <w:sz w:val="24"/>
-          <w:szCs w:val="24"/>
-          <w:lang w:eastAsia="ro-RO"/>
-        </w:rPr>
-      </w:pPr>
-      <w:proofErr w:type="spellStart"/>
-      <w:r>
-        <w:rPr>
-          <w:rFonts w:ascii="Times New Roman" w:eastAsia="Times New Roman" w:hAnsi="Times New Roman"/>
-          <w:sz w:val="24"/>
-          <w:szCs w:val="24"/>
-          <w:lang w:eastAsia="ro-RO"/>
-        </w:rPr>
-        <w:t>Microserviciul</w:t>
-      </w:r>
-      <w:proofErr w:type="spellEnd"/>
-      <w:r>
-        <w:rPr>
-          <w:rFonts w:ascii="Times New Roman" w:eastAsia="Times New Roman" w:hAnsi="Times New Roman"/>
-          <w:sz w:val="24"/>
-          <w:szCs w:val="24"/>
-          <w:lang w:eastAsia="ro-RO"/>
-        </w:rPr>
-        <w:t xml:space="preserve"> de Chat este independent față de celelalte componente ale sistemului, comunicând direct cu aplicația </w:t>
-      </w:r>
-      <w:proofErr w:type="spellStart"/>
-      <w:r>
-        <w:rPr>
-          <w:rFonts w:ascii="Times New Roman" w:eastAsia="Times New Roman" w:hAnsi="Times New Roman"/>
-          <w:sz w:val="24"/>
-          <w:szCs w:val="24"/>
-          <w:lang w:eastAsia="ro-RO"/>
-        </w:rPr>
-        <w:t>frontend</w:t>
-      </w:r>
-      <w:proofErr w:type="spellEnd"/>
-      <w:r>
-        <w:rPr>
-          <w:rFonts w:ascii="Times New Roman" w:eastAsia="Times New Roman" w:hAnsi="Times New Roman"/>
-          <w:sz w:val="24"/>
-          <w:szCs w:val="24"/>
-          <w:lang w:eastAsia="ro-RO"/>
-        </w:rPr>
-        <w:t xml:space="preserve"> prin </w:t>
-      </w:r>
-      <w:proofErr w:type="spellStart"/>
-      <w:r>
-        <w:rPr>
-          <w:rFonts w:ascii="Times New Roman" w:eastAsia="Times New Roman" w:hAnsi="Times New Roman"/>
-          <w:sz w:val="24"/>
-          <w:szCs w:val="24"/>
-          <w:lang w:eastAsia="ro-RO"/>
-        </w:rPr>
-        <w:t>WebSocket</w:t>
-      </w:r>
-      <w:proofErr w:type="spellEnd"/>
-      <w:r>
-        <w:rPr>
-          <w:rFonts w:ascii="Times New Roman" w:eastAsia="Times New Roman" w:hAnsi="Times New Roman"/>
-          <w:sz w:val="24"/>
-          <w:szCs w:val="24"/>
-          <w:lang w:eastAsia="ro-RO"/>
-        </w:rPr>
-        <w:t xml:space="preserve">, fără a interacționa cu bazele de date sau alte </w:t>
-      </w:r>
-      <w:proofErr w:type="spellStart"/>
-      <w:r>
-        <w:rPr>
-          <w:rFonts w:ascii="Times New Roman" w:eastAsia="Times New Roman" w:hAnsi="Times New Roman"/>
-          <w:sz w:val="24"/>
-          <w:szCs w:val="24"/>
-          <w:lang w:eastAsia="ro-RO"/>
-        </w:rPr>
-        <w:t>microservicii</w:t>
-      </w:r>
-      <w:proofErr w:type="spellEnd"/>
-      <w:r>
-        <w:rPr>
-          <w:rFonts w:ascii="Times New Roman" w:eastAsia="Times New Roman" w:hAnsi="Times New Roman"/>
-          <w:sz w:val="24"/>
-          <w:szCs w:val="24"/>
-          <w:lang w:eastAsia="ro-RO"/>
-        </w:rPr>
-        <w:t>.</w:t>
+          <w:sz w:val="20"/>
+          <w:szCs w:val="20"/>
+          <w:lang w:eastAsia="ro-RO"/>
+        </w:rPr>
+      </w:pPr>
+      <w:r>
+        <w:rPr>
+          <w:rFonts w:ascii="Times New Roman" w:eastAsia="Times New Roman" w:hAnsi="Times New Roman"/>
+          <w:sz w:val="20"/>
+          <w:szCs w:val="20"/>
+          <w:lang w:eastAsia="ro-RO"/>
+        </w:rPr>
+        <w:t>Microserviciul de Chat este independent față de celelalte componente ale sistemului, comunicând direct cu aplicația frontend prin WebSocket, fără a interacționa cu bazele de date sau alte microservicii.</w:t>
       </w:r>
     </w:p>
     <w:p>
@@ -4215,6 +2904,155 @@
 <file path=word/numbering.xml><?xml version="1.0" encoding="utf-8"?>
 <w:numbering xmlns:wpc="http://schemas.microsoft.com/office/word/2010/wordprocessingCanvas" xmlns:cx="http://schemas.microsoft.com/office/drawing/2014/chartex" xmlns:cx1="http://schemas.microsoft.com/office/drawing/2015/9/8/chartex" xmlns:cx2="http://schemas.microsoft.com/office/drawing/2015/10/21/chartex" xmlns:cx3="http://schemas.microsoft.com/office/drawing/2016/5/9/chartex" xmlns:cx4="http://schemas.microsoft.com/office/drawing/2016/5/10/chartex" xmlns:cx5="http://schemas.microsoft.com/office/drawing/2016/5/11/chartex" xmlns:cx6="http://schemas.microsoft.com/office/drawing/2016/5/12/chartex" xmlns:cx7="http://schemas.microsoft.com/office/drawing/2016/5/13/chartex" xmlns:cx8="http://schemas.microsoft.com/office/drawing/2016/5/14/chartex" xmlns:mc="http://schemas.openxmlformats.org/markup-compatibility/2006" xmlns:aink="http://schemas.microsoft.com/office/drawing/2016/ink" xmlns:am3d="http://schemas.microsoft.com/office/drawing/2017/model3d" xmlns:o="urn:schemas-microsoft-com:office:office" xmlns:oel="http://schemas.microsoft.com/office/2019/extlst" xmlns:r="http://schemas.openxmlformats.org/officeDocument/2006/relationships" xmlns:m="http://schemas.openxmlformats.org/officeDocument/2006/math" xmlns:v="urn:schemas-microsoft-com:vml" xmlns:wp14="http://schemas.microsoft.com/office/word/2010/wordprocessingDrawing" xmlns:wp="http://schemas.openxmlformats.org/drawingml/2006/wordprocessingDrawing" xmlns:w10="urn:schemas-microsoft-com:office:word" xmlns:w="http://schemas.openxmlformats.org/wordprocessingml/2006/main" xmlns:w14="http://schemas.microsoft.com/office/word/2010/wordml" xmlns:w15="http://schemas.microsoft.com/office/word/2012/wordml" xmlns:w16cex="http://schemas.microsoft.com/office/word/2018/wordml/cex" xmlns:w16cid="http://schemas.microsoft.com/office/word/2016/wordml/cid" xmlns:w16="http://schemas.microsoft.com/office/word/2018/wordml" xmlns:w16du="http://schemas.microsoft.com/office/word/2023/wordml/word16du" xmlns:w16sdtdh="http://schemas.microsoft.com/office/word/2020/wordml/sdtdatahash" xmlns:w16sdtfl="http://schemas.microsoft.com/office/word/2024/wordml/sdtformatlock" xmlns:w16se="http://schemas.microsoft.com/office/word/2015/wordml/symex" xmlns:wpg="http://schemas.microsoft.com/office/word/2010/wordprocessingGroup" xmlns:wpi="http://schemas.microsoft.com/office/word/2010/wordprocessingInk" xmlns:wne="http://schemas.microsoft.com/office/word/2006/wordml" xmlns:wps="http://schemas.microsoft.com/office/word/2010/wordprocessingShape" mc:Ignorable="w14 w15 w16se w16cid w16 w16cex w16sdtdh w16sdtfl w16du wp14">
   <w:abstractNum w:abstractNumId="0" w15:restartNumberingAfterBreak="0">
+    <w:nsid w:val="17733A21"/>
+    <w:multiLevelType w:val="multilevel"/>
+    <w:tmpl w:val="A0FEAB3C"/>
+    <w:lvl w:ilvl="0">
+      <w:start w:val="1"/>
+      <w:numFmt w:val="bullet"/>
+      <w:lvlText w:val=""/>
+      <w:lvlJc w:val="left"/>
+      <w:pPr>
+        <w:tabs>
+          <w:tab w:val="num" w:pos="720"/>
+        </w:tabs>
+        <w:ind w:left="720" w:hanging="360"/>
+      </w:pPr>
+      <w:rPr>
+        <w:rFonts w:ascii="Symbol" w:hAnsi="Symbol" w:hint="default"/>
+        <w:sz w:val="20"/>
+      </w:rPr>
+    </w:lvl>
+    <w:lvl w:ilvl="1" w:tentative="1">
+      <w:start w:val="1"/>
+      <w:numFmt w:val="bullet"/>
+      <w:lvlText w:val="o"/>
+      <w:lvlJc w:val="left"/>
+      <w:pPr>
+        <w:tabs>
+          <w:tab w:val="num" w:pos="1440"/>
+        </w:tabs>
+        <w:ind w:left="1440" w:hanging="360"/>
+      </w:pPr>
+      <w:rPr>
+        <w:rFonts w:ascii="Courier New" w:hAnsi="Courier New" w:hint="default"/>
+        <w:sz w:val="20"/>
+      </w:rPr>
+    </w:lvl>
+    <w:lvl w:ilvl="2" w:tentative="1">
+      <w:start w:val="1"/>
+      <w:numFmt w:val="bullet"/>
+      <w:lvlText w:val=""/>
+      <w:lvlJc w:val="left"/>
+      <w:pPr>
+        <w:tabs>
+          <w:tab w:val="num" w:pos="2160"/>
+        </w:tabs>
+        <w:ind w:left="2160" w:hanging="360"/>
+      </w:pPr>
+      <w:rPr>
+        <w:rFonts w:ascii="Wingdings" w:hAnsi="Wingdings" w:hint="default"/>
+        <w:sz w:val="20"/>
+      </w:rPr>
+    </w:lvl>
+    <w:lvl w:ilvl="3" w:tentative="1">
+      <w:start w:val="1"/>
+      <w:numFmt w:val="bullet"/>
+      <w:lvlText w:val=""/>
+      <w:lvlJc w:val="left"/>
+      <w:pPr>
+        <w:tabs>
+          <w:tab w:val="num" w:pos="2880"/>
+        </w:tabs>
+        <w:ind w:left="2880" w:hanging="360"/>
+      </w:pPr>
+      <w:rPr>
+        <w:rFonts w:ascii="Wingdings" w:hAnsi="Wingdings" w:hint="default"/>
+        <w:sz w:val="20"/>
+      </w:rPr>
+    </w:lvl>
+    <w:lvl w:ilvl="4" w:tentative="1">
+      <w:start w:val="1"/>
+      <w:numFmt w:val="bullet"/>
+      <w:lvlText w:val=""/>
+      <w:lvlJc w:val="left"/>
+      <w:pPr>
+        <w:tabs>
+          <w:tab w:val="num" w:pos="3600"/>
+        </w:tabs>
+        <w:ind w:left="3600" w:hanging="360"/>
+      </w:pPr>
+      <w:rPr>
+        <w:rFonts w:ascii="Wingdings" w:hAnsi="Wingdings" w:hint="default"/>
+        <w:sz w:val="20"/>
+      </w:rPr>
+    </w:lvl>
+    <w:lvl w:ilvl="5" w:tentative="1">
+      <w:start w:val="1"/>
+      <w:numFmt w:val="bullet"/>
+      <w:lvlText w:val=""/>
+      <w:lvlJc w:val="left"/>
+      <w:pPr>
+        <w:tabs>
+          <w:tab w:val="num" w:pos="4320"/>
+        </w:tabs>
+        <w:ind w:left="4320" w:hanging="360"/>
+      </w:pPr>
+      <w:rPr>
+        <w:rFonts w:ascii="Wingdings" w:hAnsi="Wingdings" w:hint="default"/>
+        <w:sz w:val="20"/>
+      </w:rPr>
+    </w:lvl>
+    <w:lvl w:ilvl="6" w:tentative="1">
+      <w:start w:val="1"/>
+      <w:numFmt w:val="bullet"/>
+      <w:lvlText w:val=""/>
+      <w:lvlJc w:val="left"/>
+      <w:pPr>
+        <w:tabs>
+          <w:tab w:val="num" w:pos="5040"/>
+        </w:tabs>
+        <w:ind w:left="5040" w:hanging="360"/>
+      </w:pPr>
+      <w:rPr>
+        <w:rFonts w:ascii="Wingdings" w:hAnsi="Wingdings" w:hint="default"/>
+        <w:sz w:val="20"/>
+      </w:rPr>
+    </w:lvl>
+    <w:lvl w:ilvl="7" w:tentative="1">
+      <w:start w:val="1"/>
+      <w:numFmt w:val="bullet"/>
+      <w:lvlText w:val=""/>
+      <w:lvlJc w:val="left"/>
+      <w:pPr>
+        <w:tabs>
+          <w:tab w:val="num" w:pos="5760"/>
+        </w:tabs>
+        <w:ind w:left="5760" w:hanging="360"/>
+      </w:pPr>
+      <w:rPr>
+        <w:rFonts w:ascii="Wingdings" w:hAnsi="Wingdings" w:hint="default"/>
+        <w:sz w:val="20"/>
+      </w:rPr>
+    </w:lvl>
+    <w:lvl w:ilvl="8" w:tentative="1">
+      <w:start w:val="1"/>
+      <w:numFmt w:val="bullet"/>
+      <w:lvlText w:val=""/>
+      <w:lvlJc w:val="left"/>
+      <w:pPr>
+        <w:tabs>
+          <w:tab w:val="num" w:pos="6480"/>
+        </w:tabs>
+        <w:ind w:left="6480" w:hanging="360"/>
+      </w:pPr>
+      <w:rPr>
+        <w:rFonts w:ascii="Wingdings" w:hAnsi="Wingdings" w:hint="default"/>
+        <w:sz w:val="20"/>
+      </w:rPr>
+    </w:lvl>
+  </w:abstractNum>
+  <w:abstractNum w:abstractNumId="1" w15:restartNumberingAfterBreak="0">
     <w:nsid w:val="1A086705"/>
     <w:multiLevelType w:val="multilevel"/>
     <w:tmpl w:val="DC3C9A8A"/>
@@ -4363,7 +3201,7 @@
       </w:rPr>
     </w:lvl>
   </w:abstractNum>
-  <w:abstractNum w:abstractNumId="1" w15:restartNumberingAfterBreak="0">
+  <w:abstractNum w:abstractNumId="2" w15:restartNumberingAfterBreak="0">
     <w:nsid w:val="3083466C"/>
     <w:multiLevelType w:val="hybridMultilevel"/>
     <w:tmpl w:val="BE624554"/>
@@ -4476,7 +3314,7 @@
       </w:rPr>
     </w:lvl>
   </w:abstractNum>
-  <w:abstractNum w:abstractNumId="2" w15:restartNumberingAfterBreak="0">
+  <w:abstractNum w:abstractNumId="3" w15:restartNumberingAfterBreak="0">
     <w:nsid w:val="3D5C2506"/>
     <w:multiLevelType w:val="multilevel"/>
     <w:tmpl w:val="11542F88"/>
@@ -4562,7 +3400,7 @@
       </w:pPr>
     </w:lvl>
   </w:abstractNum>
-  <w:abstractNum w:abstractNumId="3" w15:restartNumberingAfterBreak="0">
+  <w:abstractNum w:abstractNumId="4" w15:restartNumberingAfterBreak="0">
     <w:nsid w:val="42DA654E"/>
     <w:multiLevelType w:val="multilevel"/>
     <w:tmpl w:val="6D70BBE8"/>
@@ -4711,7 +3549,7 @@
       </w:rPr>
     </w:lvl>
   </w:abstractNum>
-  <w:abstractNum w:abstractNumId="4" w15:restartNumberingAfterBreak="0">
+  <w:abstractNum w:abstractNumId="5" w15:restartNumberingAfterBreak="0">
     <w:nsid w:val="4FAC2CBB"/>
     <w:multiLevelType w:val="hybridMultilevel"/>
     <w:tmpl w:val="8D30FABC"/>
@@ -4824,7 +3662,7 @@
       </w:rPr>
     </w:lvl>
   </w:abstractNum>
-  <w:abstractNum w:abstractNumId="5" w15:restartNumberingAfterBreak="0">
+  <w:abstractNum w:abstractNumId="6" w15:restartNumberingAfterBreak="0">
     <w:nsid w:val="534B33C3"/>
     <w:multiLevelType w:val="multilevel"/>
     <w:tmpl w:val="D72C5D94"/>
@@ -4973,7 +3811,156 @@
       </w:rPr>
     </w:lvl>
   </w:abstractNum>
-  <w:abstractNum w:abstractNumId="6" w15:restartNumberingAfterBreak="0">
+  <w:abstractNum w:abstractNumId="7" w15:restartNumberingAfterBreak="0">
+    <w:nsid w:val="610665B0"/>
+    <w:multiLevelType w:val="multilevel"/>
+    <w:tmpl w:val="9ADC5FAA"/>
+    <w:lvl w:ilvl="0">
+      <w:start w:val="1"/>
+      <w:numFmt w:val="bullet"/>
+      <w:lvlText w:val=""/>
+      <w:lvlJc w:val="left"/>
+      <w:pPr>
+        <w:tabs>
+          <w:tab w:val="num" w:pos="720"/>
+        </w:tabs>
+        <w:ind w:left="720" w:hanging="360"/>
+      </w:pPr>
+      <w:rPr>
+        <w:rFonts w:ascii="Symbol" w:hAnsi="Symbol" w:hint="default"/>
+        <w:sz w:val="20"/>
+      </w:rPr>
+    </w:lvl>
+    <w:lvl w:ilvl="1">
+      <w:start w:val="1"/>
+      <w:numFmt w:val="bullet"/>
+      <w:lvlText w:val="o"/>
+      <w:lvlJc w:val="left"/>
+      <w:pPr>
+        <w:tabs>
+          <w:tab w:val="num" w:pos="1440"/>
+        </w:tabs>
+        <w:ind w:left="1440" w:hanging="360"/>
+      </w:pPr>
+      <w:rPr>
+        <w:rFonts w:ascii="Courier New" w:hAnsi="Courier New" w:hint="default"/>
+        <w:sz w:val="20"/>
+      </w:rPr>
+    </w:lvl>
+    <w:lvl w:ilvl="2" w:tentative="1">
+      <w:start w:val="1"/>
+      <w:numFmt w:val="bullet"/>
+      <w:lvlText w:val=""/>
+      <w:lvlJc w:val="left"/>
+      <w:pPr>
+        <w:tabs>
+          <w:tab w:val="num" w:pos="2160"/>
+        </w:tabs>
+        <w:ind w:left="2160" w:hanging="360"/>
+      </w:pPr>
+      <w:rPr>
+        <w:rFonts w:ascii="Wingdings" w:hAnsi="Wingdings" w:hint="default"/>
+        <w:sz w:val="20"/>
+      </w:rPr>
+    </w:lvl>
+    <w:lvl w:ilvl="3" w:tentative="1">
+      <w:start w:val="1"/>
+      <w:numFmt w:val="bullet"/>
+      <w:lvlText w:val=""/>
+      <w:lvlJc w:val="left"/>
+      <w:pPr>
+        <w:tabs>
+          <w:tab w:val="num" w:pos="2880"/>
+        </w:tabs>
+        <w:ind w:left="2880" w:hanging="360"/>
+      </w:pPr>
+      <w:rPr>
+        <w:rFonts w:ascii="Wingdings" w:hAnsi="Wingdings" w:hint="default"/>
+        <w:sz w:val="20"/>
+      </w:rPr>
+    </w:lvl>
+    <w:lvl w:ilvl="4" w:tentative="1">
+      <w:start w:val="1"/>
+      <w:numFmt w:val="bullet"/>
+      <w:lvlText w:val=""/>
+      <w:lvlJc w:val="left"/>
+      <w:pPr>
+        <w:tabs>
+          <w:tab w:val="num" w:pos="3600"/>
+        </w:tabs>
+        <w:ind w:left="3600" w:hanging="360"/>
+      </w:pPr>
+      <w:rPr>
+        <w:rFonts w:ascii="Wingdings" w:hAnsi="Wingdings" w:hint="default"/>
+        <w:sz w:val="20"/>
+      </w:rPr>
+    </w:lvl>
+    <w:lvl w:ilvl="5" w:tentative="1">
+      <w:start w:val="1"/>
+      <w:numFmt w:val="bullet"/>
+      <w:lvlText w:val=""/>
+      <w:lvlJc w:val="left"/>
+      <w:pPr>
+        <w:tabs>
+          <w:tab w:val="num" w:pos="4320"/>
+        </w:tabs>
+        <w:ind w:left="4320" w:hanging="360"/>
+      </w:pPr>
+      <w:rPr>
+        <w:rFonts w:ascii="Wingdings" w:hAnsi="Wingdings" w:hint="default"/>
+        <w:sz w:val="20"/>
+      </w:rPr>
+    </w:lvl>
+    <w:lvl w:ilvl="6" w:tentative="1">
+      <w:start w:val="1"/>
+      <w:numFmt w:val="bullet"/>
+      <w:lvlText w:val=""/>
+      <w:lvlJc w:val="left"/>
+      <w:pPr>
+        <w:tabs>
+          <w:tab w:val="num" w:pos="5040"/>
+        </w:tabs>
+        <w:ind w:left="5040" w:hanging="360"/>
+      </w:pPr>
+      <w:rPr>
+        <w:rFonts w:ascii="Wingdings" w:hAnsi="Wingdings" w:hint="default"/>
+        <w:sz w:val="20"/>
+      </w:rPr>
+    </w:lvl>
+    <w:lvl w:ilvl="7" w:tentative="1">
+      <w:start w:val="1"/>
+      <w:numFmt w:val="bullet"/>
+      <w:lvlText w:val=""/>
+      <w:lvlJc w:val="left"/>
+      <w:pPr>
+        <w:tabs>
+          <w:tab w:val="num" w:pos="5760"/>
+        </w:tabs>
+        <w:ind w:left="5760" w:hanging="360"/>
+      </w:pPr>
+      <w:rPr>
+        <w:rFonts w:ascii="Wingdings" w:hAnsi="Wingdings" w:hint="default"/>
+        <w:sz w:val="20"/>
+      </w:rPr>
+    </w:lvl>
+    <w:lvl w:ilvl="8" w:tentative="1">
+      <w:start w:val="1"/>
+      <w:numFmt w:val="bullet"/>
+      <w:lvlText w:val=""/>
+      <w:lvlJc w:val="left"/>
+      <w:pPr>
+        <w:tabs>
+          <w:tab w:val="num" w:pos="6480"/>
+        </w:tabs>
+        <w:ind w:left="6480" w:hanging="360"/>
+      </w:pPr>
+      <w:rPr>
+        <w:rFonts w:ascii="Wingdings" w:hAnsi="Wingdings" w:hint="default"/>
+        <w:sz w:val="20"/>
+      </w:rPr>
+    </w:lvl>
+  </w:abstractNum>
+  <w:abstractNum w:abstractNumId="8" w15:restartNumberingAfterBreak="0">
     <w:nsid w:val="6F5D010C"/>
     <w:multiLevelType w:val="hybridMultilevel"/>
     <w:tmpl w:val="A282C7CA"/>
@@ -5086,7 +4073,7 @@
       </w:rPr>
     </w:lvl>
   </w:abstractNum>
-  <w:abstractNum w:abstractNumId="7" w15:restartNumberingAfterBreak="0">
+  <w:abstractNum w:abstractNumId="9" w15:restartNumberingAfterBreak="0">
     <w:nsid w:val="7F75005A"/>
     <w:multiLevelType w:val="multilevel"/>
     <w:tmpl w:val="4CA8391A"/>
@@ -5236,28 +4223,34 @@
     </w:lvl>
   </w:abstractNum>
   <w:num w:numId="1" w16cid:durableId="1900360893">
+    <w:abstractNumId w:val="3"/>
+  </w:num>
+  <w:num w:numId="2" w16cid:durableId="629747894">
+    <w:abstractNumId w:val="8"/>
+  </w:num>
+  <w:num w:numId="3" w16cid:durableId="2000115351">
     <w:abstractNumId w:val="2"/>
   </w:num>
-  <w:num w:numId="2" w16cid:durableId="629747894">
+  <w:num w:numId="4" w16cid:durableId="322855310">
+    <w:abstractNumId w:val="5"/>
+  </w:num>
+  <w:num w:numId="5" w16cid:durableId="662048942">
+    <w:abstractNumId w:val="1"/>
+  </w:num>
+  <w:num w:numId="6" w16cid:durableId="32004431">
+    <w:abstractNumId w:val="9"/>
+  </w:num>
+  <w:num w:numId="7" w16cid:durableId="1157116131">
     <w:abstractNumId w:val="6"/>
   </w:num>
-  <w:num w:numId="3" w16cid:durableId="2000115351">
-    <w:abstractNumId w:val="1"/>
-  </w:num>
-  <w:num w:numId="4" w16cid:durableId="322855310">
+  <w:num w:numId="8" w16cid:durableId="542139193">
     <w:abstractNumId w:val="4"/>
   </w:num>
-  <w:num w:numId="5" w16cid:durableId="662048942">
-    <w:abstractNumId w:val="0"/>
-  </w:num>
-  <w:num w:numId="6" w16cid:durableId="32004431">
+  <w:num w:numId="9" w16cid:durableId="787234710">
     <w:abstractNumId w:val="7"/>
   </w:num>
-  <w:num w:numId="7" w16cid:durableId="1157116131">
-    <w:abstractNumId w:val="5"/>
-  </w:num>
-  <w:num w:numId="8" w16cid:durableId="542139193">
-    <w:abstractNumId w:val="3"/>
+  <w:num w:numId="10" w16cid:durableId="1411074158">
+    <w:abstractNumId w:val="0"/>
   </w:num>
 </w:numbering>
 </file>
@@ -5749,6 +4742,17 @@
       <w:contextualSpacing/>
     </w:pPr>
   </w:style>
+  <w:style w:type="character" w:styleId="Robust">
+    <w:name w:val="Strong"/>
+    <w:basedOn w:val="Fontdeparagrafimplicit"/>
+    <w:uiPriority w:val="22"/>
+    <w:qFormat/>
+    <w:rsid w:val="007D6136"/>
+    <w:rPr>
+      <w:b/>
+      <w:bCs/>
+    </w:rPr>
+  </w:style>
 </w:styles>
 </file>
 
@@ -6048,11 +5052,12 @@
 </file>
 
 <file path=customXml/item1.xml><?xml version="1.0" encoding="utf-8"?>
-<p:properties xmlns:p="http://schemas.microsoft.com/office/2006/metadata/properties" xmlns:xsi="http://www.w3.org/2001/XMLSchema-instance" xmlns:pc="http://schemas.microsoft.com/office/infopath/2007/PartnerControls">
-  <documentManagement>
-    <_activity xmlns="1e7624d3-19f6-46d5-aab2-d0e558c35323" xsi:nil="true"/>
-  </documentManagement>
-</p:properties>
+<?mso-contentType ?>
+<FormTemplates xmlns="http://schemas.microsoft.com/sharepoint/v3/contenttype/forms">
+  <Display>DocumentLibraryForm</Display>
+  <Edit>DocumentLibraryForm</Edit>
+  <New>DocumentLibraryForm</New>
+</FormTemplates>
 </file>
 
 <file path=customXml/item2.xml><?xml version="1.0" encoding="utf-8"?>
@@ -6277,20 +5282,17 @@
 </file>
 
 <file path=customXml/item3.xml><?xml version="1.0" encoding="utf-8"?>
-<?mso-contentType ?>
-<FormTemplates xmlns="http://schemas.microsoft.com/sharepoint/v3/contenttype/forms">
-  <Display>DocumentLibraryForm</Display>
-  <Edit>DocumentLibraryForm</Edit>
-  <New>DocumentLibraryForm</New>
-</FormTemplates>
+<p:properties xmlns:p="http://schemas.microsoft.com/office/2006/metadata/properties" xmlns:xsi="http://www.w3.org/2001/XMLSchema-instance" xmlns:pc="http://schemas.microsoft.com/office/infopath/2007/PartnerControls">
+  <documentManagement>
+    <_activity xmlns="1e7624d3-19f6-46d5-aab2-d0e558c35323" xsi:nil="true"/>
+  </documentManagement>
+</p:properties>
 </file>
 
 <file path=customXml/itemProps1.xml><?xml version="1.0" encoding="utf-8"?>
-<ds:datastoreItem xmlns:ds="http://schemas.openxmlformats.org/officeDocument/2006/customXml" ds:itemID="{2BA206E0-AFE2-4E52-9D7E-92EB23824553}">
+<ds:datastoreItem xmlns:ds="http://schemas.openxmlformats.org/officeDocument/2006/customXml" ds:itemID="{73E40A45-7983-4F12-ABE4-22C9AF2DFAD1}">
   <ds:schemaRefs>
-    <ds:schemaRef ds:uri="http://schemas.microsoft.com/office/2006/metadata/properties"/>
-    <ds:schemaRef ds:uri="http://schemas.microsoft.com/office/infopath/2007/PartnerControls"/>
-    <ds:schemaRef ds:uri="1e7624d3-19f6-46d5-aab2-d0e558c35323"/>
+    <ds:schemaRef ds:uri="http://schemas.microsoft.com/sharepoint/v3/contenttype/forms"/>
   </ds:schemaRefs>
 </ds:datastoreItem>
 </file>
@@ -6315,9 +5317,11 @@
 </file>
 
 <file path=customXml/itemProps3.xml><?xml version="1.0" encoding="utf-8"?>
-<ds:datastoreItem xmlns:ds="http://schemas.openxmlformats.org/officeDocument/2006/customXml" ds:itemID="{73E40A45-7983-4F12-ABE4-22C9AF2DFAD1}">
+<ds:datastoreItem xmlns:ds="http://schemas.openxmlformats.org/officeDocument/2006/customXml" ds:itemID="{2BA206E0-AFE2-4E52-9D7E-92EB23824553}">
   <ds:schemaRefs>
-    <ds:schemaRef ds:uri="http://schemas.microsoft.com/sharepoint/v3/contenttype/forms"/>
+    <ds:schemaRef ds:uri="http://schemas.microsoft.com/office/2006/metadata/properties"/>
+    <ds:schemaRef ds:uri="http://schemas.microsoft.com/office/infopath/2007/PartnerControls"/>
+    <ds:schemaRef ds:uri="1e7624d3-19f6-46d5-aab2-d0e558c35323"/>
   </ds:schemaRefs>
 </ds:datastoreItem>
 </file>
</xml_diff>